<commit_message>
User guide (EN): smaller KPI cards (up to 4 per row); images only stick to their caption
Co-Authored-By: Claude Sonnet 5.5 <noreply@anthropic.com>
Claude-Session: https://claude.ai/code/session_019dELNUNjVMr3Ja2mUwBrCu
</commit_message>
<xml_diff>
--- a/docs/user-guide/en/pages/01-workforce.docx
+++ b/docs/user-guide/en/pages/01-workforce.docx
@@ -195,7 +195,7 @@
             <w:r>
               <w:drawing>
                 <wp:inline distT="0" distB="0" distL="0" distR="0">
-                  <wp:extent cx="2171700" cy="866775"/>
+                  <wp:extent cx="1666875" cy="657225"/>
                   <wp:effectExtent t="0" r="0" b="0" l="0"/>
                   <wp:docPr id="1" name="" descr="" title=""/>
                   <wp:cNvGraphicFramePr>
@@ -220,7 +220,7 @@
                         <pic:spPr bwMode="auto">
                           <a:xfrm>
                             <a:off x="0" y="0"/>
-                            <a:ext cx="2171700" cy="866775"/>
+                            <a:ext cx="1666875" cy="657225"/>
                           </a:xfrm>
                           <a:prstGeom prst="rect">
                             <a:avLst/>
@@ -257,7 +257,7 @@
             <w:r>
               <w:drawing>
                 <wp:inline distT="0" distB="0" distL="0" distR="0">
-                  <wp:extent cx="2171700" cy="866775"/>
+                  <wp:extent cx="1666875" cy="657225"/>
                   <wp:effectExtent t="0" r="0" b="0" l="0"/>
                   <wp:docPr id="1" name="" descr="" title=""/>
                   <wp:cNvGraphicFramePr>
@@ -282,7 +282,7 @@
                         <pic:spPr bwMode="auto">
                           <a:xfrm>
                             <a:off x="0" y="0"/>
-                            <a:ext cx="2171700" cy="866775"/>
+                            <a:ext cx="1666875" cy="657225"/>
                           </a:xfrm>
                           <a:prstGeom prst="rect">
                             <a:avLst/>
@@ -319,7 +319,7 @@
             <w:r>
               <w:drawing>
                 <wp:inline distT="0" distB="0" distL="0" distR="0">
-                  <wp:extent cx="2171700" cy="866775"/>
+                  <wp:extent cx="1666875" cy="657225"/>
                   <wp:effectExtent t="0" r="0" b="0" l="0"/>
                   <wp:docPr id="1" name="" descr="" title=""/>
                   <wp:cNvGraphicFramePr>
@@ -344,7 +344,7 @@
                         <pic:spPr bwMode="auto">
                           <a:xfrm>
                             <a:off x="0" y="0"/>
-                            <a:ext cx="2171700" cy="866775"/>
+                            <a:ext cx="1666875" cy="657225"/>
                           </a:xfrm>
                           <a:prstGeom prst="rect">
                             <a:avLst/>

</xml_diff>

<commit_message>
User guide (EN): final pages from review, Action Plan Guide page removed, merged guide + PDF regenerated (68 pages)
Co-Authored-By: Claude Sonnet 5.5 <noreply@anthropic.com>
Claude-Session: https://claude.ai/code/session_019dELNUNjVMr3Ja2mUwBrCu
</commit_message>
<xml_diff>
--- a/docs/user-guide/en/pages/01-workforce.docx
+++ b/docs/user-guide/en/pages/01-workforce.docx
@@ -1,6 +1,6 @@
 
 <file path=word/document.xml><?xml version="1.0" encoding="utf-8"?>
-<w:document xmlns:wpc="http://schemas.microsoft.com/office/word/2010/wordprocessingCanvas" xmlns:mc="http://schemas.openxmlformats.org/markup-compatibility/2006" xmlns:o="urn:schemas-microsoft-com:office:office" xmlns:r="http://schemas.openxmlformats.org/officeDocument/2006/relationships" xmlns:m="http://schemas.openxmlformats.org/officeDocument/2006/math" xmlns:v="urn:schemas-microsoft-com:vml" xmlns:wp14="http://schemas.microsoft.com/office/word/2010/wordprocessingDrawing" xmlns:wp="http://schemas.openxmlformats.org/drawingml/2006/wordprocessingDrawing" xmlns:w10="urn:schemas-microsoft-com:office:word" xmlns:w="http://schemas.openxmlformats.org/wordprocessingml/2006/main" xmlns:w14="http://schemas.microsoft.com/office/word/2010/wordml" xmlns:w15="http://schemas.microsoft.com/office/word/2012/wordml" xmlns:wpg="http://schemas.microsoft.com/office/word/2010/wordprocessingGroup" xmlns:wpi="http://schemas.microsoft.com/office/word/2010/wordprocessingInk" xmlns:wne="http://schemas.microsoft.com/office/word/2006/wordml" xmlns:wps="http://schemas.microsoft.com/office/word/2010/wordprocessingShape" xmlns:cx="http://schemas.microsoft.com/office/drawing/2014/chartex" xmlns:cx1="http://schemas.microsoft.com/office/drawing/2015/9/8/chartex" xmlns:cx2="http://schemas.microsoft.com/office/drawing/2015/10/21/chartex" xmlns:cx3="http://schemas.microsoft.com/office/drawing/2016/5/9/chartex" xmlns:cx4="http://schemas.microsoft.com/office/drawing/2016/5/10/chartex" xmlns:cx5="http://schemas.microsoft.com/office/drawing/2016/5/11/chartex" xmlns:cx6="http://schemas.microsoft.com/office/drawing/2016/5/12/chartex" xmlns:cx7="http://schemas.microsoft.com/office/drawing/2016/5/13/chartex" xmlns:cx8="http://schemas.microsoft.com/office/drawing/2016/5/14/chartex" xmlns:aink="http://schemas.microsoft.com/office/drawing/2016/ink" xmlns:am3d="http://schemas.microsoft.com/office/drawing/2017/model3d" xmlns:w16cex="http://schemas.microsoft.com/office/word/2018/wordml/cex" xmlns:w16cid="http://schemas.microsoft.com/office/word/2016/wordml/cid" xmlns:w16="http://schemas.microsoft.com/office/word/2018/wordml" xmlns:w16sdtdh="http://schemas.microsoft.com/office/word/2020/wordml/sdtdatahash" xmlns:w16se="http://schemas.microsoft.com/office/word/2015/wordml/symex" mc:Ignorable="w14 w15 wp14">
+<w:document xmlns:wpc="http://schemas.microsoft.com/office/word/2010/wordprocessingCanvas" xmlns:cx="http://schemas.microsoft.com/office/drawing/2014/chartex" xmlns:cx1="http://schemas.microsoft.com/office/drawing/2015/9/8/chartex" xmlns:cx2="http://schemas.microsoft.com/office/drawing/2015/10/21/chartex" xmlns:cx3="http://schemas.microsoft.com/office/drawing/2016/5/9/chartex" xmlns:cx4="http://schemas.microsoft.com/office/drawing/2016/5/10/chartex" xmlns:cx5="http://schemas.microsoft.com/office/drawing/2016/5/11/chartex" xmlns:cx6="http://schemas.microsoft.com/office/drawing/2016/5/12/chartex" xmlns:cx7="http://schemas.microsoft.com/office/drawing/2016/5/13/chartex" xmlns:cx8="http://schemas.microsoft.com/office/drawing/2016/5/14/chartex" xmlns:mc="http://schemas.openxmlformats.org/markup-compatibility/2006" xmlns:aink="http://schemas.microsoft.com/office/drawing/2016/ink" xmlns:am3d="http://schemas.microsoft.com/office/drawing/2017/model3d" xmlns:o="urn:schemas-microsoft-com:office:office" xmlns:oel="http://schemas.microsoft.com/office/2019/extlst" xmlns:r="http://schemas.openxmlformats.org/officeDocument/2006/relationships" xmlns:m="http://schemas.openxmlformats.org/officeDocument/2006/math" xmlns:v="urn:schemas-microsoft-com:vml" xmlns:wp14="http://schemas.microsoft.com/office/word/2010/wordprocessingDrawing" xmlns:wp="http://schemas.openxmlformats.org/drawingml/2006/wordprocessingDrawing" xmlns:w10="urn:schemas-microsoft-com:office:word" xmlns:w="http://schemas.openxmlformats.org/wordprocessingml/2006/main" xmlns:w14="http://schemas.microsoft.com/office/word/2010/wordml" xmlns:w15="http://schemas.microsoft.com/office/word/2012/wordml" xmlns:w16cex="http://schemas.microsoft.com/office/word/2018/wordml/cex" xmlns:w16cid="http://schemas.microsoft.com/office/word/2016/wordml/cid" xmlns:w16="http://schemas.microsoft.com/office/word/2018/wordml" xmlns:w16du="http://schemas.microsoft.com/office/word/2023/wordml/word16du" xmlns:w16sdtdh="http://schemas.microsoft.com/office/word/2020/wordml/sdtdatahash" xmlns:w16sdtfl="http://schemas.microsoft.com/office/word/2024/wordml/sdtformatlock" xmlns:w16se="http://schemas.microsoft.com/office/word/2015/wordml/symex" xmlns:wpg="http://schemas.microsoft.com/office/word/2010/wordprocessingGroup" xmlns:wpi="http://schemas.microsoft.com/office/word/2010/wordprocessingInk" xmlns:wne="http://schemas.microsoft.com/office/word/2006/wordml" xmlns:wps="http://schemas.microsoft.com/office/word/2010/wordprocessingShape" mc:Ignorable="w14 w15 w16se w16cid w16 w16cex w16sdtdh w16sdtfl w16du wp14">
   <w:body>
     <w:p>
       <w:pPr>
@@ -8,44 +8,49 @@
         <w:pageBreakBefore/>
       </w:pPr>
       <w:r>
-        <w:t xml:space="preserve">Workforce Overview</w:t>
-      </w:r>
-    </w:p>
-    <w:p>
-      <w:pPr>
-        <w:spacing w:after="90" w:line="290"/>
-      </w:pPr>
-      <w:r>
-        <w:rPr>
-          <w:rFonts w:ascii="Arial" w:cs="Arial" w:eastAsia="Arial" w:hAnsi="Arial"/>
+        <w:t>Workforce Overview</w:t>
+      </w:r>
+    </w:p>
+    <w:p>
+      <w:pPr>
+        <w:spacing w:after="90" w:line="290" w:lineRule="auto"/>
+      </w:pPr>
+      <w:r>
+        <w:rPr>
           <w:color w:val="666666"/>
           <w:sz w:val="19"/>
           <w:szCs w:val="19"/>
         </w:rPr>
-        <w:t xml:space="preserve">Where to find it: </w:t>
-      </w:r>
-      <w:r>
-        <w:rPr>
-          <w:rFonts w:ascii="Arial" w:cs="Arial" w:eastAsia="Arial" w:hAnsi="Arial"/>
+        <w:t xml:space="preserve">Where to find it: Side </w:t>
+      </w:r>
+      <w:proofErr w:type="gramStart"/>
+      <w:r>
+        <w:rPr>
           <w:color w:val="666666"/>
           <w:sz w:val="19"/>
           <w:szCs w:val="19"/>
         </w:rPr>
-        <w:t xml:space="preserve">Side menu  &gt;  Workforce Overview</w:t>
-      </w:r>
-    </w:p>
-    <w:p>
-      <w:pPr>
-        <w:spacing w:after="90" w:line="290"/>
-      </w:pPr>
-      <w:r>
-        <w:rPr>
-          <w:rFonts w:ascii="Arial" w:cs="Arial" w:eastAsia="Arial" w:hAnsi="Arial"/>
-          <w:color w:val="27251F"/>
-          <w:sz w:val="21"/>
-          <w:szCs w:val="21"/>
-        </w:rPr>
-        <w:t xml:space="preserve">Use this page to answer one question: who works for me right now, and is the team in good shape? It is a snapshot of your active headcount, so most charts here count current employees, not resignations (that is the Turnover page).</w:t>
+        <w:t>menu  &gt;</w:t>
+      </w:r>
+      <w:proofErr w:type="gramEnd"/>
+      <w:r>
+        <w:rPr>
+          <w:color w:val="666666"/>
+          <w:sz w:val="19"/>
+          <w:szCs w:val="19"/>
+        </w:rPr>
+        <w:t xml:space="preserve">  Workforce Overview</w:t>
+      </w:r>
+    </w:p>
+    <w:p>
+      <w:pPr>
+        <w:spacing w:after="90" w:line="290" w:lineRule="auto"/>
+      </w:pPr>
+      <w:r>
+        <w:rPr>
+          <w:color w:val="27251F"/>
+        </w:rPr>
+        <w:t>Use this page to answer one question: who works for me right now, and is the team in good shape? It is a snapshot of your active headcount, so most charts here count current employees, not resignations (that is the Turnover page).</w:t>
       </w:r>
     </w:p>
     <w:p>
@@ -53,21 +58,24 @@
         <w:pStyle w:val="Heading2"/>
       </w:pPr>
       <w:r>
-        <w:t xml:space="preserve">Step 1 - Choose your scope</w:t>
+        <w:t>Step 1 - Choose your scope</w:t>
       </w:r>
     </w:p>
     <w:p>
       <w:pPr>
         <w:keepNext/>
-        <w:spacing w:after="120" w:before="60"/>
+        <w:spacing w:before="60" w:after="120"/>
         <w:jc w:val="center"/>
       </w:pPr>
       <w:r>
+        <w:rPr>
+          <w:noProof/>
+        </w:rPr>
         <w:drawing>
-          <wp:inline distT="0" distB="0" distL="0" distR="0">
+          <wp:inline distT="0" distB="0" distL="0" distR="0" wp14:anchorId="3431FD74" wp14:editId="7CD513E5">
             <wp:extent cx="6953250" cy="561975"/>
-            <wp:effectExtent t="0" r="0" b="0" l="0"/>
-            <wp:docPr id="1" name="" descr="" title=""/>
+            <wp:effectExtent l="0" t="0" r="0" b="0"/>
+            <wp:docPr id="1" name="Picture 1"/>
             <wp:cNvGraphicFramePr>
               <a:graphicFrameLocks xmlns:a="http://schemas.openxmlformats.org/drawingml/2006/main" noChangeAspect="1"/>
             </wp:cNvGraphicFramePr>
@@ -75,13 +83,13 @@
               <a:graphicData uri="http://schemas.openxmlformats.org/drawingml/2006/picture">
                 <pic:pic xmlns:pic="http://schemas.openxmlformats.org/drawingml/2006/picture">
                   <pic:nvPicPr>
-                    <pic:cNvPr id="0" name="" descr=""/>
+                    <pic:cNvPr id="0" name=""/>
                     <pic:cNvPicPr>
                       <a:picLocks noChangeAspect="1" noChangeArrowheads="1"/>
                     </pic:cNvPicPr>
                   </pic:nvPicPr>
                   <pic:blipFill>
-                    <a:blip r:embed="rId9" cstate="none"/>
+                    <a:blip r:embed="rId7"/>
                     <a:srcRect/>
                     <a:stretch>
                       <a:fillRect/>
@@ -105,41 +113,46 @@
     </w:p>
     <w:p>
       <w:pPr>
-        <w:spacing w:after="70" w:line="270"/>
-      </w:pPr>
-      <w:r>
-        <w:rPr>
-          <w:rFonts w:ascii="Arial" w:cs="Arial" w:eastAsia="Arial" w:hAnsi="Arial"/>
-          <w:color w:val="27251F"/>
-          <w:sz w:val="21"/>
-          <w:szCs w:val="21"/>
-        </w:rPr>
-        <w:t xml:space="preserve">Pick a Store, Operation Manager, Operation Consultant, Senior Operation Consultant, Operation Director or Job, and every chart and table on the page switches to that selection. Press Reset Filters to return to the full picture.</w:t>
-      </w:r>
-    </w:p>
-    <w:p>
-      <w:pPr>
-        <w:spacing w:after="90" w:line="290"/>
-      </w:pPr>
-      <w:r>
-        <w:rPr>
-          <w:rFonts w:ascii="Arial" w:cs="Arial" w:eastAsia="Arial" w:hAnsi="Arial"/>
+        <w:spacing w:after="70" w:line="270" w:lineRule="auto"/>
+      </w:pPr>
+      <w:r>
+        <w:rPr>
+          <w:color w:val="27251F"/>
+        </w:rPr>
+        <w:t>Pick a Store, Operation Manager, Operation Consultant, Senior Operation Consultant, Operation Director or Job, and every chart and table on the page switches to that selection. Press Reset Filters to return to the full picture.</w:t>
+      </w:r>
+    </w:p>
+    <w:p>
+      <w:pPr>
+        <w:spacing w:after="90" w:line="290" w:lineRule="auto"/>
+      </w:pPr>
+      <w:r>
+        <w:rPr>
           <w:b/>
           <w:bCs/>
           <w:color w:val="27251F"/>
-          <w:sz w:val="21"/>
-          <w:szCs w:val="21"/>
         </w:rPr>
         <w:t xml:space="preserve">Good to know: </w:t>
       </w:r>
       <w:r>
         <w:rPr>
-          <w:rFonts w:ascii="Arial" w:cs="Arial" w:eastAsia="Arial" w:hAnsi="Arial"/>
-          <w:color w:val="27251F"/>
-          <w:sz w:val="21"/>
-          <w:szCs w:val="21"/>
-        </w:rPr>
-        <w:t xml:space="preserve">the From/To period changes the cards, the breakdown charts and the tables, but not the Headcount Over Time chart, which always shows the full history from the selected year.</w:t>
+          <w:color w:val="27251F"/>
+        </w:rPr>
+        <w:t xml:space="preserve">the </w:t>
+      </w:r>
+      <w:proofErr w:type="gramStart"/>
+      <w:r>
+        <w:rPr>
+          <w:color w:val="27251F"/>
+        </w:rPr>
+        <w:t>From</w:t>
+      </w:r>
+      <w:proofErr w:type="gramEnd"/>
+      <w:r>
+        <w:rPr>
+          <w:color w:val="27251F"/>
+        </w:rPr>
+        <w:t>/To period changes the cards, the breakdown charts and the tables, but not the Headcount Over Time chart, which always shows the full history from the selected year.</w:t>
       </w:r>
     </w:p>
     <w:p>
@@ -147,21 +160,26 @@
         <w:pStyle w:val="Heading2"/>
       </w:pPr>
       <w:r>
-        <w:t xml:space="preserve">Step 2 - Read the headline numbers</w:t>
+        <w:t>Step 2 - Read the headline numbers</w:t>
       </w:r>
     </w:p>
     <w:tbl>
       <w:tblPr>
-        <w:tblW w:type="dxa" w:w="10998"/>
+        <w:tblW w:w="10998" w:type="dxa"/>
         <w:jc w:val="center"/>
         <w:tblBorders>
-          <w:top w:val="single" w:color="auto" w:sz="4"/>
-          <w:left w:val="single" w:color="auto" w:sz="4"/>
-          <w:bottom w:val="single" w:color="auto" w:sz="4"/>
-          <w:right w:val="single" w:color="auto" w:sz="4"/>
-          <w:insideH w:val="single" w:color="auto" w:sz="4"/>
-          <w:insideV w:val="single" w:color="auto" w:sz="4"/>
+          <w:top w:val="single" w:sz="4" w:space="0" w:color="auto"/>
+          <w:left w:val="single" w:sz="4" w:space="0" w:color="auto"/>
+          <w:bottom w:val="single" w:sz="4" w:space="0" w:color="auto"/>
+          <w:right w:val="single" w:sz="4" w:space="0" w:color="auto"/>
+          <w:insideH w:val="single" w:sz="4" w:space="0" w:color="auto"/>
+          <w:insideV w:val="single" w:sz="4" w:space="0" w:color="auto"/>
         </w:tblBorders>
+        <w:tblCellMar>
+          <w:left w:w="10" w:type="dxa"/>
+          <w:right w:w="10" w:type="dxa"/>
+        </w:tblCellMar>
+        <w:tblLook w:val="04A0" w:firstRow="1" w:lastRow="0" w:firstColumn="1" w:lastColumn="0" w:noHBand="0" w:noVBand="1"/>
       </w:tblPr>
       <w:tblGrid>
         <w:gridCol w:w="3666"/>
@@ -169,23 +187,30 @@
         <w:gridCol w:w="3666"/>
       </w:tblGrid>
       <w:tr>
+        <w:tblPrEx>
+          <w:tblCellMar>
+            <w:top w:w="0" w:type="dxa"/>
+            <w:bottom w:w="0" w:type="dxa"/>
+          </w:tblCellMar>
+        </w:tblPrEx>
         <w:trPr>
           <w:cantSplit/>
+          <w:jc w:val="center"/>
         </w:trPr>
         <w:tc>
           <w:tcPr>
-            <w:tcW w:type="dxa" w:w="3666"/>
+            <w:tcW w:w="3666" w:type="dxa"/>
             <w:tcBorders>
-              <w:top w:val="none" w:color="FFFFFF" w:sz="0"/>
-              <w:left w:val="none" w:color="FFFFFF" w:sz="0"/>
-              <w:bottom w:val="none" w:color="FFFFFF" w:sz="0"/>
-              <w:right w:val="none" w:color="FFFFFF" w:sz="0"/>
+              <w:top w:val="none" w:sz="0" w:space="0" w:color="FFFFFF"/>
+              <w:left w:val="none" w:sz="0" w:space="0" w:color="FFFFFF"/>
+              <w:bottom w:val="none" w:sz="0" w:space="0" w:color="FFFFFF"/>
+              <w:right w:val="none" w:sz="0" w:space="0" w:color="FFFFFF"/>
             </w:tcBorders>
             <w:tcMar>
-              <w:top w:type="dxa" w:w="40"/>
-              <w:left w:type="dxa" w:w="40"/>
-              <w:bottom w:type="dxa" w:w="80"/>
-              <w:right w:type="dxa" w:w="40"/>
+              <w:top w:w="40" w:type="dxa"/>
+              <w:left w:w="40" w:type="dxa"/>
+              <w:bottom w:w="80" w:type="dxa"/>
+              <w:right w:w="40" w:type="dxa"/>
             </w:tcMar>
           </w:tcPr>
           <w:p>
@@ -193,11 +218,14 @@
               <w:jc w:val="center"/>
             </w:pPr>
             <w:r>
+              <w:rPr>
+                <w:noProof/>
+              </w:rPr>
               <w:drawing>
-                <wp:inline distT="0" distB="0" distL="0" distR="0">
-                  <wp:extent cx="1666875" cy="657225"/>
-                  <wp:effectExtent t="0" r="0" b="0" l="0"/>
-                  <wp:docPr id="1" name="" descr="" title=""/>
+                <wp:inline distT="0" distB="0" distL="0" distR="0" wp14:anchorId="15692058" wp14:editId="58D22575">
+                  <wp:extent cx="2240280" cy="883310"/>
+                  <wp:effectExtent l="0" t="0" r="7620" b="0"/>
+                  <wp:docPr id="671060265" name="Picture 671060265"/>
                   <wp:cNvGraphicFramePr>
                     <a:graphicFrameLocks xmlns:a="http://schemas.openxmlformats.org/drawingml/2006/main" noChangeAspect="1"/>
                   </wp:cNvGraphicFramePr>
@@ -205,13 +233,13 @@
                     <a:graphicData uri="http://schemas.openxmlformats.org/drawingml/2006/picture">
                       <pic:pic xmlns:pic="http://schemas.openxmlformats.org/drawingml/2006/picture">
                         <pic:nvPicPr>
-                          <pic:cNvPr id="0" name="" descr=""/>
+                          <pic:cNvPr id="0" name=""/>
                           <pic:cNvPicPr>
                             <a:picLocks noChangeAspect="1" noChangeArrowheads="1"/>
                           </pic:cNvPicPr>
                         </pic:nvPicPr>
                         <pic:blipFill>
-                          <a:blip r:embed="rId10" cstate="none"/>
+                          <a:blip r:embed="rId8"/>
                           <a:srcRect/>
                           <a:stretch>
                             <a:fillRect/>
@@ -220,7 +248,7 @@
                         <pic:spPr bwMode="auto">
                           <a:xfrm>
                             <a:off x="0" y="0"/>
-                            <a:ext cx="1666875" cy="657225"/>
+                            <a:ext cx="2250035" cy="887156"/>
                           </a:xfrm>
                           <a:prstGeom prst="rect">
                             <a:avLst/>
@@ -236,18 +264,18 @@
         </w:tc>
         <w:tc>
           <w:tcPr>
-            <w:tcW w:type="dxa" w:w="3666"/>
+            <w:tcW w:w="3666" w:type="dxa"/>
             <w:tcBorders>
-              <w:top w:val="none" w:color="FFFFFF" w:sz="0"/>
-              <w:left w:val="none" w:color="FFFFFF" w:sz="0"/>
-              <w:bottom w:val="none" w:color="FFFFFF" w:sz="0"/>
-              <w:right w:val="none" w:color="FFFFFF" w:sz="0"/>
+              <w:top w:val="none" w:sz="0" w:space="0" w:color="FFFFFF"/>
+              <w:left w:val="none" w:sz="0" w:space="0" w:color="FFFFFF"/>
+              <w:bottom w:val="none" w:sz="0" w:space="0" w:color="FFFFFF"/>
+              <w:right w:val="none" w:sz="0" w:space="0" w:color="FFFFFF"/>
             </w:tcBorders>
             <w:tcMar>
-              <w:top w:type="dxa" w:w="40"/>
-              <w:left w:type="dxa" w:w="40"/>
-              <w:bottom w:type="dxa" w:w="80"/>
-              <w:right w:type="dxa" w:w="40"/>
+              <w:top w:w="40" w:type="dxa"/>
+              <w:left w:w="40" w:type="dxa"/>
+              <w:bottom w:w="80" w:type="dxa"/>
+              <w:right w:w="40" w:type="dxa"/>
             </w:tcMar>
           </w:tcPr>
           <w:p>
@@ -255,11 +283,14 @@
               <w:jc w:val="center"/>
             </w:pPr>
             <w:r>
+              <w:rPr>
+                <w:noProof/>
+              </w:rPr>
               <w:drawing>
-                <wp:inline distT="0" distB="0" distL="0" distR="0">
-                  <wp:extent cx="1666875" cy="657225"/>
-                  <wp:effectExtent t="0" r="0" b="0" l="0"/>
-                  <wp:docPr id="1" name="" descr="" title=""/>
+                <wp:inline distT="0" distB="0" distL="0" distR="0" wp14:anchorId="1A2A5E04" wp14:editId="57511A3D">
+                  <wp:extent cx="2217420" cy="874297"/>
+                  <wp:effectExtent l="0" t="0" r="0" b="2540"/>
+                  <wp:docPr id="1828850725" name="Picture 1828850725"/>
                   <wp:cNvGraphicFramePr>
                     <a:graphicFrameLocks xmlns:a="http://schemas.openxmlformats.org/drawingml/2006/main" noChangeAspect="1"/>
                   </wp:cNvGraphicFramePr>
@@ -267,13 +298,13 @@
                     <a:graphicData uri="http://schemas.openxmlformats.org/drawingml/2006/picture">
                       <pic:pic xmlns:pic="http://schemas.openxmlformats.org/drawingml/2006/picture">
                         <pic:nvPicPr>
-                          <pic:cNvPr id="0" name="" descr=""/>
+                          <pic:cNvPr id="0" name=""/>
                           <pic:cNvPicPr>
                             <a:picLocks noChangeAspect="1" noChangeArrowheads="1"/>
                           </pic:cNvPicPr>
                         </pic:nvPicPr>
                         <pic:blipFill>
-                          <a:blip r:embed="rId11" cstate="none"/>
+                          <a:blip r:embed="rId9"/>
                           <a:srcRect/>
                           <a:stretch>
                             <a:fillRect/>
@@ -282,7 +313,7 @@
                         <pic:spPr bwMode="auto">
                           <a:xfrm>
                             <a:off x="0" y="0"/>
-                            <a:ext cx="1666875" cy="657225"/>
+                            <a:ext cx="2249259" cy="886851"/>
                           </a:xfrm>
                           <a:prstGeom prst="rect">
                             <a:avLst/>
@@ -298,18 +329,18 @@
         </w:tc>
         <w:tc>
           <w:tcPr>
-            <w:tcW w:type="dxa" w:w="3666"/>
+            <w:tcW w:w="3666" w:type="dxa"/>
             <w:tcBorders>
-              <w:top w:val="none" w:color="FFFFFF" w:sz="0"/>
-              <w:left w:val="none" w:color="FFFFFF" w:sz="0"/>
-              <w:bottom w:val="none" w:color="FFFFFF" w:sz="0"/>
-              <w:right w:val="none" w:color="FFFFFF" w:sz="0"/>
+              <w:top w:val="none" w:sz="0" w:space="0" w:color="FFFFFF"/>
+              <w:left w:val="none" w:sz="0" w:space="0" w:color="FFFFFF"/>
+              <w:bottom w:val="none" w:sz="0" w:space="0" w:color="FFFFFF"/>
+              <w:right w:val="none" w:sz="0" w:space="0" w:color="FFFFFF"/>
             </w:tcBorders>
             <w:tcMar>
-              <w:top w:type="dxa" w:w="40"/>
-              <w:left w:type="dxa" w:w="40"/>
-              <w:bottom w:type="dxa" w:w="80"/>
-              <w:right w:type="dxa" w:w="40"/>
+              <w:top w:w="40" w:type="dxa"/>
+              <w:left w:w="40" w:type="dxa"/>
+              <w:bottom w:w="80" w:type="dxa"/>
+              <w:right w:w="40" w:type="dxa"/>
             </w:tcMar>
           </w:tcPr>
           <w:p>
@@ -317,11 +348,14 @@
               <w:jc w:val="center"/>
             </w:pPr>
             <w:r>
+              <w:rPr>
+                <w:noProof/>
+              </w:rPr>
               <w:drawing>
-                <wp:inline distT="0" distB="0" distL="0" distR="0">
-                  <wp:extent cx="1666875" cy="657225"/>
-                  <wp:effectExtent t="0" r="0" b="0" l="0"/>
-                  <wp:docPr id="1" name="" descr="" title=""/>
+                <wp:inline distT="0" distB="0" distL="0" distR="0" wp14:anchorId="5EFC4EDA" wp14:editId="5A1CE60C">
+                  <wp:extent cx="2255520" cy="889320"/>
+                  <wp:effectExtent l="0" t="0" r="0" b="6350"/>
+                  <wp:docPr id="1853963303" name="Picture 1853963303"/>
                   <wp:cNvGraphicFramePr>
                     <a:graphicFrameLocks xmlns:a="http://schemas.openxmlformats.org/drawingml/2006/main" noChangeAspect="1"/>
                   </wp:cNvGraphicFramePr>
@@ -329,13 +363,13 @@
                     <a:graphicData uri="http://schemas.openxmlformats.org/drawingml/2006/picture">
                       <pic:pic xmlns:pic="http://schemas.openxmlformats.org/drawingml/2006/picture">
                         <pic:nvPicPr>
-                          <pic:cNvPr id="0" name="" descr=""/>
+                          <pic:cNvPr id="0" name=""/>
                           <pic:cNvPicPr>
                             <a:picLocks noChangeAspect="1" noChangeArrowheads="1"/>
                           </pic:cNvPicPr>
                         </pic:nvPicPr>
                         <pic:blipFill>
-                          <a:blip r:embed="rId12" cstate="none"/>
+                          <a:blip r:embed="rId10"/>
                           <a:srcRect/>
                           <a:stretch>
                             <a:fillRect/>
@@ -344,7 +378,7 @@
                         <pic:spPr bwMode="auto">
                           <a:xfrm>
                             <a:off x="0" y="0"/>
-                            <a:ext cx="1666875" cy="657225"/>
+                            <a:ext cx="2274275" cy="896715"/>
                           </a:xfrm>
                           <a:prstGeom prst="rect">
                             <a:avLst/>
@@ -364,64 +398,43 @@
       <w:pPr>
         <w:spacing w:after="40"/>
       </w:pPr>
-      <w:r>
-        <w:rPr>
-          <w:rFonts w:ascii="Arial" w:cs="Arial" w:eastAsia="Arial" w:hAnsi="Arial"/>
-          <w:color w:val="27251F"/>
-          <w:sz w:val="21"/>
-          <w:szCs w:val="21"/>
-        </w:rPr>
-        <w:t xml:space="preserve"/>
-      </w:r>
-    </w:p>
-    <w:p>
-      <w:pPr>
-        <w:spacing w:after="90" w:line="290"/>
-      </w:pPr>
-      <w:r>
-        <w:rPr>
-          <w:rFonts w:ascii="Arial" w:cs="Arial" w:eastAsia="Arial" w:hAnsi="Arial"/>
+    </w:p>
+    <w:p>
+      <w:pPr>
+        <w:spacing w:after="90" w:line="290" w:lineRule="auto"/>
+      </w:pPr>
+      <w:r>
+        <w:rPr>
           <w:b/>
           <w:bCs/>
           <w:color w:val="27251F"/>
-          <w:sz w:val="21"/>
-          <w:szCs w:val="21"/>
         </w:rPr>
         <w:t xml:space="preserve">What to look at: </w:t>
       </w:r>
       <w:r>
         <w:rPr>
-          <w:rFonts w:ascii="Arial" w:cs="Arial" w:eastAsia="Arial" w:hAnsi="Arial"/>
-          <w:color w:val="27251F"/>
-          <w:sz w:val="21"/>
-          <w:szCs w:val="21"/>
-        </w:rPr>
-        <w:t xml:space="preserve">compare New Hires with Resignations.</w:t>
-      </w:r>
-    </w:p>
-    <w:p>
-      <w:pPr>
-        <w:spacing w:after="90" w:line="290"/>
-      </w:pPr>
-      <w:r>
-        <w:rPr>
-          <w:rFonts w:ascii="Arial" w:cs="Arial" w:eastAsia="Arial" w:hAnsi="Arial"/>
+          <w:color w:val="27251F"/>
+        </w:rPr>
+        <w:t>compare New Hires with Resignations.</w:t>
+      </w:r>
+    </w:p>
+    <w:p>
+      <w:pPr>
+        <w:spacing w:after="90" w:line="290" w:lineRule="auto"/>
+      </w:pPr>
+      <w:r>
+        <w:rPr>
           <w:b/>
           <w:bCs/>
           <w:color w:val="27251F"/>
-          <w:sz w:val="21"/>
-          <w:szCs w:val="21"/>
         </w:rPr>
         <w:t xml:space="preserve">Then decide: </w:t>
       </w:r>
       <w:r>
         <w:rPr>
-          <w:rFonts w:ascii="Arial" w:cs="Arial" w:eastAsia="Arial" w:hAnsi="Arial"/>
-          <w:color w:val="27251F"/>
-          <w:sz w:val="21"/>
-          <w:szCs w:val="21"/>
-        </w:rPr>
-        <w:t xml:space="preserve">if resignations are higher than hires, your headcount is shrinking. Check the trend chart below to see whether this is new.</w:t>
+          <w:color w:val="27251F"/>
+        </w:rPr>
+        <w:t>if resignations are higher than hires, your headcount is shrinking. Check the trend chart below to see whether this is new.</w:t>
       </w:r>
     </w:p>
     <w:p>
@@ -429,21 +442,24 @@
         <w:pStyle w:val="Heading2"/>
       </w:pPr>
       <w:r>
-        <w:t xml:space="preserve">Step 3 - Is the headcount going the right way?</w:t>
+        <w:t>Step 3 - Is the headcount going the right way?</w:t>
       </w:r>
     </w:p>
     <w:p>
       <w:pPr>
         <w:keepNext/>
-        <w:spacing w:after="120" w:before="60"/>
+        <w:spacing w:before="60" w:after="120"/>
         <w:jc w:val="center"/>
       </w:pPr>
       <w:r>
+        <w:rPr>
+          <w:noProof/>
+        </w:rPr>
         <w:drawing>
-          <wp:inline distT="0" distB="0" distL="0" distR="0">
+          <wp:inline distT="0" distB="0" distL="0" distR="0" wp14:anchorId="4BC4CEBF" wp14:editId="583C536C">
             <wp:extent cx="6953250" cy="1962150"/>
-            <wp:effectExtent t="0" r="0" b="0" l="0"/>
-            <wp:docPr id="1" name="" descr="" title=""/>
+            <wp:effectExtent l="0" t="0" r="0" b="0"/>
+            <wp:docPr id="721674614" name="Picture 721674614"/>
             <wp:cNvGraphicFramePr>
               <a:graphicFrameLocks xmlns:a="http://schemas.openxmlformats.org/drawingml/2006/main" noChangeAspect="1"/>
             </wp:cNvGraphicFramePr>
@@ -451,13 +467,13 @@
               <a:graphicData uri="http://schemas.openxmlformats.org/drawingml/2006/picture">
                 <pic:pic xmlns:pic="http://schemas.openxmlformats.org/drawingml/2006/picture">
                   <pic:nvPicPr>
-                    <pic:cNvPr id="0" name="" descr=""/>
+                    <pic:cNvPr id="0" name=""/>
                     <pic:cNvPicPr>
                       <a:picLocks noChangeAspect="1" noChangeArrowheads="1"/>
                     </pic:cNvPicPr>
                   </pic:nvPicPr>
                   <pic:blipFill>
-                    <a:blip r:embed="rId13" cstate="none"/>
+                    <a:blip r:embed="rId11"/>
                     <a:srcRect/>
                     <a:stretch>
                       <a:fillRect/>
@@ -481,52 +497,40 @@
     </w:p>
     <w:p>
       <w:pPr>
-        <w:spacing w:after="90" w:line="290"/>
-      </w:pPr>
-      <w:r>
-        <w:rPr>
-          <w:rFonts w:ascii="Arial" w:cs="Arial" w:eastAsia="Arial" w:hAnsi="Arial"/>
+        <w:spacing w:after="90" w:line="290" w:lineRule="auto"/>
+      </w:pPr>
+      <w:r>
+        <w:rPr>
           <w:b/>
           <w:bCs/>
           <w:color w:val="27251F"/>
-          <w:sz w:val="21"/>
-          <w:szCs w:val="21"/>
         </w:rPr>
         <w:t xml:space="preserve">What to look at: </w:t>
       </w:r>
       <w:r>
         <w:rPr>
-          <w:rFonts w:ascii="Arial" w:cs="Arial" w:eastAsia="Arial" w:hAnsi="Arial"/>
-          <w:color w:val="27251F"/>
-          <w:sz w:val="21"/>
-          <w:szCs w:val="21"/>
-        </w:rPr>
-        <w:t xml:space="preserve">the direction of the line over the year.</w:t>
-      </w:r>
-    </w:p>
-    <w:p>
-      <w:pPr>
-        <w:spacing w:after="90" w:line="290"/>
-      </w:pPr>
-      <w:r>
-        <w:rPr>
-          <w:rFonts w:ascii="Arial" w:cs="Arial" w:eastAsia="Arial" w:hAnsi="Arial"/>
+          <w:color w:val="27251F"/>
+        </w:rPr>
+        <w:t>the direction of the line over the year.</w:t>
+      </w:r>
+    </w:p>
+    <w:p>
+      <w:pPr>
+        <w:spacing w:after="90" w:line="290" w:lineRule="auto"/>
+      </w:pPr>
+      <w:r>
+        <w:rPr>
           <w:b/>
           <w:bCs/>
           <w:color w:val="27251F"/>
-          <w:sz w:val="21"/>
-          <w:szCs w:val="21"/>
         </w:rPr>
         <w:t xml:space="preserve">Then decide: </w:t>
       </w:r>
       <w:r>
         <w:rPr>
-          <w:rFonts w:ascii="Arial" w:cs="Arial" w:eastAsia="Arial" w:hAnsi="Arial"/>
-          <w:color w:val="27251F"/>
-          <w:sz w:val="21"/>
-          <w:szCs w:val="21"/>
-        </w:rPr>
-        <w:t xml:space="preserve">a falling line means you are losing people faster than you add them. Use the filters to find which store or manager the drop comes from.</w:t>
+          <w:color w:val="27251F"/>
+        </w:rPr>
+        <w:t>a falling line means you are losing people faster than you add them. Use the filters to find which store or manager the drop comes from.</w:t>
       </w:r>
     </w:p>
     <w:p>
@@ -534,55 +538,73 @@
         <w:pStyle w:val="Heading2"/>
       </w:pPr>
       <w:r>
-        <w:t xml:space="preserve">Step 4 - Is the team experienced enough?</w:t>
+        <w:lastRenderedPageBreak/>
+        <w:t>Step 4 - Is the team experienced enough?</w:t>
       </w:r>
     </w:p>
     <w:tbl>
       <w:tblPr>
-        <w:tblW w:type="dxa" w:w="11000"/>
+        <w:tblW w:w="11000" w:type="dxa"/>
         <w:jc w:val="center"/>
         <w:tblBorders>
-          <w:top w:val="single" w:color="auto" w:sz="4"/>
-          <w:left w:val="single" w:color="auto" w:sz="4"/>
-          <w:bottom w:val="single" w:color="auto" w:sz="4"/>
-          <w:right w:val="single" w:color="auto" w:sz="4"/>
-          <w:insideH w:val="single" w:color="auto" w:sz="4"/>
-          <w:insideV w:val="single" w:color="auto" w:sz="4"/>
+          <w:top w:val="single" w:sz="4" w:space="0" w:color="auto"/>
+          <w:left w:val="single" w:sz="4" w:space="0" w:color="auto"/>
+          <w:bottom w:val="single" w:sz="4" w:space="0" w:color="auto"/>
+          <w:right w:val="single" w:sz="4" w:space="0" w:color="auto"/>
+          <w:insideH w:val="single" w:sz="4" w:space="0" w:color="auto"/>
+          <w:insideV w:val="single" w:sz="4" w:space="0" w:color="auto"/>
         </w:tblBorders>
+        <w:tblCellMar>
+          <w:left w:w="10" w:type="dxa"/>
+          <w:right w:w="10" w:type="dxa"/>
+        </w:tblCellMar>
+        <w:tblLook w:val="04A0" w:firstRow="1" w:lastRow="0" w:firstColumn="1" w:lastColumn="0" w:noHBand="0" w:noVBand="1"/>
       </w:tblPr>
       <w:tblGrid>
         <w:gridCol w:w="5500"/>
         <w:gridCol w:w="5500"/>
       </w:tblGrid>
       <w:tr>
+        <w:tblPrEx>
+          <w:tblCellMar>
+            <w:top w:w="0" w:type="dxa"/>
+            <w:bottom w:w="0" w:type="dxa"/>
+          </w:tblCellMar>
+        </w:tblPrEx>
+        <w:trPr>
+          <w:jc w:val="center"/>
+        </w:trPr>
         <w:tc>
           <w:tcPr>
-            <w:tcW w:type="dxa" w:w="5500"/>
+            <w:tcW w:w="5500" w:type="dxa"/>
             <w:tcBorders>
-              <w:top w:val="none" w:color="FFFFFF" w:sz="0"/>
-              <w:left w:val="none" w:color="FFFFFF" w:sz="0"/>
-              <w:bottom w:val="none" w:color="FFFFFF" w:sz="0"/>
-              <w:right w:val="none" w:color="FFFFFF" w:sz="0"/>
+              <w:top w:val="none" w:sz="0" w:space="0" w:color="FFFFFF"/>
+              <w:left w:val="none" w:sz="0" w:space="0" w:color="FFFFFF"/>
+              <w:bottom w:val="none" w:sz="0" w:space="0" w:color="FFFFFF"/>
+              <w:right w:val="none" w:sz="0" w:space="0" w:color="FFFFFF"/>
             </w:tcBorders>
             <w:tcMar>
-              <w:top w:type="dxa" w:w="40"/>
-              <w:left w:type="dxa" w:w="70"/>
-              <w:bottom w:type="dxa" w:w="60"/>
-              <w:right w:type="dxa" w:w="70"/>
+              <w:top w:w="40" w:type="dxa"/>
+              <w:left w:w="70" w:type="dxa"/>
+              <w:bottom w:w="60" w:type="dxa"/>
+              <w:right w:w="70" w:type="dxa"/>
             </w:tcMar>
           </w:tcPr>
           <w:p>
             <w:pPr>
               <w:keepNext/>
-              <w:spacing w:after="120" w:before="60"/>
+              <w:spacing w:before="60" w:after="120"/>
               <w:jc w:val="center"/>
             </w:pPr>
             <w:r>
+              <w:rPr>
+                <w:noProof/>
+              </w:rPr>
               <w:drawing>
-                <wp:inline distT="0" distB="0" distL="0" distR="0">
+                <wp:inline distT="0" distB="0" distL="0" distR="0" wp14:anchorId="1D592E81" wp14:editId="0159BD4B">
                   <wp:extent cx="3286125" cy="1876425"/>
-                  <wp:effectExtent t="0" r="0" b="0" l="0"/>
-                  <wp:docPr id="1" name="" descr="" title=""/>
+                  <wp:effectExtent l="0" t="0" r="0" b="0"/>
+                  <wp:docPr id="686670272" name="Picture 686670272"/>
                   <wp:cNvGraphicFramePr>
                     <a:graphicFrameLocks xmlns:a="http://schemas.openxmlformats.org/drawingml/2006/main" noChangeAspect="1"/>
                   </wp:cNvGraphicFramePr>
@@ -590,13 +612,13 @@
                     <a:graphicData uri="http://schemas.openxmlformats.org/drawingml/2006/picture">
                       <pic:pic xmlns:pic="http://schemas.openxmlformats.org/drawingml/2006/picture">
                         <pic:nvPicPr>
-                          <pic:cNvPr id="0" name="" descr=""/>
+                          <pic:cNvPr id="0" name=""/>
                           <pic:cNvPicPr>
                             <a:picLocks noChangeAspect="1" noChangeArrowheads="1"/>
                           </pic:cNvPicPr>
                         </pic:nvPicPr>
                         <pic:blipFill>
-                          <a:blip r:embed="rId14" cstate="none"/>
+                          <a:blip r:embed="rId12"/>
                           <a:srcRect/>
                           <a:stretch>
                             <a:fillRect/>
@@ -621,68 +643,70 @@
         </w:tc>
         <w:tc>
           <w:tcPr>
-            <w:tcW w:type="dxa" w:w="5500"/>
+            <w:tcW w:w="5500" w:type="dxa"/>
             <w:tcBorders>
-              <w:top w:val="none" w:color="FFFFFF" w:sz="0"/>
-              <w:left w:val="none" w:color="FFFFFF" w:sz="0"/>
-              <w:bottom w:val="none" w:color="FFFFFF" w:sz="0"/>
-              <w:right w:val="none" w:color="FFFFFF" w:sz="0"/>
+              <w:top w:val="none" w:sz="0" w:space="0" w:color="FFFFFF"/>
+              <w:left w:val="none" w:sz="0" w:space="0" w:color="FFFFFF"/>
+              <w:bottom w:val="none" w:sz="0" w:space="0" w:color="FFFFFF"/>
+              <w:right w:val="none" w:sz="0" w:space="0" w:color="FFFFFF"/>
             </w:tcBorders>
             <w:tcMar>
-              <w:top w:type="dxa" w:w="40"/>
-              <w:left w:type="dxa" w:w="70"/>
-              <w:bottom w:type="dxa" w:w="60"/>
-              <w:right w:type="dxa" w:w="70"/>
+              <w:top w:w="40" w:type="dxa"/>
+              <w:left w:w="70" w:type="dxa"/>
+              <w:bottom w:w="60" w:type="dxa"/>
+              <w:right w:w="70" w:type="dxa"/>
             </w:tcMar>
           </w:tcPr>
           <w:p>
             <w:pPr>
-              <w:spacing w:after="90" w:line="290"/>
+              <w:spacing w:after="90" w:line="290" w:lineRule="auto"/>
             </w:pPr>
             <w:r>
               <w:rPr>
-                <w:rFonts w:ascii="Arial" w:cs="Arial" w:eastAsia="Arial" w:hAnsi="Arial"/>
                 <w:b/>
                 <w:bCs/>
                 <w:color w:val="27251F"/>
-                <w:sz w:val="21"/>
-                <w:szCs w:val="21"/>
               </w:rPr>
               <w:t xml:space="preserve">What to look at: </w:t>
             </w:r>
             <w:r>
               <w:rPr>
-                <w:rFonts w:ascii="Arial" w:cs="Arial" w:eastAsia="Arial" w:hAnsi="Arial"/>
                 <w:color w:val="27251F"/>
-                <w:sz w:val="21"/>
-                <w:szCs w:val="21"/>
               </w:rPr>
-              <w:t xml:space="preserve">how tall the "&lt; 3 months" and "3-6 months" bars are compared with "2+ years".</w:t>
+              <w:t>how tall the "&lt; 3 months" and "3-6 months" bars are compared with "2+ years".</w:t>
             </w:r>
           </w:p>
           <w:p>
             <w:pPr>
-              <w:spacing w:after="90" w:line="290"/>
+              <w:spacing w:after="90" w:line="290" w:lineRule="auto"/>
             </w:pPr>
             <w:r>
               <w:rPr>
-                <w:rFonts w:ascii="Arial" w:cs="Arial" w:eastAsia="Arial" w:hAnsi="Arial"/>
                 <w:b/>
                 <w:bCs/>
                 <w:color w:val="27251F"/>
-                <w:sz w:val="21"/>
-                <w:szCs w:val="21"/>
               </w:rPr>
               <w:t xml:space="preserve">Then decide: </w:t>
             </w:r>
             <w:r>
               <w:rPr>
-                <w:rFonts w:ascii="Arial" w:cs="Arial" w:eastAsia="Arial" w:hAnsi="Arial"/>
                 <w:color w:val="27251F"/>
-                <w:sz w:val="21"/>
-                <w:szCs w:val="21"/>
               </w:rPr>
-              <w:t xml:space="preserve">a large share of new people means more coaching and closer follow-up. A team that is mostly 2+ years is stable, but check that you are still hiring for the future.</w:t>
+              <w:t xml:space="preserve">a large share of new people means more coaching and closer follow-up. A team that is mostly 2+ years is </w:t>
+            </w:r>
+            <w:proofErr w:type="gramStart"/>
+            <w:r>
+              <w:rPr>
+                <w:color w:val="27251F"/>
+              </w:rPr>
+              <w:t>stable, but</w:t>
+            </w:r>
+            <w:proofErr w:type="gramEnd"/>
+            <w:r>
+              <w:rPr>
+                <w:color w:val="27251F"/>
+              </w:rPr>
+              <w:t xml:space="preserve"> check that you are still hiring for the future.</w:t>
             </w:r>
           </w:p>
         </w:tc>
@@ -692,70 +716,78 @@
       <w:pPr>
         <w:spacing w:after="30"/>
       </w:pPr>
-      <w:r>
-        <w:rPr>
-          <w:rFonts w:ascii="Arial" w:cs="Arial" w:eastAsia="Arial" w:hAnsi="Arial"/>
-          <w:color w:val="27251F"/>
-          <w:sz w:val="21"/>
-          <w:szCs w:val="21"/>
-        </w:rPr>
-        <w:t xml:space="preserve"/>
-      </w:r>
     </w:p>
     <w:p>
       <w:pPr>
         <w:pStyle w:val="Heading2"/>
       </w:pPr>
       <w:r>
-        <w:t xml:space="preserve">Step 5 - Who is on the team?</w:t>
+        <w:t>Step 5 - Who is on the team?</w:t>
       </w:r>
     </w:p>
     <w:tbl>
       <w:tblPr>
-        <w:tblW w:type="dxa" w:w="11000"/>
+        <w:tblW w:w="11000" w:type="dxa"/>
         <w:jc w:val="center"/>
         <w:tblBorders>
-          <w:top w:val="single" w:color="auto" w:sz="4"/>
-          <w:left w:val="single" w:color="auto" w:sz="4"/>
-          <w:bottom w:val="single" w:color="auto" w:sz="4"/>
-          <w:right w:val="single" w:color="auto" w:sz="4"/>
-          <w:insideH w:val="single" w:color="auto" w:sz="4"/>
-          <w:insideV w:val="single" w:color="auto" w:sz="4"/>
+          <w:top w:val="single" w:sz="4" w:space="0" w:color="auto"/>
+          <w:left w:val="single" w:sz="4" w:space="0" w:color="auto"/>
+          <w:bottom w:val="single" w:sz="4" w:space="0" w:color="auto"/>
+          <w:right w:val="single" w:sz="4" w:space="0" w:color="auto"/>
+          <w:insideH w:val="single" w:sz="4" w:space="0" w:color="auto"/>
+          <w:insideV w:val="single" w:sz="4" w:space="0" w:color="auto"/>
         </w:tblBorders>
+        <w:tblCellMar>
+          <w:left w:w="10" w:type="dxa"/>
+          <w:right w:w="10" w:type="dxa"/>
+        </w:tblCellMar>
+        <w:tblLook w:val="04A0" w:firstRow="1" w:lastRow="0" w:firstColumn="1" w:lastColumn="0" w:noHBand="0" w:noVBand="1"/>
       </w:tblPr>
       <w:tblGrid>
         <w:gridCol w:w="5500"/>
         <w:gridCol w:w="5500"/>
       </w:tblGrid>
       <w:tr>
+        <w:tblPrEx>
+          <w:tblCellMar>
+            <w:top w:w="0" w:type="dxa"/>
+            <w:bottom w:w="0" w:type="dxa"/>
+          </w:tblCellMar>
+        </w:tblPrEx>
+        <w:trPr>
+          <w:jc w:val="center"/>
+        </w:trPr>
         <w:tc>
           <w:tcPr>
-            <w:tcW w:type="dxa" w:w="5500"/>
+            <w:tcW w:w="5500" w:type="dxa"/>
             <w:tcBorders>
-              <w:top w:val="none" w:color="FFFFFF" w:sz="0"/>
-              <w:left w:val="none" w:color="FFFFFF" w:sz="0"/>
-              <w:bottom w:val="none" w:color="FFFFFF" w:sz="0"/>
-              <w:right w:val="none" w:color="FFFFFF" w:sz="0"/>
+              <w:top w:val="none" w:sz="0" w:space="0" w:color="FFFFFF"/>
+              <w:left w:val="none" w:sz="0" w:space="0" w:color="FFFFFF"/>
+              <w:bottom w:val="none" w:sz="0" w:space="0" w:color="FFFFFF"/>
+              <w:right w:val="none" w:sz="0" w:space="0" w:color="FFFFFF"/>
             </w:tcBorders>
             <w:tcMar>
-              <w:top w:type="dxa" w:w="40"/>
-              <w:left w:type="dxa" w:w="70"/>
-              <w:bottom w:type="dxa" w:w="60"/>
-              <w:right w:type="dxa" w:w="70"/>
+              <w:top w:w="40" w:type="dxa"/>
+              <w:left w:w="70" w:type="dxa"/>
+              <w:bottom w:w="60" w:type="dxa"/>
+              <w:right w:w="70" w:type="dxa"/>
             </w:tcMar>
           </w:tcPr>
           <w:p>
             <w:pPr>
               <w:keepNext/>
-              <w:spacing w:after="120" w:before="60"/>
+              <w:spacing w:before="60" w:after="120"/>
               <w:jc w:val="center"/>
             </w:pPr>
             <w:r>
+              <w:rPr>
+                <w:noProof/>
+              </w:rPr>
               <w:drawing>
-                <wp:inline distT="0" distB="0" distL="0" distR="0">
+                <wp:inline distT="0" distB="0" distL="0" distR="0" wp14:anchorId="6ABFA316" wp14:editId="54E06FB7">
                   <wp:extent cx="3286125" cy="1876425"/>
-                  <wp:effectExtent t="0" r="0" b="0" l="0"/>
-                  <wp:docPr id="1" name="" descr="" title=""/>
+                  <wp:effectExtent l="0" t="0" r="0" b="0"/>
+                  <wp:docPr id="1749672974" name="Picture 1749672974"/>
                   <wp:cNvGraphicFramePr>
                     <a:graphicFrameLocks xmlns:a="http://schemas.openxmlformats.org/drawingml/2006/main" noChangeAspect="1"/>
                   </wp:cNvGraphicFramePr>
@@ -763,13 +795,13 @@
                     <a:graphicData uri="http://schemas.openxmlformats.org/drawingml/2006/picture">
                       <pic:pic xmlns:pic="http://schemas.openxmlformats.org/drawingml/2006/picture">
                         <pic:nvPicPr>
-                          <pic:cNvPr id="0" name="" descr=""/>
+                          <pic:cNvPr id="0" name=""/>
                           <pic:cNvPicPr>
                             <a:picLocks noChangeAspect="1" noChangeArrowheads="1"/>
                           </pic:cNvPicPr>
                         </pic:nvPicPr>
                         <pic:blipFill>
-                          <a:blip r:embed="rId15" cstate="none"/>
+                          <a:blip r:embed="rId13"/>
                           <a:srcRect/>
                           <a:stretch>
                             <a:fillRect/>
@@ -793,58 +825,55 @@
           </w:p>
           <w:p>
             <w:pPr>
-              <w:spacing w:after="90" w:line="290"/>
+              <w:spacing w:after="90" w:line="290" w:lineRule="auto"/>
             </w:pPr>
             <w:r>
               <w:rPr>
-                <w:rFonts w:ascii="Arial" w:cs="Arial" w:eastAsia="Arial" w:hAnsi="Arial"/>
                 <w:b/>
                 <w:bCs/>
                 <w:color w:val="27251F"/>
-                <w:sz w:val="21"/>
-                <w:szCs w:val="21"/>
               </w:rPr>
               <w:t xml:space="preserve">What to look at: </w:t>
             </w:r>
             <w:r>
               <w:rPr>
-                <w:rFonts w:ascii="Arial" w:cs="Arial" w:eastAsia="Arial" w:hAnsi="Arial"/>
                 <w:color w:val="27251F"/>
-                <w:sz w:val="21"/>
-                <w:szCs w:val="21"/>
               </w:rPr>
-              <w:t xml:space="preserve">which roles carry most of your headcount, and whether a role you depend on looks thin.</w:t>
+              <w:t>which roles carry most of your headcount, and whether a role you depend on looks thin.</w:t>
             </w:r>
           </w:p>
         </w:tc>
         <w:tc>
           <w:tcPr>
-            <w:tcW w:type="dxa" w:w="5500"/>
+            <w:tcW w:w="5500" w:type="dxa"/>
             <w:tcBorders>
-              <w:top w:val="none" w:color="FFFFFF" w:sz="0"/>
-              <w:left w:val="none" w:color="FFFFFF" w:sz="0"/>
-              <w:bottom w:val="none" w:color="FFFFFF" w:sz="0"/>
-              <w:right w:val="none" w:color="FFFFFF" w:sz="0"/>
+              <w:top w:val="none" w:sz="0" w:space="0" w:color="FFFFFF"/>
+              <w:left w:val="none" w:sz="0" w:space="0" w:color="FFFFFF"/>
+              <w:bottom w:val="none" w:sz="0" w:space="0" w:color="FFFFFF"/>
+              <w:right w:val="none" w:sz="0" w:space="0" w:color="FFFFFF"/>
             </w:tcBorders>
             <w:tcMar>
-              <w:top w:type="dxa" w:w="40"/>
-              <w:left w:type="dxa" w:w="70"/>
-              <w:bottom w:type="dxa" w:w="60"/>
-              <w:right w:type="dxa" w:w="70"/>
+              <w:top w:w="40" w:type="dxa"/>
+              <w:left w:w="70" w:type="dxa"/>
+              <w:bottom w:w="60" w:type="dxa"/>
+              <w:right w:w="70" w:type="dxa"/>
             </w:tcMar>
           </w:tcPr>
           <w:p>
             <w:pPr>
               <w:keepNext/>
-              <w:spacing w:after="120" w:before="60"/>
+              <w:spacing w:before="60" w:after="120"/>
               <w:jc w:val="center"/>
             </w:pPr>
             <w:r>
+              <w:rPr>
+                <w:noProof/>
+              </w:rPr>
               <w:drawing>
-                <wp:inline distT="0" distB="0" distL="0" distR="0">
+                <wp:inline distT="0" distB="0" distL="0" distR="0" wp14:anchorId="412A93ED" wp14:editId="1979B9C6">
                   <wp:extent cx="3286125" cy="1876425"/>
-                  <wp:effectExtent t="0" r="0" b="0" l="0"/>
-                  <wp:docPr id="1" name="" descr="" title=""/>
+                  <wp:effectExtent l="0" t="0" r="0" b="0"/>
+                  <wp:docPr id="875971426" name="Picture 875971426"/>
                   <wp:cNvGraphicFramePr>
                     <a:graphicFrameLocks xmlns:a="http://schemas.openxmlformats.org/drawingml/2006/main" noChangeAspect="1"/>
                   </wp:cNvGraphicFramePr>
@@ -852,13 +881,13 @@
                     <a:graphicData uri="http://schemas.openxmlformats.org/drawingml/2006/picture">
                       <pic:pic xmlns:pic="http://schemas.openxmlformats.org/drawingml/2006/picture">
                         <pic:nvPicPr>
-                          <pic:cNvPr id="0" name="" descr=""/>
+                          <pic:cNvPr id="0" name=""/>
                           <pic:cNvPicPr>
                             <a:picLocks noChangeAspect="1" noChangeArrowheads="1"/>
                           </pic:cNvPicPr>
                         </pic:nvPicPr>
                         <pic:blipFill>
-                          <a:blip r:embed="rId16" cstate="none"/>
+                          <a:blip r:embed="rId14"/>
                           <a:srcRect/>
                           <a:stretch>
                             <a:fillRect/>
@@ -882,27 +911,21 @@
           </w:p>
           <w:p>
             <w:pPr>
-              <w:spacing w:after="90" w:line="290"/>
+              <w:spacing w:after="90" w:line="290" w:lineRule="auto"/>
             </w:pPr>
             <w:r>
               <w:rPr>
-                <w:rFonts w:ascii="Arial" w:cs="Arial" w:eastAsia="Arial" w:hAnsi="Arial"/>
                 <w:b/>
                 <w:bCs/>
                 <w:color w:val="27251F"/>
-                <w:sz w:val="21"/>
-                <w:szCs w:val="21"/>
               </w:rPr>
               <w:t xml:space="preserve">What to look at: </w:t>
             </w:r>
             <w:r>
               <w:rPr>
-                <w:rFonts w:ascii="Arial" w:cs="Arial" w:eastAsia="Arial" w:hAnsi="Arial"/>
                 <w:color w:val="27251F"/>
-                <w:sz w:val="21"/>
-                <w:szCs w:val="21"/>
               </w:rPr>
-              <w:t xml:space="preserve">the split between payroll groups.</w:t>
+              <w:t>the split between payroll groups.</w:t>
             </w:r>
           </w:p>
         </w:tc>
@@ -912,62 +935,70 @@
       <w:pPr>
         <w:spacing w:after="30"/>
       </w:pPr>
-      <w:r>
-        <w:rPr>
-          <w:rFonts w:ascii="Arial" w:cs="Arial" w:eastAsia="Arial" w:hAnsi="Arial"/>
-          <w:color w:val="27251F"/>
-          <w:sz w:val="21"/>
-          <w:szCs w:val="21"/>
-        </w:rPr>
-        <w:t xml:space="preserve"/>
-      </w:r>
     </w:p>
     <w:tbl>
       <w:tblPr>
-        <w:tblW w:type="dxa" w:w="11000"/>
+        <w:tblW w:w="11000" w:type="dxa"/>
         <w:jc w:val="center"/>
         <w:tblBorders>
-          <w:top w:val="single" w:color="auto" w:sz="4"/>
-          <w:left w:val="single" w:color="auto" w:sz="4"/>
-          <w:bottom w:val="single" w:color="auto" w:sz="4"/>
-          <w:right w:val="single" w:color="auto" w:sz="4"/>
-          <w:insideH w:val="single" w:color="auto" w:sz="4"/>
-          <w:insideV w:val="single" w:color="auto" w:sz="4"/>
+          <w:top w:val="single" w:sz="4" w:space="0" w:color="auto"/>
+          <w:left w:val="single" w:sz="4" w:space="0" w:color="auto"/>
+          <w:bottom w:val="single" w:sz="4" w:space="0" w:color="auto"/>
+          <w:right w:val="single" w:sz="4" w:space="0" w:color="auto"/>
+          <w:insideH w:val="single" w:sz="4" w:space="0" w:color="auto"/>
+          <w:insideV w:val="single" w:sz="4" w:space="0" w:color="auto"/>
         </w:tblBorders>
+        <w:tblCellMar>
+          <w:left w:w="10" w:type="dxa"/>
+          <w:right w:w="10" w:type="dxa"/>
+        </w:tblCellMar>
+        <w:tblLook w:val="04A0" w:firstRow="1" w:lastRow="0" w:firstColumn="1" w:lastColumn="0" w:noHBand="0" w:noVBand="1"/>
       </w:tblPr>
       <w:tblGrid>
         <w:gridCol w:w="5500"/>
         <w:gridCol w:w="5500"/>
       </w:tblGrid>
       <w:tr>
+        <w:tblPrEx>
+          <w:tblCellMar>
+            <w:top w:w="0" w:type="dxa"/>
+            <w:bottom w:w="0" w:type="dxa"/>
+          </w:tblCellMar>
+        </w:tblPrEx>
+        <w:trPr>
+          <w:jc w:val="center"/>
+        </w:trPr>
         <w:tc>
           <w:tcPr>
-            <w:tcW w:type="dxa" w:w="5500"/>
+            <w:tcW w:w="5500" w:type="dxa"/>
             <w:tcBorders>
-              <w:top w:val="none" w:color="FFFFFF" w:sz="0"/>
-              <w:left w:val="none" w:color="FFFFFF" w:sz="0"/>
-              <w:bottom w:val="none" w:color="FFFFFF" w:sz="0"/>
-              <w:right w:val="none" w:color="FFFFFF" w:sz="0"/>
+              <w:top w:val="none" w:sz="0" w:space="0" w:color="FFFFFF"/>
+              <w:left w:val="none" w:sz="0" w:space="0" w:color="FFFFFF"/>
+              <w:bottom w:val="none" w:sz="0" w:space="0" w:color="FFFFFF"/>
+              <w:right w:val="none" w:sz="0" w:space="0" w:color="FFFFFF"/>
             </w:tcBorders>
             <w:tcMar>
-              <w:top w:type="dxa" w:w="40"/>
-              <w:left w:type="dxa" w:w="70"/>
-              <w:bottom w:type="dxa" w:w="60"/>
-              <w:right w:type="dxa" w:w="70"/>
+              <w:top w:w="40" w:type="dxa"/>
+              <w:left w:w="70" w:type="dxa"/>
+              <w:bottom w:w="60" w:type="dxa"/>
+              <w:right w:w="70" w:type="dxa"/>
             </w:tcMar>
           </w:tcPr>
           <w:p>
             <w:pPr>
               <w:keepNext/>
-              <w:spacing w:after="120" w:before="60"/>
+              <w:spacing w:before="60" w:after="120"/>
               <w:jc w:val="center"/>
             </w:pPr>
             <w:r>
+              <w:rPr>
+                <w:noProof/>
+              </w:rPr>
               <w:drawing>
-                <wp:inline distT="0" distB="0" distL="0" distR="0">
+                <wp:inline distT="0" distB="0" distL="0" distR="0" wp14:anchorId="6DD8B020" wp14:editId="2CE9BB9B">
                   <wp:extent cx="3286125" cy="1876425"/>
-                  <wp:effectExtent t="0" r="0" b="0" l="0"/>
-                  <wp:docPr id="1" name="" descr="" title=""/>
+                  <wp:effectExtent l="0" t="0" r="0" b="0"/>
+                  <wp:docPr id="947043557" name="Picture 947043557"/>
                   <wp:cNvGraphicFramePr>
                     <a:graphicFrameLocks xmlns:a="http://schemas.openxmlformats.org/drawingml/2006/main" noChangeAspect="1"/>
                   </wp:cNvGraphicFramePr>
@@ -975,13 +1006,13 @@
                     <a:graphicData uri="http://schemas.openxmlformats.org/drawingml/2006/picture">
                       <pic:pic xmlns:pic="http://schemas.openxmlformats.org/drawingml/2006/picture">
                         <pic:nvPicPr>
-                          <pic:cNvPr id="0" name="" descr=""/>
+                          <pic:cNvPr id="0" name=""/>
                           <pic:cNvPicPr>
                             <a:picLocks noChangeAspect="1" noChangeArrowheads="1"/>
                           </pic:cNvPicPr>
                         </pic:nvPicPr>
                         <pic:blipFill>
-                          <a:blip r:embed="rId17" cstate="none"/>
+                          <a:blip r:embed="rId15"/>
                           <a:srcRect/>
                           <a:stretch>
                             <a:fillRect/>
@@ -1006,43 +1037,37 @@
         </w:tc>
         <w:tc>
           <w:tcPr>
-            <w:tcW w:type="dxa" w:w="5500"/>
+            <w:tcW w:w="5500" w:type="dxa"/>
             <w:tcBorders>
-              <w:top w:val="none" w:color="FFFFFF" w:sz="0"/>
-              <w:left w:val="none" w:color="FFFFFF" w:sz="0"/>
-              <w:bottom w:val="none" w:color="FFFFFF" w:sz="0"/>
-              <w:right w:val="none" w:color="FFFFFF" w:sz="0"/>
+              <w:top w:val="none" w:sz="0" w:space="0" w:color="FFFFFF"/>
+              <w:left w:val="none" w:sz="0" w:space="0" w:color="FFFFFF"/>
+              <w:bottom w:val="none" w:sz="0" w:space="0" w:color="FFFFFF"/>
+              <w:right w:val="none" w:sz="0" w:space="0" w:color="FFFFFF"/>
             </w:tcBorders>
             <w:tcMar>
-              <w:top w:type="dxa" w:w="40"/>
-              <w:left w:type="dxa" w:w="70"/>
-              <w:bottom w:type="dxa" w:w="60"/>
-              <w:right w:type="dxa" w:w="70"/>
+              <w:top w:w="40" w:type="dxa"/>
+              <w:left w:w="70" w:type="dxa"/>
+              <w:bottom w:w="60" w:type="dxa"/>
+              <w:right w:w="70" w:type="dxa"/>
             </w:tcMar>
           </w:tcPr>
           <w:p>
             <w:pPr>
-              <w:spacing w:after="90" w:line="290"/>
+              <w:spacing w:after="90" w:line="290" w:lineRule="auto"/>
             </w:pPr>
             <w:r>
               <w:rPr>
-                <w:rFonts w:ascii="Arial" w:cs="Arial" w:eastAsia="Arial" w:hAnsi="Arial"/>
                 <w:b/>
                 <w:bCs/>
                 <w:color w:val="27251F"/>
-                <w:sz w:val="21"/>
-                <w:szCs w:val="21"/>
               </w:rPr>
               <w:t xml:space="preserve">What to look at: </w:t>
             </w:r>
             <w:r>
               <w:rPr>
-                <w:rFonts w:ascii="Arial" w:cs="Arial" w:eastAsia="Arial" w:hAnsi="Arial"/>
                 <w:color w:val="27251F"/>
-                <w:sz w:val="21"/>
-                <w:szCs w:val="21"/>
               </w:rPr>
-              <w:t xml:space="preserve">the gender split of the current team, with counts and percentages.</w:t>
+              <w:t>the gender split of the current team, with counts and percentages.</w:t>
             </w:r>
           </w:p>
         </w:tc>
@@ -1052,36 +1077,31 @@
       <w:pPr>
         <w:spacing w:after="30"/>
       </w:pPr>
-      <w:r>
-        <w:rPr>
-          <w:rFonts w:ascii="Arial" w:cs="Arial" w:eastAsia="Arial" w:hAnsi="Arial"/>
-          <w:color w:val="27251F"/>
-          <w:sz w:val="21"/>
-          <w:szCs w:val="21"/>
-        </w:rPr>
-        <w:t xml:space="preserve"/>
-      </w:r>
     </w:p>
     <w:p>
       <w:pPr>
         <w:pStyle w:val="Heading2"/>
       </w:pPr>
       <w:r>
-        <w:t xml:space="preserve">Step 6 - Which stores need attention?</w:t>
+        <w:lastRenderedPageBreak/>
+        <w:t>Step 6 - Which stores need attention?</w:t>
       </w:r>
     </w:p>
     <w:p>
       <w:pPr>
         <w:keepNext/>
-        <w:spacing w:after="120" w:before="60"/>
+        <w:spacing w:before="60" w:after="120"/>
         <w:jc w:val="center"/>
       </w:pPr>
       <w:r>
+        <w:rPr>
+          <w:noProof/>
+        </w:rPr>
         <w:drawing>
-          <wp:inline distT="0" distB="0" distL="0" distR="0">
+          <wp:inline distT="0" distB="0" distL="0" distR="0" wp14:anchorId="1DCEE614" wp14:editId="255D4CA8">
             <wp:extent cx="6953250" cy="2047875"/>
-            <wp:effectExtent t="0" r="0" b="0" l="0"/>
-            <wp:docPr id="1" name="" descr="" title=""/>
+            <wp:effectExtent l="0" t="0" r="0" b="0"/>
+            <wp:docPr id="1458449584" name="Picture 1458449584"/>
             <wp:cNvGraphicFramePr>
               <a:graphicFrameLocks xmlns:a="http://schemas.openxmlformats.org/drawingml/2006/main" noChangeAspect="1"/>
             </wp:cNvGraphicFramePr>
@@ -1089,13 +1109,13 @@
               <a:graphicData uri="http://schemas.openxmlformats.org/drawingml/2006/picture">
                 <pic:pic xmlns:pic="http://schemas.openxmlformats.org/drawingml/2006/picture">
                   <pic:nvPicPr>
-                    <pic:cNvPr id="0" name="" descr=""/>
+                    <pic:cNvPr id="0" name=""/>
                     <pic:cNvPicPr>
                       <a:picLocks noChangeAspect="1" noChangeArrowheads="1"/>
                     </pic:cNvPicPr>
                   </pic:nvPicPr>
                   <pic:blipFill>
-                    <a:blip r:embed="rId18" cstate="none"/>
+                    <a:blip r:embed="rId16"/>
                     <a:srcRect/>
                     <a:stretch>
                       <a:fillRect/>
@@ -1119,52 +1139,72 @@
     </w:p>
     <w:p>
       <w:pPr>
-        <w:spacing w:after="90" w:line="290"/>
-      </w:pPr>
-      <w:r>
-        <w:rPr>
-          <w:rFonts w:ascii="Arial" w:cs="Arial" w:eastAsia="Arial" w:hAnsi="Arial"/>
+        <w:spacing w:after="90" w:line="290" w:lineRule="auto"/>
+      </w:pPr>
+      <w:r>
+        <w:rPr>
           <w:b/>
           <w:bCs/>
           <w:color w:val="27251F"/>
-          <w:sz w:val="21"/>
-          <w:szCs w:val="21"/>
         </w:rPr>
         <w:t xml:space="preserve">What to look at: </w:t>
       </w:r>
       <w:r>
         <w:rPr>
-          <w:rFonts w:ascii="Arial" w:cs="Arial" w:eastAsia="Arial" w:hAnsi="Arial"/>
-          <w:color w:val="27251F"/>
-          <w:sz w:val="21"/>
-          <w:szCs w:val="21"/>
-        </w:rPr>
-        <w:t xml:space="preserve">each store's headcount, with its gender and payroll group mix.</w:t>
-      </w:r>
-    </w:p>
-    <w:p>
-      <w:pPr>
-        <w:spacing w:after="90" w:line="290"/>
-      </w:pPr>
-      <w:r>
-        <w:rPr>
-          <w:rFonts w:ascii="Arial" w:cs="Arial" w:eastAsia="Arial" w:hAnsi="Arial"/>
+          <w:color w:val="27251F"/>
+        </w:rPr>
+        <w:t>each store's headcount, with its gender and payroll group mix.</w:t>
+      </w:r>
+    </w:p>
+    <w:p>
+      <w:pPr>
+        <w:spacing w:after="90" w:line="290" w:lineRule="auto"/>
+      </w:pPr>
+      <w:r>
+        <w:rPr>
           <w:b/>
           <w:bCs/>
           <w:color w:val="27251F"/>
-          <w:sz w:val="21"/>
-          <w:szCs w:val="21"/>
-        </w:rPr>
-        <w:t xml:space="preserve">Then decide: </w:t>
-      </w:r>
-      <w:r>
-        <w:rPr>
-          <w:rFonts w:ascii="Arial" w:cs="Arial" w:eastAsia="Arial" w:hAnsi="Arial"/>
-          <w:color w:val="27251F"/>
-          <w:sz w:val="21"/>
-          <w:szCs w:val="21"/>
-        </w:rPr>
-        <w:t xml:space="preserve">compare stores with each other. A store with a much smaller team than similar stores is worth a conversation with its manager.</w:t>
+        </w:rPr>
+        <w:t xml:space="preserve">Then </w:t>
+      </w:r>
+      <w:proofErr w:type="gramStart"/>
+      <w:r>
+        <w:rPr>
+          <w:b/>
+          <w:bCs/>
+          <w:color w:val="27251F"/>
+        </w:rPr>
+        <w:t>decide:</w:t>
+      </w:r>
+      <w:proofErr w:type="gramEnd"/>
+      <w:r>
+        <w:rPr>
+          <w:b/>
+          <w:bCs/>
+          <w:color w:val="27251F"/>
+        </w:rPr>
+        <w:t xml:space="preserve"> </w:t>
+      </w:r>
+      <w:r>
+        <w:rPr>
+          <w:color w:val="27251F"/>
+        </w:rPr>
+        <w:t xml:space="preserve">compare stores with each other. A store with a much smaller team than similar stores </w:t>
+      </w:r>
+      <w:proofErr w:type="gramStart"/>
+      <w:r>
+        <w:rPr>
+          <w:color w:val="27251F"/>
+        </w:rPr>
+        <w:t>is</w:t>
+      </w:r>
+      <w:proofErr w:type="gramEnd"/>
+      <w:r>
+        <w:rPr>
+          <w:color w:val="27251F"/>
+        </w:rPr>
+        <w:t xml:space="preserve"> worth a conversation with its manager.</w:t>
       </w:r>
     </w:p>
     <w:p>
@@ -1172,55 +1212,72 @@
         <w:pStyle w:val="Heading2"/>
       </w:pPr>
       <w:r>
-        <w:t xml:space="preserve">Step 7 - Who should you talk to first?</w:t>
+        <w:t>Step 7 - Who should you talk to first?</w:t>
       </w:r>
     </w:p>
     <w:tbl>
       <w:tblPr>
-        <w:tblW w:type="dxa" w:w="11000"/>
+        <w:tblW w:w="11000" w:type="dxa"/>
         <w:jc w:val="center"/>
         <w:tblBorders>
-          <w:top w:val="single" w:color="auto" w:sz="4"/>
-          <w:left w:val="single" w:color="auto" w:sz="4"/>
-          <w:bottom w:val="single" w:color="auto" w:sz="4"/>
-          <w:right w:val="single" w:color="auto" w:sz="4"/>
-          <w:insideH w:val="single" w:color="auto" w:sz="4"/>
-          <w:insideV w:val="single" w:color="auto" w:sz="4"/>
+          <w:top w:val="single" w:sz="4" w:space="0" w:color="auto"/>
+          <w:left w:val="single" w:sz="4" w:space="0" w:color="auto"/>
+          <w:bottom w:val="single" w:sz="4" w:space="0" w:color="auto"/>
+          <w:right w:val="single" w:sz="4" w:space="0" w:color="auto"/>
+          <w:insideH w:val="single" w:sz="4" w:space="0" w:color="auto"/>
+          <w:insideV w:val="single" w:sz="4" w:space="0" w:color="auto"/>
         </w:tblBorders>
+        <w:tblCellMar>
+          <w:left w:w="10" w:type="dxa"/>
+          <w:right w:w="10" w:type="dxa"/>
+        </w:tblCellMar>
+        <w:tblLook w:val="04A0" w:firstRow="1" w:lastRow="0" w:firstColumn="1" w:lastColumn="0" w:noHBand="0" w:noVBand="1"/>
       </w:tblPr>
       <w:tblGrid>
         <w:gridCol w:w="5500"/>
         <w:gridCol w:w="5500"/>
       </w:tblGrid>
       <w:tr>
+        <w:tblPrEx>
+          <w:tblCellMar>
+            <w:top w:w="0" w:type="dxa"/>
+            <w:bottom w:w="0" w:type="dxa"/>
+          </w:tblCellMar>
+        </w:tblPrEx>
+        <w:trPr>
+          <w:jc w:val="center"/>
+        </w:trPr>
         <w:tc>
           <w:tcPr>
-            <w:tcW w:type="dxa" w:w="5500"/>
+            <w:tcW w:w="5500" w:type="dxa"/>
             <w:tcBorders>
-              <w:top w:val="none" w:color="FFFFFF" w:sz="0"/>
-              <w:left w:val="none" w:color="FFFFFF" w:sz="0"/>
-              <w:bottom w:val="none" w:color="FFFFFF" w:sz="0"/>
-              <w:right w:val="none" w:color="FFFFFF" w:sz="0"/>
+              <w:top w:val="none" w:sz="0" w:space="0" w:color="FFFFFF"/>
+              <w:left w:val="none" w:sz="0" w:space="0" w:color="FFFFFF"/>
+              <w:bottom w:val="none" w:sz="0" w:space="0" w:color="FFFFFF"/>
+              <w:right w:val="none" w:sz="0" w:space="0" w:color="FFFFFF"/>
             </w:tcBorders>
             <w:tcMar>
-              <w:top w:type="dxa" w:w="40"/>
-              <w:left w:type="dxa" w:w="70"/>
-              <w:bottom w:type="dxa" w:w="60"/>
-              <w:right w:type="dxa" w:w="70"/>
+              <w:top w:w="40" w:type="dxa"/>
+              <w:left w:w="70" w:type="dxa"/>
+              <w:bottom w:w="60" w:type="dxa"/>
+              <w:right w:w="70" w:type="dxa"/>
             </w:tcMar>
           </w:tcPr>
           <w:p>
             <w:pPr>
               <w:keepNext/>
-              <w:spacing w:after="120" w:before="60"/>
+              <w:spacing w:before="60" w:after="120"/>
               <w:jc w:val="center"/>
             </w:pPr>
             <w:r>
+              <w:rPr>
+                <w:noProof/>
+              </w:rPr>
               <w:drawing>
-                <wp:inline distT="0" distB="0" distL="0" distR="0">
+                <wp:inline distT="0" distB="0" distL="0" distR="0" wp14:anchorId="07529623" wp14:editId="06566CAC">
                   <wp:extent cx="3286125" cy="3009900"/>
-                  <wp:effectExtent t="0" r="0" b="0" l="0"/>
-                  <wp:docPr id="1" name="" descr="" title=""/>
+                  <wp:effectExtent l="0" t="0" r="0" b="0"/>
+                  <wp:docPr id="1750007170" name="Picture 1750007170"/>
                   <wp:cNvGraphicFramePr>
                     <a:graphicFrameLocks xmlns:a="http://schemas.openxmlformats.org/drawingml/2006/main" noChangeAspect="1"/>
                   </wp:cNvGraphicFramePr>
@@ -1228,13 +1285,13 @@
                     <a:graphicData uri="http://schemas.openxmlformats.org/drawingml/2006/picture">
                       <pic:pic xmlns:pic="http://schemas.openxmlformats.org/drawingml/2006/picture">
                         <pic:nvPicPr>
-                          <pic:cNvPr id="0" name="" descr=""/>
+                          <pic:cNvPr id="0" name=""/>
                           <pic:cNvPicPr>
                             <a:picLocks noChangeAspect="1" noChangeArrowheads="1"/>
                           </pic:cNvPicPr>
                         </pic:nvPicPr>
                         <pic:blipFill>
-                          <a:blip r:embed="rId19" cstate="none"/>
+                          <a:blip r:embed="rId17"/>
                           <a:srcRect/>
                           <a:stretch>
                             <a:fillRect/>
@@ -1259,32 +1316,35 @@
         </w:tc>
         <w:tc>
           <w:tcPr>
-            <w:tcW w:type="dxa" w:w="5500"/>
+            <w:tcW w:w="5500" w:type="dxa"/>
             <w:tcBorders>
-              <w:top w:val="none" w:color="FFFFFF" w:sz="0"/>
-              <w:left w:val="none" w:color="FFFFFF" w:sz="0"/>
-              <w:bottom w:val="none" w:color="FFFFFF" w:sz="0"/>
-              <w:right w:val="none" w:color="FFFFFF" w:sz="0"/>
+              <w:top w:val="none" w:sz="0" w:space="0" w:color="FFFFFF"/>
+              <w:left w:val="none" w:sz="0" w:space="0" w:color="FFFFFF"/>
+              <w:bottom w:val="none" w:sz="0" w:space="0" w:color="FFFFFF"/>
+              <w:right w:val="none" w:sz="0" w:space="0" w:color="FFFFFF"/>
             </w:tcBorders>
             <w:tcMar>
-              <w:top w:type="dxa" w:w="40"/>
-              <w:left w:type="dxa" w:w="70"/>
-              <w:bottom w:type="dxa" w:w="60"/>
-              <w:right w:type="dxa" w:w="70"/>
+              <w:top w:w="40" w:type="dxa"/>
+              <w:left w:w="70" w:type="dxa"/>
+              <w:bottom w:w="60" w:type="dxa"/>
+              <w:right w:w="70" w:type="dxa"/>
             </w:tcMar>
           </w:tcPr>
           <w:p>
             <w:pPr>
               <w:keepNext/>
-              <w:spacing w:after="120" w:before="60"/>
+              <w:spacing w:before="60" w:after="120"/>
               <w:jc w:val="center"/>
             </w:pPr>
             <w:r>
+              <w:rPr>
+                <w:noProof/>
+              </w:rPr>
               <w:drawing>
-                <wp:inline distT="0" distB="0" distL="0" distR="0">
+                <wp:inline distT="0" distB="0" distL="0" distR="0" wp14:anchorId="3C93BF8D" wp14:editId="0B285F7D">
                   <wp:extent cx="3286125" cy="914400"/>
-                  <wp:effectExtent t="0" r="0" b="0" l="0"/>
-                  <wp:docPr id="1" name="" descr="" title=""/>
+                  <wp:effectExtent l="0" t="0" r="0" b="0"/>
+                  <wp:docPr id="1943905561" name="Picture 1943905561"/>
                   <wp:cNvGraphicFramePr>
                     <a:graphicFrameLocks xmlns:a="http://schemas.openxmlformats.org/drawingml/2006/main" noChangeAspect="1"/>
                   </wp:cNvGraphicFramePr>
@@ -1292,13 +1352,13 @@
                     <a:graphicData uri="http://schemas.openxmlformats.org/drawingml/2006/picture">
                       <pic:pic xmlns:pic="http://schemas.openxmlformats.org/drawingml/2006/picture">
                         <pic:nvPicPr>
-                          <pic:cNvPr id="0" name="" descr=""/>
+                          <pic:cNvPr id="0" name=""/>
                           <pic:cNvPicPr>
                             <a:picLocks noChangeAspect="1" noChangeArrowheads="1"/>
                           </pic:cNvPicPr>
                         </pic:nvPicPr>
                         <pic:blipFill>
-                          <a:blip r:embed="rId20" cstate="none"/>
+                          <a:blip r:embed="rId18"/>
                           <a:srcRect/>
                           <a:stretch>
                             <a:fillRect/>
@@ -1323,15 +1383,18 @@
           <w:p>
             <w:pPr>
               <w:keepNext/>
-              <w:spacing w:after="120" w:before="60"/>
+              <w:spacing w:before="60" w:after="120"/>
               <w:jc w:val="center"/>
             </w:pPr>
             <w:r>
+              <w:rPr>
+                <w:noProof/>
+              </w:rPr>
               <w:drawing>
-                <wp:inline distT="0" distB="0" distL="0" distR="0">
+                <wp:inline distT="0" distB="0" distL="0" distR="0" wp14:anchorId="26E3FB07" wp14:editId="1322135D">
                   <wp:extent cx="3286125" cy="914400"/>
-                  <wp:effectExtent t="0" r="0" b="0" l="0"/>
-                  <wp:docPr id="1" name="" descr="" title=""/>
+                  <wp:effectExtent l="0" t="0" r="0" b="0"/>
+                  <wp:docPr id="462175265" name="Picture 462175265"/>
                   <wp:cNvGraphicFramePr>
                     <a:graphicFrameLocks xmlns:a="http://schemas.openxmlformats.org/drawingml/2006/main" noChangeAspect="1"/>
                   </wp:cNvGraphicFramePr>
@@ -1339,13 +1402,13 @@
                     <a:graphicData uri="http://schemas.openxmlformats.org/drawingml/2006/picture">
                       <pic:pic xmlns:pic="http://schemas.openxmlformats.org/drawingml/2006/picture">
                         <pic:nvPicPr>
-                          <pic:cNvPr id="0" name="" descr=""/>
+                          <pic:cNvPr id="0" name=""/>
                           <pic:cNvPicPr>
                             <a:picLocks noChangeAspect="1" noChangeArrowheads="1"/>
                           </pic:cNvPicPr>
                         </pic:nvPicPr>
                         <pic:blipFill>
-                          <a:blip r:embed="rId21" cstate="none"/>
+                          <a:blip r:embed="rId19"/>
                           <a:srcRect/>
                           <a:stretch>
                             <a:fillRect/>
@@ -1370,15 +1433,18 @@
           <w:p>
             <w:pPr>
               <w:keepNext/>
-              <w:spacing w:after="120" w:before="60"/>
+              <w:spacing w:before="60" w:after="120"/>
               <w:jc w:val="center"/>
             </w:pPr>
             <w:r>
+              <w:rPr>
+                <w:noProof/>
+              </w:rPr>
               <w:drawing>
-                <wp:inline distT="0" distB="0" distL="0" distR="0">
+                <wp:inline distT="0" distB="0" distL="0" distR="0" wp14:anchorId="1D4D85C5" wp14:editId="421185C5">
                   <wp:extent cx="3286125" cy="1095375"/>
-                  <wp:effectExtent t="0" r="0" b="0" l="0"/>
-                  <wp:docPr id="1" name="" descr="" title=""/>
+                  <wp:effectExtent l="0" t="0" r="0" b="0"/>
+                  <wp:docPr id="1564902780" name="Picture 1564902780"/>
                   <wp:cNvGraphicFramePr>
                     <a:graphicFrameLocks xmlns:a="http://schemas.openxmlformats.org/drawingml/2006/main" noChangeAspect="1"/>
                   </wp:cNvGraphicFramePr>
@@ -1386,13 +1452,13 @@
                     <a:graphicData uri="http://schemas.openxmlformats.org/drawingml/2006/picture">
                       <pic:pic xmlns:pic="http://schemas.openxmlformats.org/drawingml/2006/picture">
                         <pic:nvPicPr>
-                          <pic:cNvPr id="0" name="" descr=""/>
+                          <pic:cNvPr id="0" name=""/>
                           <pic:cNvPicPr>
                             <a:picLocks noChangeAspect="1" noChangeArrowheads="1"/>
                           </pic:cNvPicPr>
                         </pic:nvPicPr>
                         <pic:blipFill>
-                          <a:blip r:embed="rId22" cstate="none"/>
+                          <a:blip r:embed="rId20"/>
                           <a:srcRect/>
                           <a:stretch>
                             <a:fillRect/>
@@ -1419,83 +1485,102 @@
     </w:tbl>
     <w:p>
       <w:pPr>
-        <w:spacing w:after="90" w:line="290"/>
-      </w:pPr>
-      <w:r>
-        <w:rPr>
-          <w:rFonts w:ascii="Arial" w:cs="Arial" w:eastAsia="Arial" w:hAnsi="Arial"/>
+        <w:spacing w:after="90" w:line="290" w:lineRule="auto"/>
+      </w:pPr>
+      <w:r>
+        <w:rPr>
           <w:b/>
           <w:bCs/>
           <w:color w:val="27251F"/>
-          <w:sz w:val="21"/>
-          <w:szCs w:val="21"/>
         </w:rPr>
         <w:t xml:space="preserve">What to look at: </w:t>
       </w:r>
       <w:r>
         <w:rPr>
-          <w:rFonts w:ascii="Arial" w:cs="Arial" w:eastAsia="Arial" w:hAnsi="Arial"/>
-          <w:color w:val="27251F"/>
-          <w:sz w:val="21"/>
-          <w:szCs w:val="21"/>
-        </w:rPr>
-        <w:t xml:space="preserve">Turnover% next to each person's headcount. It is weighted across all their stores, and the coloured badge highlights the higher rates.</w:t>
-      </w:r>
-    </w:p>
-    <w:p>
-      <w:pPr>
-        <w:spacing w:after="90" w:line="290"/>
-      </w:pPr>
-      <w:r>
-        <w:rPr>
-          <w:rFonts w:ascii="Arial" w:cs="Arial" w:eastAsia="Arial" w:hAnsi="Arial"/>
+          <w:color w:val="27251F"/>
+        </w:rPr>
+        <w:t xml:space="preserve">Turnover% next to each person's headcount. It is </w:t>
+      </w:r>
+      <w:proofErr w:type="gramStart"/>
+      <w:r>
+        <w:rPr>
+          <w:color w:val="27251F"/>
+        </w:rPr>
+        <w:t>weighted</w:t>
+      </w:r>
+      <w:proofErr w:type="gramEnd"/>
+      <w:r>
+        <w:rPr>
+          <w:color w:val="27251F"/>
+        </w:rPr>
+        <w:t xml:space="preserve"> across all their stores, and the </w:t>
+      </w:r>
+      <w:r>
+        <w:rPr>
+          <w:color w:val="27251F"/>
+        </w:rPr>
+        <w:t>colored</w:t>
+      </w:r>
+      <w:r>
+        <w:rPr>
+          <w:color w:val="27251F"/>
+        </w:rPr>
+        <w:t xml:space="preserve"> badge highlights the higher rates.</w:t>
+      </w:r>
+    </w:p>
+    <w:p>
+      <w:pPr>
+        <w:spacing w:after="90" w:line="290" w:lineRule="auto"/>
+      </w:pPr>
+      <w:r>
+        <w:rPr>
           <w:b/>
           <w:bCs/>
           <w:color w:val="27251F"/>
-          <w:sz w:val="21"/>
-          <w:szCs w:val="21"/>
-        </w:rPr>
-        <w:t xml:space="preserve">Then decide: </w:t>
-      </w:r>
-      <w:r>
-        <w:rPr>
-          <w:rFonts w:ascii="Arial" w:cs="Arial" w:eastAsia="Arial" w:hAnsi="Arial"/>
-          <w:color w:val="27251F"/>
-          <w:sz w:val="21"/>
-          <w:szCs w:val="21"/>
-        </w:rPr>
-        <w:t xml:space="preserve">start your conversations with the people whose Turnover% is highest, then filter the page by that person to see which of their stores drives it.</w:t>
+        </w:rPr>
+        <w:t xml:space="preserve">Then </w:t>
+      </w:r>
+      <w:proofErr w:type="gramStart"/>
+      <w:r>
+        <w:rPr>
+          <w:b/>
+          <w:bCs/>
+          <w:color w:val="27251F"/>
+        </w:rPr>
+        <w:t>decide:</w:t>
+      </w:r>
+      <w:proofErr w:type="gramEnd"/>
+      <w:r>
+        <w:rPr>
+          <w:b/>
+          <w:bCs/>
+          <w:color w:val="27251F"/>
+        </w:rPr>
+        <w:t xml:space="preserve"> </w:t>
+      </w:r>
+      <w:r>
+        <w:rPr>
+          <w:color w:val="27251F"/>
+        </w:rPr>
+        <w:t>start your conversations with the people whose Turnover% is highest, then filter the page by that person to see which of their stores drives it.</w:t>
       </w:r>
     </w:p>
     <w:sectPr>
-      <w:headerReference w:type="default" r:id="rId7"/>
-      <w:footerReference w:type="default" r:id="rId8"/>
-      <w:pgSz w:w="11906" w:h="16838" w:orient="portrait"/>
-      <w:pgMar w:top="1500" w:right="432" w:bottom="994" w:left="432" w:header="706" w:footer="706" w:gutter="0"/>
-      <w:pgNumType/>
+      <w:headerReference w:type="default" r:id="rId21"/>
+      <w:footerReference w:type="default" r:id="rId22"/>
+      <w:pgSz w:w="11906" w:h="16838"/>
+      <w:pgMar w:top="1710" w:right="432" w:bottom="994" w:left="432" w:header="706" w:footer="706" w:gutter="0"/>
+      <w:cols w:space="720"/>
       <w:docGrid w:linePitch="360"/>
     </w:sectPr>
   </w:body>
 </w:document>
 </file>
 
-<file path=word/comments.xml><?xml version="1.0" encoding="utf-8"?>
-<w:comments xmlns:cx="http://schemas.microsoft.com/office/drawing/2014/chartex" xmlns:cx1="http://schemas.microsoft.com/office/drawing/2015/9/8/chartex" xmlns:cx2="http://schemas.microsoft.com/office/drawing/2015/10/21/chartex" xmlns:cx3="http://schemas.microsoft.com/office/drawing/2016/5/9/chartex" xmlns:cx4="http://schemas.microsoft.com/office/drawing/2016/5/10/chartex" xmlns:cx5="http://schemas.microsoft.com/office/drawing/2016/5/11/chartex" xmlns:cx6="http://schemas.microsoft.com/office/drawing/2016/5/12/chartex" xmlns:cx7="http://schemas.microsoft.com/office/drawing/2016/5/13/chartex" xmlns:cx8="http://schemas.microsoft.com/office/drawing/2016/5/14/chartex" xmlns:mc="http://schemas.openxmlformats.org/markup-compatibility/2006" xmlns:aink="http://schemas.microsoft.com/office/drawing/2016/ink" xmlns:am3d="http://schemas.microsoft.com/office/drawing/2017/model3d" xmlns:o="urn:schemas-microsoft-com:office:office" xmlns:r="http://schemas.openxmlformats.org/officeDocument/2006/relationships" xmlns:m="http://schemas.openxmlformats.org/officeDocument/2006/math" xmlns:v="urn:schemas-microsoft-com:vml" xmlns:wp14="http://schemas.microsoft.com/office/word/2010/wordprocessingDrawing" xmlns:wp="http://schemas.openxmlformats.org/drawingml/2006/wordprocessingDrawing" xmlns:w10="urn:schemas-microsoft-com:office:word" xmlns:w="http://schemas.openxmlformats.org/wordprocessingml/2006/main" xmlns:w14="http://schemas.microsoft.com/office/word/2010/wordml" xmlns:w15="http://schemas.microsoft.com/office/word/2012/wordml" xmlns:w16cex="http://schemas.microsoft.com/office/word/2018/wordml/cex" xmlns:w16cid="http://schemas.microsoft.com/office/word/2016/wordml/cid" xmlns:w16="http://schemas.microsoft.com/office/word/2018/wordml" xmlns:w16sdtdh="http://schemas.microsoft.com/office/word/2020/wordml/sdtdatahash" xmlns:w16se="http://schemas.microsoft.com/office/word/2015/wordml/symex" xmlns:wpg="http://schemas.microsoft.com/office/word/2010/wordprocessingGroup" xmlns:wpi="http://schemas.microsoft.com/office/word/2010/wordprocessingInk" xmlns:wne="http://schemas.microsoft.com/office/word/2006/wordml" xmlns:wps="http://schemas.microsoft.com/office/word/2010/wordprocessingShape"/>
-</file>
-
 <file path=word/endnotes.xml><?xml version="1.0" encoding="utf-8"?>
-<w:endnotes xmlns:wpc="http://schemas.microsoft.com/office/word/2010/wordprocessingCanvas" xmlns:mc="http://schemas.openxmlformats.org/markup-compatibility/2006" xmlns:o="urn:schemas-microsoft-com:office:office" xmlns:r="http://schemas.openxmlformats.org/officeDocument/2006/relationships" xmlns:m="http://schemas.openxmlformats.org/officeDocument/2006/math" xmlns:v="urn:schemas-microsoft-com:vml" xmlns:wp14="http://schemas.microsoft.com/office/word/2010/wordprocessingDrawing" xmlns:wp="http://schemas.openxmlformats.org/drawingml/2006/wordprocessingDrawing" xmlns:w10="urn:schemas-microsoft-com:office:word" xmlns:w="http://schemas.openxmlformats.org/wordprocessingml/2006/main" xmlns:w14="http://schemas.microsoft.com/office/word/2010/wordml" xmlns:w15="http://schemas.microsoft.com/office/word/2012/wordml" xmlns:wpg="http://schemas.microsoft.com/office/word/2010/wordprocessingGroup" xmlns:wpi="http://schemas.microsoft.com/office/word/2010/wordprocessingInk" xmlns:wne="http://schemas.microsoft.com/office/word/2006/wordml" xmlns:wps="http://schemas.microsoft.com/office/word/2010/wordprocessingShape" mc:Ignorable="w14 w15 wp14">
+<w:endnotes xmlns:wpc="http://schemas.microsoft.com/office/word/2010/wordprocessingCanvas" xmlns:cx="http://schemas.microsoft.com/office/drawing/2014/chartex" xmlns:cx1="http://schemas.microsoft.com/office/drawing/2015/9/8/chartex" xmlns:cx2="http://schemas.microsoft.com/office/drawing/2015/10/21/chartex" xmlns:cx3="http://schemas.microsoft.com/office/drawing/2016/5/9/chartex" xmlns:cx4="http://schemas.microsoft.com/office/drawing/2016/5/10/chartex" xmlns:cx5="http://schemas.microsoft.com/office/drawing/2016/5/11/chartex" xmlns:cx6="http://schemas.microsoft.com/office/drawing/2016/5/12/chartex" xmlns:cx7="http://schemas.microsoft.com/office/drawing/2016/5/13/chartex" xmlns:cx8="http://schemas.microsoft.com/office/drawing/2016/5/14/chartex" xmlns:mc="http://schemas.openxmlformats.org/markup-compatibility/2006" xmlns:aink="http://schemas.microsoft.com/office/drawing/2016/ink" xmlns:am3d="http://schemas.microsoft.com/office/drawing/2017/model3d" xmlns:o="urn:schemas-microsoft-com:office:office" xmlns:oel="http://schemas.microsoft.com/office/2019/extlst" xmlns:r="http://schemas.openxmlformats.org/officeDocument/2006/relationships" xmlns:m="http://schemas.openxmlformats.org/officeDocument/2006/math" xmlns:v="urn:schemas-microsoft-com:vml" xmlns:wp14="http://schemas.microsoft.com/office/word/2010/wordprocessingDrawing" xmlns:wp="http://schemas.openxmlformats.org/drawingml/2006/wordprocessingDrawing" xmlns:w10="urn:schemas-microsoft-com:office:word" xmlns:w="http://schemas.openxmlformats.org/wordprocessingml/2006/main" xmlns:w14="http://schemas.microsoft.com/office/word/2010/wordml" xmlns:w15="http://schemas.microsoft.com/office/word/2012/wordml" xmlns:w16cex="http://schemas.microsoft.com/office/word/2018/wordml/cex" xmlns:w16cid="http://schemas.microsoft.com/office/word/2016/wordml/cid" xmlns:w16="http://schemas.microsoft.com/office/word/2018/wordml" xmlns:w16du="http://schemas.microsoft.com/office/word/2023/wordml/word16du" xmlns:w16sdtdh="http://schemas.microsoft.com/office/word/2020/wordml/sdtdatahash" xmlns:w16sdtfl="http://schemas.microsoft.com/office/word/2024/wordml/sdtformatlock" xmlns:w16se="http://schemas.microsoft.com/office/word/2015/wordml/symex" xmlns:wpg="http://schemas.microsoft.com/office/word/2010/wordprocessingGroup" xmlns:wpi="http://schemas.microsoft.com/office/word/2010/wordprocessingInk" xmlns:wne="http://schemas.microsoft.com/office/word/2006/wordml" xmlns:wps="http://schemas.microsoft.com/office/word/2010/wordprocessingShape" mc:Ignorable="w14 w15 w16se w16cid w16 w16cex w16sdtdh w16sdtfl w16du wp14">
   <w:endnote w:type="separator" w:id="-1">
     <w:p>
-      <w:pPr>
-        <w:spacing w:after="0" w:line="240" w:lineRule="auto"/>
-      </w:pPr>
-      <w:r>
-        <w:rPr>
-          <w:rStyle w:val="EndnoteReference"/>
-        </w:rPr>
-        <w:endnoteRef/>
-      </w:r>
       <w:r>
         <w:separator/>
       </w:r>
@@ -1503,15 +1588,6 @@
   </w:endnote>
   <w:endnote w:type="continuationSeparator" w:id="0">
     <w:p>
-      <w:pPr>
-        <w:spacing w:after="0" w:line="240" w:lineRule="auto"/>
-      </w:pPr>
-      <w:r>
-        <w:rPr>
-          <w:rStyle w:val="EndnoteReference"/>
-        </w:rPr>
-        <w:endnoteRef/>
-      </w:r>
       <w:r>
         <w:continuationSeparator/>
       </w:r>
@@ -1521,14 +1597,13 @@
 </file>
 
 <file path=word/footer1.xml><?xml version="1.0" encoding="utf-8"?>
-<w:ftr xmlns:wpc="http://schemas.microsoft.com/office/word/2010/wordprocessingCanvas" xmlns:mc="http://schemas.openxmlformats.org/markup-compatibility/2006" xmlns:o="urn:schemas-microsoft-com:office:office" xmlns:r="http://schemas.openxmlformats.org/officeDocument/2006/relationships" xmlns:m="http://schemas.openxmlformats.org/officeDocument/2006/math" xmlns:v="urn:schemas-microsoft-com:vml" xmlns:wp14="http://schemas.microsoft.com/office/word/2010/wordprocessingDrawing" xmlns:wp="http://schemas.openxmlformats.org/drawingml/2006/wordprocessingDrawing" xmlns:w10="urn:schemas-microsoft-com:office:word" xmlns:w="http://schemas.openxmlformats.org/wordprocessingml/2006/main" xmlns:w14="http://schemas.microsoft.com/office/word/2010/wordml" xmlns:w15="http://schemas.microsoft.com/office/word/2012/wordml" xmlns:wpg="http://schemas.microsoft.com/office/word/2010/wordprocessingGroup" xmlns:wpi="http://schemas.microsoft.com/office/word/2010/wordprocessingInk" xmlns:wne="http://schemas.microsoft.com/office/word/2006/wordml" xmlns:wps="http://schemas.microsoft.com/office/word/2010/wordprocessingShape">
+<w:ftr xmlns:wpc="http://schemas.microsoft.com/office/word/2010/wordprocessingCanvas" xmlns:cx="http://schemas.microsoft.com/office/drawing/2014/chartex" xmlns:cx1="http://schemas.microsoft.com/office/drawing/2015/9/8/chartex" xmlns:cx2="http://schemas.microsoft.com/office/drawing/2015/10/21/chartex" xmlns:cx3="http://schemas.microsoft.com/office/drawing/2016/5/9/chartex" xmlns:cx4="http://schemas.microsoft.com/office/drawing/2016/5/10/chartex" xmlns:cx5="http://schemas.microsoft.com/office/drawing/2016/5/11/chartex" xmlns:cx6="http://schemas.microsoft.com/office/drawing/2016/5/12/chartex" xmlns:cx7="http://schemas.microsoft.com/office/drawing/2016/5/13/chartex" xmlns:cx8="http://schemas.microsoft.com/office/drawing/2016/5/14/chartex" xmlns:mc="http://schemas.openxmlformats.org/markup-compatibility/2006" xmlns:aink="http://schemas.microsoft.com/office/drawing/2016/ink" xmlns:am3d="http://schemas.microsoft.com/office/drawing/2017/model3d" xmlns:o="urn:schemas-microsoft-com:office:office" xmlns:oel="http://schemas.microsoft.com/office/2019/extlst" xmlns:r="http://schemas.openxmlformats.org/officeDocument/2006/relationships" xmlns:m="http://schemas.openxmlformats.org/officeDocument/2006/math" xmlns:v="urn:schemas-microsoft-com:vml" xmlns:wp14="http://schemas.microsoft.com/office/word/2010/wordprocessingDrawing" xmlns:wp="http://schemas.openxmlformats.org/drawingml/2006/wordprocessingDrawing" xmlns:w10="urn:schemas-microsoft-com:office:word" xmlns:w="http://schemas.openxmlformats.org/wordprocessingml/2006/main" xmlns:w14="http://schemas.microsoft.com/office/word/2010/wordml" xmlns:w15="http://schemas.microsoft.com/office/word/2012/wordml" xmlns:w16cex="http://schemas.microsoft.com/office/word/2018/wordml/cex" xmlns:w16cid="http://schemas.microsoft.com/office/word/2016/wordml/cid" xmlns:w16="http://schemas.microsoft.com/office/word/2018/wordml" xmlns:w16du="http://schemas.microsoft.com/office/word/2023/wordml/word16du" xmlns:w16sdtdh="http://schemas.microsoft.com/office/word/2020/wordml/sdtdatahash" xmlns:w16sdtfl="http://schemas.microsoft.com/office/word/2024/wordml/sdtformatlock" xmlns:w16se="http://schemas.microsoft.com/office/word/2015/wordml/symex" xmlns:wpg="http://schemas.microsoft.com/office/word/2010/wordprocessingGroup" xmlns:wpi="http://schemas.microsoft.com/office/word/2010/wordprocessingInk" xmlns:wne="http://schemas.microsoft.com/office/word/2006/wordml" xmlns:wps="http://schemas.microsoft.com/office/word/2010/wordprocessingShape" mc:Ignorable="w14 w15 w16se w16cid w16 w16cex w16sdtdh w16sdtfl w16du wp14">
   <w:p>
     <w:pPr>
       <w:jc w:val="center"/>
     </w:pPr>
     <w:r>
       <w:rPr>
-        <w:rFonts w:ascii="Arial" w:cs="Arial" w:eastAsia="Arial" w:hAnsi="Arial"/>
         <w:color w:val="666666"/>
         <w:sz w:val="16"/>
         <w:szCs w:val="16"/>
@@ -1537,14 +1612,43 @@
     </w:r>
     <w:r>
       <w:rPr>
-        <w:rFonts w:ascii="Arial" w:cs="Arial" w:eastAsia="Arial" w:hAnsi="Arial"/>
         <w:color w:val="666666"/>
         <w:sz w:val="16"/>
         <w:szCs w:val="16"/>
       </w:rPr>
       <w:fldChar w:fldCharType="begin"/>
-      <w:instrText xml:space="preserve">PAGE</w:instrText>
+    </w:r>
+    <w:r>
+      <w:rPr>
+        <w:color w:val="666666"/>
+        <w:sz w:val="16"/>
+        <w:szCs w:val="16"/>
+      </w:rPr>
+      <w:instrText>PAGE</w:instrText>
+    </w:r>
+    <w:r>
+      <w:rPr>
+        <w:color w:val="666666"/>
+        <w:sz w:val="16"/>
+        <w:szCs w:val="16"/>
+      </w:rPr>
       <w:fldChar w:fldCharType="separate"/>
+    </w:r>
+    <w:r>
+      <w:rPr>
+        <w:noProof/>
+        <w:color w:val="666666"/>
+        <w:sz w:val="16"/>
+        <w:szCs w:val="16"/>
+      </w:rPr>
+      <w:t>1</w:t>
+    </w:r>
+    <w:r>
+      <w:rPr>
+        <w:color w:val="666666"/>
+        <w:sz w:val="16"/>
+        <w:szCs w:val="16"/>
+      </w:rPr>
       <w:fldChar w:fldCharType="end"/>
     </w:r>
   </w:p>
@@ -1552,18 +1656,9 @@
 </file>
 
 <file path=word/footnotes.xml><?xml version="1.0" encoding="utf-8"?>
-<w:footnotes xmlns:wpc="http://schemas.microsoft.com/office/word/2010/wordprocessingCanvas" xmlns:mc="http://schemas.openxmlformats.org/markup-compatibility/2006" xmlns:o="urn:schemas-microsoft-com:office:office" xmlns:r="http://schemas.openxmlformats.org/officeDocument/2006/relationships" xmlns:m="http://schemas.openxmlformats.org/officeDocument/2006/math" xmlns:v="urn:schemas-microsoft-com:vml" xmlns:wp14="http://schemas.microsoft.com/office/word/2010/wordprocessingDrawing" xmlns:wp="http://schemas.openxmlformats.org/drawingml/2006/wordprocessingDrawing" xmlns:w10="urn:schemas-microsoft-com:office:word" xmlns:w="http://schemas.openxmlformats.org/wordprocessingml/2006/main" xmlns:w14="http://schemas.microsoft.com/office/word/2010/wordml" xmlns:w15="http://schemas.microsoft.com/office/word/2012/wordml" xmlns:wpg="http://schemas.microsoft.com/office/word/2010/wordprocessingGroup" xmlns:wpi="http://schemas.microsoft.com/office/word/2010/wordprocessingInk" xmlns:wne="http://schemas.microsoft.com/office/word/2006/wordml" xmlns:wps="http://schemas.microsoft.com/office/word/2010/wordprocessingShape" mc:Ignorable="w14 w15 wp14">
+<w:footnotes xmlns:wpc="http://schemas.microsoft.com/office/word/2010/wordprocessingCanvas" xmlns:cx="http://schemas.microsoft.com/office/drawing/2014/chartex" xmlns:cx1="http://schemas.microsoft.com/office/drawing/2015/9/8/chartex" xmlns:cx2="http://schemas.microsoft.com/office/drawing/2015/10/21/chartex" xmlns:cx3="http://schemas.microsoft.com/office/drawing/2016/5/9/chartex" xmlns:cx4="http://schemas.microsoft.com/office/drawing/2016/5/10/chartex" xmlns:cx5="http://schemas.microsoft.com/office/drawing/2016/5/11/chartex" xmlns:cx6="http://schemas.microsoft.com/office/drawing/2016/5/12/chartex" xmlns:cx7="http://schemas.microsoft.com/office/drawing/2016/5/13/chartex" xmlns:cx8="http://schemas.microsoft.com/office/drawing/2016/5/14/chartex" xmlns:mc="http://schemas.openxmlformats.org/markup-compatibility/2006" xmlns:aink="http://schemas.microsoft.com/office/drawing/2016/ink" xmlns:am3d="http://schemas.microsoft.com/office/drawing/2017/model3d" xmlns:o="urn:schemas-microsoft-com:office:office" xmlns:oel="http://schemas.microsoft.com/office/2019/extlst" xmlns:r="http://schemas.openxmlformats.org/officeDocument/2006/relationships" xmlns:m="http://schemas.openxmlformats.org/officeDocument/2006/math" xmlns:v="urn:schemas-microsoft-com:vml" xmlns:wp14="http://schemas.microsoft.com/office/word/2010/wordprocessingDrawing" xmlns:wp="http://schemas.openxmlformats.org/drawingml/2006/wordprocessingDrawing" xmlns:w10="urn:schemas-microsoft-com:office:word" xmlns:w="http://schemas.openxmlformats.org/wordprocessingml/2006/main" xmlns:w14="http://schemas.microsoft.com/office/word/2010/wordml" xmlns:w15="http://schemas.microsoft.com/office/word/2012/wordml" xmlns:w16cex="http://schemas.microsoft.com/office/word/2018/wordml/cex" xmlns:w16cid="http://schemas.microsoft.com/office/word/2016/wordml/cid" xmlns:w16="http://schemas.microsoft.com/office/word/2018/wordml" xmlns:w16du="http://schemas.microsoft.com/office/word/2023/wordml/word16du" xmlns:w16sdtdh="http://schemas.microsoft.com/office/word/2020/wordml/sdtdatahash" xmlns:w16sdtfl="http://schemas.microsoft.com/office/word/2024/wordml/sdtformatlock" xmlns:w16se="http://schemas.microsoft.com/office/word/2015/wordml/symex" xmlns:wpg="http://schemas.microsoft.com/office/word/2010/wordprocessingGroup" xmlns:wpi="http://schemas.microsoft.com/office/word/2010/wordprocessingInk" xmlns:wne="http://schemas.microsoft.com/office/word/2006/wordml" xmlns:wps="http://schemas.microsoft.com/office/word/2010/wordprocessingShape" mc:Ignorable="w14 w15 w16se w16cid w16 w16cex w16sdtdh w16sdtfl w16du wp14">
   <w:footnote w:type="separator" w:id="-1">
     <w:p>
-      <w:pPr>
-        <w:spacing w:after="0" w:line="240" w:lineRule="auto"/>
-      </w:pPr>
-      <w:r>
-        <w:rPr>
-          <w:rStyle w:val="FootnoteReference"/>
-        </w:rPr>
-        <w:footnoteRef/>
-      </w:r>
       <w:r>
         <w:separator/>
       </w:r>
@@ -1571,15 +1666,6 @@
   </w:footnote>
   <w:footnote w:type="continuationSeparator" w:id="0">
     <w:p>
-      <w:pPr>
-        <w:spacing w:after="0" w:line="240" w:lineRule="auto"/>
-      </w:pPr>
-      <w:r>
-        <w:rPr>
-          <w:rStyle w:val="FootnoteReference"/>
-        </w:rPr>
-        <w:footnoteRef/>
-      </w:r>
       <w:r>
         <w:continuationSeparator/>
       </w:r>
@@ -1589,19 +1675,22 @@
 </file>
 
 <file path=word/header1.xml><?xml version="1.0" encoding="utf-8"?>
-<w:hdr xmlns:wpc="http://schemas.microsoft.com/office/word/2010/wordprocessingCanvas" xmlns:mc="http://schemas.openxmlformats.org/markup-compatibility/2006" xmlns:o="urn:schemas-microsoft-com:office:office" xmlns:r="http://schemas.openxmlformats.org/officeDocument/2006/relationships" xmlns:m="http://schemas.openxmlformats.org/officeDocument/2006/math" xmlns:v="urn:schemas-microsoft-com:vml" xmlns:wp14="http://schemas.microsoft.com/office/word/2010/wordprocessingDrawing" xmlns:wp="http://schemas.openxmlformats.org/drawingml/2006/wordprocessingDrawing" xmlns:w10="urn:schemas-microsoft-com:office:word" xmlns:w="http://schemas.openxmlformats.org/wordprocessingml/2006/main" xmlns:w14="http://schemas.microsoft.com/office/word/2010/wordml" xmlns:w15="http://schemas.microsoft.com/office/word/2012/wordml" xmlns:wpg="http://schemas.microsoft.com/office/word/2010/wordprocessingGroup" xmlns:wpi="http://schemas.microsoft.com/office/word/2010/wordprocessingInk" xmlns:wne="http://schemas.microsoft.com/office/word/2006/wordml" xmlns:wps="http://schemas.microsoft.com/office/word/2010/wordprocessingShape" xmlns:cx="http://schemas.microsoft.com/office/drawing/2014/chartex" xmlns:cx1="http://schemas.microsoft.com/office/drawing/2015/9/8/chartex" xmlns:cx2="http://schemas.microsoft.com/office/drawing/2015/10/21/chartex" xmlns:cx3="http://schemas.microsoft.com/office/drawing/2016/5/9/chartex" xmlns:cx4="http://schemas.microsoft.com/office/drawing/2016/5/10/chartex" xmlns:cx5="http://schemas.microsoft.com/office/drawing/2016/5/11/chartex" xmlns:cx6="http://schemas.microsoft.com/office/drawing/2016/5/12/chartex" xmlns:cx7="http://schemas.microsoft.com/office/drawing/2016/5/13/chartex" xmlns:cx8="http://schemas.microsoft.com/office/drawing/2016/5/14/chartex" xmlns:w16cid="http://schemas.microsoft.com/office/word/2016/wordml/cid" xmlns:w16se="http://schemas.microsoft.com/office/word/2015/wordml/symex">
+<w:hdr xmlns:wpc="http://schemas.microsoft.com/office/word/2010/wordprocessingCanvas" xmlns:cx="http://schemas.microsoft.com/office/drawing/2014/chartex" xmlns:cx1="http://schemas.microsoft.com/office/drawing/2015/9/8/chartex" xmlns:cx2="http://schemas.microsoft.com/office/drawing/2015/10/21/chartex" xmlns:cx3="http://schemas.microsoft.com/office/drawing/2016/5/9/chartex" xmlns:cx4="http://schemas.microsoft.com/office/drawing/2016/5/10/chartex" xmlns:cx5="http://schemas.microsoft.com/office/drawing/2016/5/11/chartex" xmlns:cx6="http://schemas.microsoft.com/office/drawing/2016/5/12/chartex" xmlns:cx7="http://schemas.microsoft.com/office/drawing/2016/5/13/chartex" xmlns:cx8="http://schemas.microsoft.com/office/drawing/2016/5/14/chartex" xmlns:mc="http://schemas.openxmlformats.org/markup-compatibility/2006" xmlns:aink="http://schemas.microsoft.com/office/drawing/2016/ink" xmlns:am3d="http://schemas.microsoft.com/office/drawing/2017/model3d" xmlns:o="urn:schemas-microsoft-com:office:office" xmlns:oel="http://schemas.microsoft.com/office/2019/extlst" xmlns:r="http://schemas.openxmlformats.org/officeDocument/2006/relationships" xmlns:m="http://schemas.openxmlformats.org/officeDocument/2006/math" xmlns:v="urn:schemas-microsoft-com:vml" xmlns:wp14="http://schemas.microsoft.com/office/word/2010/wordprocessingDrawing" xmlns:wp="http://schemas.openxmlformats.org/drawingml/2006/wordprocessingDrawing" xmlns:w10="urn:schemas-microsoft-com:office:word" xmlns:w="http://schemas.openxmlformats.org/wordprocessingml/2006/main" xmlns:w14="http://schemas.microsoft.com/office/word/2010/wordml" xmlns:w15="http://schemas.microsoft.com/office/word/2012/wordml" xmlns:w16cex="http://schemas.microsoft.com/office/word/2018/wordml/cex" xmlns:w16cid="http://schemas.microsoft.com/office/word/2016/wordml/cid" xmlns:w16="http://schemas.microsoft.com/office/word/2018/wordml" xmlns:w16du="http://schemas.microsoft.com/office/word/2023/wordml/word16du" xmlns:w16sdtdh="http://schemas.microsoft.com/office/word/2020/wordml/sdtdatahash" xmlns:w16sdtfl="http://schemas.microsoft.com/office/word/2024/wordml/sdtformatlock" xmlns:w16se="http://schemas.microsoft.com/office/word/2015/wordml/symex" xmlns:wpg="http://schemas.microsoft.com/office/word/2010/wordprocessingGroup" xmlns:wpi="http://schemas.microsoft.com/office/word/2010/wordprocessingInk" xmlns:wne="http://schemas.microsoft.com/office/word/2006/wordml" xmlns:wps="http://schemas.microsoft.com/office/word/2010/wordprocessingShape" mc:Ignorable="w14 w15 w16se w16cid w16 w16cex w16sdtdh w16sdtfl w16du wp14">
   <w:p>
     <w:pPr>
       <w:pBdr>
-        <w:bottom w:val="single" w:color="DA291C" w:sz="12" w:space="4"/>
+        <w:bottom w:val="single" w:sz="12" w:space="4" w:color="DA291C"/>
       </w:pBdr>
     </w:pPr>
     <w:r>
+      <w:rPr>
+        <w:noProof/>
+      </w:rPr>
       <w:drawing>
-        <wp:inline distT="0" distB="0" distL="0" distR="0">
+        <wp:inline distT="0" distB="0" distL="0" distR="0" wp14:anchorId="4FC26124" wp14:editId="6F158581">
           <wp:extent cx="323850" cy="285750"/>
-          <wp:effectExtent t="0" r="0" b="0" l="0"/>
-          <wp:docPr id="1" name="" descr="" title=""/>
+          <wp:effectExtent l="0" t="0" r="0" b="0"/>
+          <wp:docPr id="446356260" name="Picture 446356260"/>
           <wp:cNvGraphicFramePr>
             <a:graphicFrameLocks xmlns:a="http://schemas.openxmlformats.org/drawingml/2006/main" noChangeAspect="1"/>
           </wp:cNvGraphicFramePr>
@@ -1609,13 +1698,13 @@
             <a:graphicData uri="http://schemas.openxmlformats.org/drawingml/2006/picture">
               <pic:pic xmlns:pic="http://schemas.openxmlformats.org/drawingml/2006/picture">
                 <pic:nvPicPr>
-                  <pic:cNvPr id="0" name="" descr=""/>
+                  <pic:cNvPr id="0" name=""/>
                   <pic:cNvPicPr>
                     <a:picLocks noChangeAspect="1" noChangeArrowheads="1"/>
                   </pic:cNvPicPr>
                 </pic:nvPicPr>
                 <pic:blipFill>
-                  <a:blip r:embed="rId0" cstate="none"/>
+                  <a:blip r:embed="rId1"/>
                   <a:srcRect/>
                   <a:stretch>
                     <a:fillRect/>
@@ -1638,24 +1727,47 @@
     </w:r>
     <w:r>
       <w:rPr>
-        <w:rFonts w:ascii="Arial" w:cs="Arial" w:eastAsia="Arial" w:hAnsi="Arial"/>
         <w:b/>
         <w:bCs/>
         <w:color w:val="27251F"/>
         <w:sz w:val="18"/>
         <w:szCs w:val="18"/>
       </w:rPr>
-      <w:t xml:space="preserve">   McDonald's Egypt - Crew Insights Hub  |  User Guide</w:t>
+      <w:t xml:space="preserve">   McDonald's Egypt - Crew Insights </w:t>
+    </w:r>
+    <w:proofErr w:type="gramStart"/>
+    <w:r>
+      <w:rPr>
+        <w:b/>
+        <w:bCs/>
+        <w:color w:val="27251F"/>
+        <w:sz w:val="18"/>
+        <w:szCs w:val="18"/>
+      </w:rPr>
+      <w:t>Hub  |</w:t>
+    </w:r>
+    <w:proofErr w:type="gramEnd"/>
+    <w:r>
+      <w:rPr>
+        <w:b/>
+        <w:bCs/>
+        <w:color w:val="27251F"/>
+        <w:sz w:val="18"/>
+        <w:szCs w:val="18"/>
+      </w:rPr>
+      <w:t xml:space="preserve">  User Guide</w:t>
     </w:r>
   </w:p>
 </w:hdr>
 </file>
 
 <file path=word/numbering.xml><?xml version="1.0" encoding="utf-8"?>
-<w:numbering xmlns:wpc="http://schemas.microsoft.com/office/word/2010/wordprocessingCanvas" xmlns:mc="http://schemas.openxmlformats.org/markup-compatibility/2006" xmlns:o="urn:schemas-microsoft-com:office:office" xmlns:r="http://schemas.openxmlformats.org/officeDocument/2006/relationships" xmlns:m="http://schemas.openxmlformats.org/officeDocument/2006/math" xmlns:v="urn:schemas-microsoft-com:vml" xmlns:wp14="http://schemas.microsoft.com/office/word/2010/wordprocessingDrawing" xmlns:wp="http://schemas.openxmlformats.org/drawingml/2006/wordprocessingDrawing" xmlns:w10="urn:schemas-microsoft-com:office:word" xmlns:w="http://schemas.openxmlformats.org/wordprocessingml/2006/main" xmlns:w14="http://schemas.microsoft.com/office/word/2010/wordml" xmlns:w15="http://schemas.microsoft.com/office/word/2012/wordml" xmlns:wpg="http://schemas.microsoft.com/office/word/2010/wordprocessingGroup" xmlns:wpi="http://schemas.microsoft.com/office/word/2010/wordprocessingInk" xmlns:wne="http://schemas.microsoft.com/office/word/2006/wordml" xmlns:wps="http://schemas.microsoft.com/office/word/2010/wordprocessingShape" mc:Ignorable="w14 w15 wp14">
-  <w:abstractNum w:abstractNumId="1" w15:restartNumberingAfterBreak="0">
+<w:numbering xmlns:wpc="http://schemas.microsoft.com/office/word/2010/wordprocessingCanvas" xmlns:cx="http://schemas.microsoft.com/office/drawing/2014/chartex" xmlns:cx1="http://schemas.microsoft.com/office/drawing/2015/9/8/chartex" xmlns:cx2="http://schemas.microsoft.com/office/drawing/2015/10/21/chartex" xmlns:cx3="http://schemas.microsoft.com/office/drawing/2016/5/9/chartex" xmlns:cx4="http://schemas.microsoft.com/office/drawing/2016/5/10/chartex" xmlns:cx5="http://schemas.microsoft.com/office/drawing/2016/5/11/chartex" xmlns:cx6="http://schemas.microsoft.com/office/drawing/2016/5/12/chartex" xmlns:cx7="http://schemas.microsoft.com/office/drawing/2016/5/13/chartex" xmlns:cx8="http://schemas.microsoft.com/office/drawing/2016/5/14/chartex" xmlns:mc="http://schemas.openxmlformats.org/markup-compatibility/2006" xmlns:aink="http://schemas.microsoft.com/office/drawing/2016/ink" xmlns:am3d="http://schemas.microsoft.com/office/drawing/2017/model3d" xmlns:o="urn:schemas-microsoft-com:office:office" xmlns:oel="http://schemas.microsoft.com/office/2019/extlst" xmlns:r="http://schemas.openxmlformats.org/officeDocument/2006/relationships" xmlns:m="http://schemas.openxmlformats.org/officeDocument/2006/math" xmlns:v="urn:schemas-microsoft-com:vml" xmlns:wp14="http://schemas.microsoft.com/office/word/2010/wordprocessingDrawing" xmlns:wp="http://schemas.openxmlformats.org/drawingml/2006/wordprocessingDrawing" xmlns:w10="urn:schemas-microsoft-com:office:word" xmlns:w="http://schemas.openxmlformats.org/wordprocessingml/2006/main" xmlns:w14="http://schemas.microsoft.com/office/word/2010/wordml" xmlns:w15="http://schemas.microsoft.com/office/word/2012/wordml" xmlns:w16cex="http://schemas.microsoft.com/office/word/2018/wordml/cex" xmlns:w16cid="http://schemas.microsoft.com/office/word/2016/wordml/cid" xmlns:w16="http://schemas.microsoft.com/office/word/2018/wordml" xmlns:w16du="http://schemas.microsoft.com/office/word/2023/wordml/word16du" xmlns:w16sdtdh="http://schemas.microsoft.com/office/word/2020/wordml/sdtdatahash" xmlns:w16sdtfl="http://schemas.microsoft.com/office/word/2024/wordml/sdtformatlock" xmlns:w16se="http://schemas.microsoft.com/office/word/2015/wordml/symex" xmlns:wpg="http://schemas.microsoft.com/office/word/2010/wordprocessingGroup" xmlns:wpi="http://schemas.microsoft.com/office/word/2010/wordprocessingInk" xmlns:wne="http://schemas.microsoft.com/office/word/2006/wordml" xmlns:wps="http://schemas.microsoft.com/office/word/2010/wordprocessingShape" mc:Ignorable="w14 w15 w16se w16cid w16 w16cex w16sdtdh w16sdtfl w16du wp14">
+  <w:abstractNum w:abstractNumId="0" w15:restartNumberingAfterBreak="0">
+    <w:nsid w:val="02F93B95"/>
     <w:multiLevelType w:val="hybridMultilevel"/>
-    <w:lvl w:ilvl="0" w15:tentative="1">
+    <w:tmpl w:val="68D8AD5A"/>
+    <w:lvl w:ilvl="0" w:tplc="F0C0BF8A">
       <w:start w:val="1"/>
       <w:numFmt w:val="bullet"/>
       <w:lvlText w:val="●"/>
@@ -1664,7 +1776,7 @@
         <w:ind w:left="720" w:hanging="360"/>
       </w:pPr>
     </w:lvl>
-    <w:lvl w:ilvl="1" w15:tentative="1">
+    <w:lvl w:ilvl="1" w:tplc="B8B2053A">
       <w:start w:val="1"/>
       <w:numFmt w:val="bullet"/>
       <w:lvlText w:val="○"/>
@@ -1673,7 +1785,7 @@
         <w:ind w:left="1440" w:hanging="360"/>
       </w:pPr>
     </w:lvl>
-    <w:lvl w:ilvl="2" w15:tentative="1">
+    <w:lvl w:ilvl="2" w:tplc="CFC8C14A">
       <w:start w:val="1"/>
       <w:numFmt w:val="bullet"/>
       <w:lvlText w:val="■"/>
@@ -1682,7 +1794,7 @@
         <w:ind w:left="2160" w:hanging="360"/>
       </w:pPr>
     </w:lvl>
-    <w:lvl w:ilvl="3" w15:tentative="1">
+    <w:lvl w:ilvl="3" w:tplc="CA549D0E">
       <w:start w:val="1"/>
       <w:numFmt w:val="bullet"/>
       <w:lvlText w:val="●"/>
@@ -1691,7 +1803,7 @@
         <w:ind w:left="2880" w:hanging="360"/>
       </w:pPr>
     </w:lvl>
-    <w:lvl w:ilvl="4" w15:tentative="1">
+    <w:lvl w:ilvl="4" w:tplc="BA525D7E">
       <w:start w:val="1"/>
       <w:numFmt w:val="bullet"/>
       <w:lvlText w:val="○"/>
@@ -1700,7 +1812,7 @@
         <w:ind w:left="3600" w:hanging="360"/>
       </w:pPr>
     </w:lvl>
-    <w:lvl w:ilvl="5" w15:tentative="1">
+    <w:lvl w:ilvl="5" w:tplc="0BD65566">
       <w:start w:val="1"/>
       <w:numFmt w:val="bullet"/>
       <w:lvlText w:val="■"/>
@@ -1709,7 +1821,7 @@
         <w:ind w:left="4320" w:hanging="360"/>
       </w:pPr>
     </w:lvl>
-    <w:lvl w:ilvl="6" w15:tentative="1">
+    <w:lvl w:ilvl="6" w:tplc="92F405BE">
       <w:start w:val="1"/>
       <w:numFmt w:val="bullet"/>
       <w:lvlText w:val="●"/>
@@ -1718,7 +1830,7 @@
         <w:ind w:left="5040" w:hanging="360"/>
       </w:pPr>
     </w:lvl>
-    <w:lvl w:ilvl="7" w15:tentative="1">
+    <w:lvl w:ilvl="7" w:tplc="9CD07290">
       <w:start w:val="1"/>
       <w:numFmt w:val="bullet"/>
       <w:lvlText w:val="●"/>
@@ -1727,7 +1839,7 @@
         <w:ind w:left="5760" w:hanging="360"/>
       </w:pPr>
     </w:lvl>
-    <w:lvl w:ilvl="8" w15:tentative="1">
+    <w:lvl w:ilvl="8" w:tplc="63760EF8">
       <w:start w:val="1"/>
       <w:numFmt w:val="bullet"/>
       <w:lvlText w:val="●"/>
@@ -1737,9 +1849,11 @@
       </w:pPr>
     </w:lvl>
   </w:abstractNum>
-  <w:abstractNum w:abstractNumId="2" w15:restartNumberingAfterBreak="0">
+  <w:abstractNum w:abstractNumId="1" w15:restartNumberingAfterBreak="0">
+    <w:nsid w:val="2E605A06"/>
     <w:multiLevelType w:val="hybridMultilevel"/>
-    <w:lvl w:ilvl="0" w15:tentative="1">
+    <w:tmpl w:val="C7CA331E"/>
+    <w:lvl w:ilvl="0" w:tplc="6002BFE0">
       <w:start w:val="1"/>
       <w:numFmt w:val="bullet"/>
       <w:lvlText w:val="•"/>
@@ -1748,9 +1862,49 @@
         <w:ind w:left="540" w:hanging="260"/>
       </w:pPr>
     </w:lvl>
+    <w:lvl w:ilvl="1" w:tplc="701410EE">
+      <w:numFmt w:val="decimal"/>
+      <w:lvlText w:val=""/>
+      <w:lvlJc w:val="left"/>
+    </w:lvl>
+    <w:lvl w:ilvl="2" w:tplc="FC8C39E6">
+      <w:numFmt w:val="decimal"/>
+      <w:lvlText w:val=""/>
+      <w:lvlJc w:val="left"/>
+    </w:lvl>
+    <w:lvl w:ilvl="3" w:tplc="9DDEC04C">
+      <w:numFmt w:val="decimal"/>
+      <w:lvlText w:val=""/>
+      <w:lvlJc w:val="left"/>
+    </w:lvl>
+    <w:lvl w:ilvl="4" w:tplc="C7963926">
+      <w:numFmt w:val="decimal"/>
+      <w:lvlText w:val=""/>
+      <w:lvlJc w:val="left"/>
+    </w:lvl>
+    <w:lvl w:ilvl="5" w:tplc="EFC04278">
+      <w:numFmt w:val="decimal"/>
+      <w:lvlText w:val=""/>
+      <w:lvlJc w:val="left"/>
+    </w:lvl>
+    <w:lvl w:ilvl="6" w:tplc="5678D13C">
+      <w:numFmt w:val="decimal"/>
+      <w:lvlText w:val=""/>
+      <w:lvlJc w:val="left"/>
+    </w:lvl>
+    <w:lvl w:ilvl="7" w:tplc="74D8F5C6">
+      <w:numFmt w:val="decimal"/>
+      <w:lvlText w:val=""/>
+      <w:lvlJc w:val="left"/>
+    </w:lvl>
+    <w:lvl w:ilvl="8" w:tplc="62DC2164">
+      <w:numFmt w:val="decimal"/>
+      <w:lvlText w:val=""/>
+      <w:lvlJc w:val="left"/>
+    </w:lvl>
   </w:abstractNum>
-  <w:num w:numId="1">
-    <w:abstractNumId w:val="1"/>
+  <w:num w:numId="1" w16cid:durableId="1601796405">
+    <w:abstractNumId w:val="0"/>
     <w:lvlOverride w:ilvl="0">
       <w:startOverride w:val="1"/>
     </w:lvlOverride>
@@ -1759,54 +1913,446 @@
 </file>
 
 <file path=word/styles.xml><?xml version="1.0" encoding="utf-8"?>
-<w:styles xmlns:mc="http://schemas.openxmlformats.org/markup-compatibility/2006" xmlns:r="http://schemas.openxmlformats.org/officeDocument/2006/relationships" xmlns:w="http://schemas.openxmlformats.org/wordprocessingml/2006/main" xmlns:w14="http://schemas.microsoft.com/office/word/2010/wordml" xmlns:w15="http://schemas.microsoft.com/office/word/2012/wordml" mc:Ignorable="w14 w15">
+<w:styles xmlns:mc="http://schemas.openxmlformats.org/markup-compatibility/2006" xmlns:r="http://schemas.openxmlformats.org/officeDocument/2006/relationships" xmlns:w="http://schemas.openxmlformats.org/wordprocessingml/2006/main" xmlns:w14="http://schemas.microsoft.com/office/word/2010/wordml" xmlns:w15="http://schemas.microsoft.com/office/word/2012/wordml" xmlns:w16cex="http://schemas.microsoft.com/office/word/2018/wordml/cex" xmlns:w16cid="http://schemas.microsoft.com/office/word/2016/wordml/cid" xmlns:w16="http://schemas.microsoft.com/office/word/2018/wordml" xmlns:w16du="http://schemas.microsoft.com/office/word/2023/wordml/word16du" xmlns:w16sdtdh="http://schemas.microsoft.com/office/word/2020/wordml/sdtdatahash" xmlns:w16sdtfl="http://schemas.microsoft.com/office/word/2024/wordml/sdtformatlock" xmlns:w16se="http://schemas.microsoft.com/office/word/2015/wordml/symex" mc:Ignorable="w14 w15 w16se w16cid w16 w16cex w16sdtdh w16sdtfl w16du">
   <w:docDefaults>
     <w:rPrDefault>
       <w:rPr>
-        <w:rFonts w:ascii="Arial" w:cs="Arial" w:eastAsia="Arial" w:hAnsi="Arial"/>
+        <w:rFonts w:ascii="Arial" w:eastAsia="Arial" w:hAnsi="Arial" w:cs="Arial"/>
         <w:sz w:val="21"/>
         <w:szCs w:val="21"/>
+        <w:lang w:val="en-US" w:eastAsia="en-US" w:bidi="ar-SA"/>
       </w:rPr>
     </w:rPrDefault>
     <w:pPrDefault/>
   </w:docDefaults>
-  <w:style w:type="paragraph" w:styleId="Title">
-    <w:name w:val="Title"/>
-    <w:basedOn w:val="Normal"/>
-    <w:next w:val="Normal"/>
+  <w:latentStyles w:defLockedState="0" w:defUIPriority="99" w:defSemiHidden="0" w:defUnhideWhenUsed="0" w:defQFormat="0" w:count="376">
+    <w:lsdException w:name="Normal" w:uiPriority="0" w:qFormat="1"/>
+    <w:lsdException w:name="heading 1" w:uiPriority="9" w:qFormat="1"/>
+    <w:lsdException w:name="heading 2" w:semiHidden="1" w:uiPriority="9" w:unhideWhenUsed="1" w:qFormat="1"/>
+    <w:lsdException w:name="heading 3" w:semiHidden="1" w:uiPriority="9" w:unhideWhenUsed="1" w:qFormat="1"/>
+    <w:lsdException w:name="heading 4" w:semiHidden="1" w:uiPriority="9" w:unhideWhenUsed="1" w:qFormat="1"/>
+    <w:lsdException w:name="heading 5" w:semiHidden="1" w:uiPriority="9" w:unhideWhenUsed="1" w:qFormat="1"/>
+    <w:lsdException w:name="heading 6" w:semiHidden="1" w:uiPriority="9" w:unhideWhenUsed="1" w:qFormat="1"/>
+    <w:lsdException w:name="heading 7" w:semiHidden="1" w:uiPriority="9" w:unhideWhenUsed="1" w:qFormat="1"/>
+    <w:lsdException w:name="heading 8" w:semiHidden="1" w:uiPriority="9" w:unhideWhenUsed="1" w:qFormat="1"/>
+    <w:lsdException w:name="heading 9" w:semiHidden="1" w:uiPriority="9" w:unhideWhenUsed="1" w:qFormat="1"/>
+    <w:lsdException w:name="index 1" w:semiHidden="1" w:unhideWhenUsed="1"/>
+    <w:lsdException w:name="index 2" w:semiHidden="1" w:unhideWhenUsed="1"/>
+    <w:lsdException w:name="index 3" w:semiHidden="1" w:unhideWhenUsed="1"/>
+    <w:lsdException w:name="index 4" w:semiHidden="1" w:unhideWhenUsed="1"/>
+    <w:lsdException w:name="index 5" w:semiHidden="1" w:unhideWhenUsed="1"/>
+    <w:lsdException w:name="index 6" w:semiHidden="1" w:unhideWhenUsed="1"/>
+    <w:lsdException w:name="index 7" w:semiHidden="1" w:unhideWhenUsed="1"/>
+    <w:lsdException w:name="index 8" w:semiHidden="1" w:unhideWhenUsed="1"/>
+    <w:lsdException w:name="index 9" w:semiHidden="1" w:unhideWhenUsed="1"/>
+    <w:lsdException w:name="toc 1" w:semiHidden="1" w:uiPriority="39" w:unhideWhenUsed="1"/>
+    <w:lsdException w:name="toc 2" w:semiHidden="1" w:uiPriority="39" w:unhideWhenUsed="1"/>
+    <w:lsdException w:name="toc 3" w:semiHidden="1" w:uiPriority="39" w:unhideWhenUsed="1"/>
+    <w:lsdException w:name="toc 4" w:semiHidden="1" w:uiPriority="39" w:unhideWhenUsed="1"/>
+    <w:lsdException w:name="toc 5" w:semiHidden="1" w:uiPriority="39" w:unhideWhenUsed="1"/>
+    <w:lsdException w:name="toc 6" w:semiHidden="1" w:uiPriority="39" w:unhideWhenUsed="1"/>
+    <w:lsdException w:name="toc 7" w:semiHidden="1" w:uiPriority="39" w:unhideWhenUsed="1"/>
+    <w:lsdException w:name="toc 8" w:semiHidden="1" w:uiPriority="39" w:unhideWhenUsed="1"/>
+    <w:lsdException w:name="toc 9" w:semiHidden="1" w:uiPriority="39" w:unhideWhenUsed="1"/>
+    <w:lsdException w:name="Normal Indent" w:semiHidden="1" w:unhideWhenUsed="1"/>
+    <w:lsdException w:name="footnote text" w:semiHidden="1" w:unhideWhenUsed="1"/>
+    <w:lsdException w:name="annotation text" w:semiHidden="1" w:unhideWhenUsed="1"/>
+    <w:lsdException w:name="header" w:semiHidden="1" w:unhideWhenUsed="1"/>
+    <w:lsdException w:name="footer" w:semiHidden="1" w:unhideWhenUsed="1"/>
+    <w:lsdException w:name="index heading" w:semiHidden="1" w:unhideWhenUsed="1"/>
+    <w:lsdException w:name="caption" w:semiHidden="1" w:uiPriority="35" w:unhideWhenUsed="1" w:qFormat="1"/>
+    <w:lsdException w:name="table of figures" w:semiHidden="1" w:unhideWhenUsed="1"/>
+    <w:lsdException w:name="envelope address" w:semiHidden="1" w:unhideWhenUsed="1"/>
+    <w:lsdException w:name="envelope return" w:semiHidden="1" w:unhideWhenUsed="1"/>
+    <w:lsdException w:name="footnote reference" w:semiHidden="1" w:unhideWhenUsed="1"/>
+    <w:lsdException w:name="annotation reference" w:semiHidden="1" w:unhideWhenUsed="1"/>
+    <w:lsdException w:name="line number" w:semiHidden="1" w:unhideWhenUsed="1"/>
+    <w:lsdException w:name="page number" w:semiHidden="1" w:unhideWhenUsed="1"/>
+    <w:lsdException w:name="endnote reference" w:semiHidden="1" w:unhideWhenUsed="1"/>
+    <w:lsdException w:name="endnote text" w:semiHidden="1" w:unhideWhenUsed="1"/>
+    <w:lsdException w:name="table of authorities" w:semiHidden="1" w:unhideWhenUsed="1"/>
+    <w:lsdException w:name="macro" w:semiHidden="1" w:unhideWhenUsed="1"/>
+    <w:lsdException w:name="toa heading" w:semiHidden="1" w:unhideWhenUsed="1"/>
+    <w:lsdException w:name="List" w:semiHidden="1" w:unhideWhenUsed="1"/>
+    <w:lsdException w:name="List Bullet" w:semiHidden="1" w:unhideWhenUsed="1"/>
+    <w:lsdException w:name="List Number" w:semiHidden="1" w:unhideWhenUsed="1"/>
+    <w:lsdException w:name="List 2" w:semiHidden="1" w:unhideWhenUsed="1"/>
+    <w:lsdException w:name="List 3" w:semiHidden="1" w:unhideWhenUsed="1"/>
+    <w:lsdException w:name="List 4" w:semiHidden="1" w:unhideWhenUsed="1"/>
+    <w:lsdException w:name="List 5" w:semiHidden="1" w:unhideWhenUsed="1"/>
+    <w:lsdException w:name="List Bullet 2" w:semiHidden="1" w:unhideWhenUsed="1"/>
+    <w:lsdException w:name="List Bullet 3" w:semiHidden="1" w:unhideWhenUsed="1"/>
+    <w:lsdException w:name="List Bullet 4" w:semiHidden="1" w:unhideWhenUsed="1"/>
+    <w:lsdException w:name="List Bullet 5" w:semiHidden="1" w:unhideWhenUsed="1"/>
+    <w:lsdException w:name="List Number 2" w:semiHidden="1" w:unhideWhenUsed="1"/>
+    <w:lsdException w:name="List Number 3" w:semiHidden="1" w:unhideWhenUsed="1"/>
+    <w:lsdException w:name="List Number 4" w:semiHidden="1" w:unhideWhenUsed="1"/>
+    <w:lsdException w:name="List Number 5" w:semiHidden="1" w:unhideWhenUsed="1"/>
+    <w:lsdException w:name="Title" w:uiPriority="10" w:qFormat="1"/>
+    <w:lsdException w:name="Closing" w:semiHidden="1" w:unhideWhenUsed="1"/>
+    <w:lsdException w:name="Signature" w:semiHidden="1" w:unhideWhenUsed="1"/>
+    <w:lsdException w:name="Default Paragraph Font" w:semiHidden="1" w:uiPriority="1" w:unhideWhenUsed="1"/>
+    <w:lsdException w:name="Body Text" w:semiHidden="1" w:unhideWhenUsed="1"/>
+    <w:lsdException w:name="Body Text Indent" w:semiHidden="1" w:unhideWhenUsed="1"/>
+    <w:lsdException w:name="List Continue" w:semiHidden="1" w:unhideWhenUsed="1"/>
+    <w:lsdException w:name="List Continue 2" w:semiHidden="1" w:unhideWhenUsed="1"/>
+    <w:lsdException w:name="List Continue 3" w:semiHidden="1" w:unhideWhenUsed="1"/>
+    <w:lsdException w:name="List Continue 4" w:semiHidden="1" w:unhideWhenUsed="1"/>
+    <w:lsdException w:name="List Continue 5" w:semiHidden="1" w:unhideWhenUsed="1"/>
+    <w:lsdException w:name="Message Header" w:semiHidden="1" w:unhideWhenUsed="1"/>
+    <w:lsdException w:name="Subtitle" w:uiPriority="11" w:qFormat="1"/>
+    <w:lsdException w:name="Salutation" w:semiHidden="1" w:unhideWhenUsed="1"/>
+    <w:lsdException w:name="Date" w:semiHidden="1" w:unhideWhenUsed="1"/>
+    <w:lsdException w:name="Body Text First Indent" w:semiHidden="1" w:unhideWhenUsed="1"/>
+    <w:lsdException w:name="Body Text First Indent 2" w:semiHidden="1" w:unhideWhenUsed="1"/>
+    <w:lsdException w:name="Note Heading" w:semiHidden="1" w:unhideWhenUsed="1"/>
+    <w:lsdException w:name="Body Text 2" w:semiHidden="1" w:unhideWhenUsed="1"/>
+    <w:lsdException w:name="Body Text 3" w:semiHidden="1" w:unhideWhenUsed="1"/>
+    <w:lsdException w:name="Body Text Indent 2" w:semiHidden="1" w:unhideWhenUsed="1"/>
+    <w:lsdException w:name="Body Text Indent 3" w:semiHidden="1" w:unhideWhenUsed="1"/>
+    <w:lsdException w:name="Block Text" w:semiHidden="1" w:unhideWhenUsed="1"/>
+    <w:lsdException w:name="Hyperlink" w:semiHidden="1" w:unhideWhenUsed="1"/>
+    <w:lsdException w:name="FollowedHyperlink" w:semiHidden="1" w:unhideWhenUsed="1"/>
+    <w:lsdException w:name="Strong" w:uiPriority="22" w:qFormat="1"/>
+    <w:lsdException w:name="Emphasis" w:uiPriority="20" w:qFormat="1"/>
+    <w:lsdException w:name="Document Map" w:semiHidden="1" w:unhideWhenUsed="1"/>
+    <w:lsdException w:name="Plain Text" w:semiHidden="1" w:unhideWhenUsed="1"/>
+    <w:lsdException w:name="E-mail Signature" w:semiHidden="1" w:unhideWhenUsed="1"/>
+    <w:lsdException w:name="HTML Top of Form" w:semiHidden="1" w:unhideWhenUsed="1"/>
+    <w:lsdException w:name="HTML Bottom of Form" w:semiHidden="1" w:unhideWhenUsed="1"/>
+    <w:lsdException w:name="Normal (Web)" w:semiHidden="1" w:unhideWhenUsed="1"/>
+    <w:lsdException w:name="HTML Acronym" w:semiHidden="1" w:unhideWhenUsed="1"/>
+    <w:lsdException w:name="HTML Address" w:semiHidden="1" w:unhideWhenUsed="1"/>
+    <w:lsdException w:name="HTML Cite" w:semiHidden="1" w:unhideWhenUsed="1"/>
+    <w:lsdException w:name="HTML Code" w:semiHidden="1" w:unhideWhenUsed="1"/>
+    <w:lsdException w:name="HTML Definition" w:semiHidden="1" w:unhideWhenUsed="1"/>
+    <w:lsdException w:name="HTML Keyboard" w:semiHidden="1" w:unhideWhenUsed="1"/>
+    <w:lsdException w:name="HTML Preformatted" w:semiHidden="1" w:unhideWhenUsed="1"/>
+    <w:lsdException w:name="HTML Sample" w:semiHidden="1" w:unhideWhenUsed="1"/>
+    <w:lsdException w:name="HTML Typewriter" w:semiHidden="1" w:unhideWhenUsed="1"/>
+    <w:lsdException w:name="HTML Variable" w:semiHidden="1" w:unhideWhenUsed="1"/>
+    <w:lsdException w:name="Normal Table" w:semiHidden="1" w:unhideWhenUsed="1"/>
+    <w:lsdException w:name="annotation subject" w:semiHidden="1" w:unhideWhenUsed="1"/>
+    <w:lsdException w:name="No List" w:semiHidden="1" w:unhideWhenUsed="1"/>
+    <w:lsdException w:name="Outline List 1" w:semiHidden="1" w:unhideWhenUsed="1"/>
+    <w:lsdException w:name="Outline List 2" w:semiHidden="1" w:unhideWhenUsed="1"/>
+    <w:lsdException w:name="Outline List 3" w:semiHidden="1" w:unhideWhenUsed="1"/>
+    <w:lsdException w:name="Table Simple 1" w:semiHidden="1" w:unhideWhenUsed="1"/>
+    <w:lsdException w:name="Table Simple 2" w:semiHidden="1" w:unhideWhenUsed="1"/>
+    <w:lsdException w:name="Table Simple 3" w:semiHidden="1" w:unhideWhenUsed="1"/>
+    <w:lsdException w:name="Table Classic 1" w:semiHidden="1" w:unhideWhenUsed="1"/>
+    <w:lsdException w:name="Table Classic 2" w:semiHidden="1" w:unhideWhenUsed="1"/>
+    <w:lsdException w:name="Table Classic 3" w:semiHidden="1" w:unhideWhenUsed="1"/>
+    <w:lsdException w:name="Table Classic 4" w:semiHidden="1" w:unhideWhenUsed="1"/>
+    <w:lsdException w:name="Table Colorful 1" w:semiHidden="1" w:unhideWhenUsed="1"/>
+    <w:lsdException w:name="Table Colorful 2" w:semiHidden="1" w:unhideWhenUsed="1"/>
+    <w:lsdException w:name="Table Colorful 3" w:semiHidden="1" w:unhideWhenUsed="1"/>
+    <w:lsdException w:name="Table Columns 1" w:semiHidden="1" w:unhideWhenUsed="1"/>
+    <w:lsdException w:name="Table Columns 2" w:semiHidden="1" w:unhideWhenUsed="1"/>
+    <w:lsdException w:name="Table Columns 3" w:semiHidden="1" w:unhideWhenUsed="1"/>
+    <w:lsdException w:name="Table Columns 4" w:semiHidden="1" w:unhideWhenUsed="1"/>
+    <w:lsdException w:name="Table Columns 5" w:semiHidden="1" w:unhideWhenUsed="1"/>
+    <w:lsdException w:name="Table Grid 1" w:semiHidden="1" w:unhideWhenUsed="1"/>
+    <w:lsdException w:name="Table Grid 2" w:semiHidden="1" w:unhideWhenUsed="1"/>
+    <w:lsdException w:name="Table Grid 3" w:semiHidden="1" w:unhideWhenUsed="1"/>
+    <w:lsdException w:name="Table Grid 4" w:semiHidden="1" w:unhideWhenUsed="1"/>
+    <w:lsdException w:name="Table Grid 5" w:semiHidden="1" w:unhideWhenUsed="1"/>
+    <w:lsdException w:name="Table Grid 6" w:semiHidden="1" w:unhideWhenUsed="1"/>
+    <w:lsdException w:name="Table Grid 7" w:semiHidden="1" w:unhideWhenUsed="1"/>
+    <w:lsdException w:name="Table Grid 8" w:semiHidden="1" w:unhideWhenUsed="1"/>
+    <w:lsdException w:name="Table List 1" w:semiHidden="1" w:unhideWhenUsed="1"/>
+    <w:lsdException w:name="Table List 2" w:semiHidden="1" w:unhideWhenUsed="1"/>
+    <w:lsdException w:name="Table List 3" w:semiHidden="1" w:unhideWhenUsed="1"/>
+    <w:lsdException w:name="Table List 4" w:semiHidden="1" w:unhideWhenUsed="1"/>
+    <w:lsdException w:name="Table List 5" w:semiHidden="1" w:unhideWhenUsed="1"/>
+    <w:lsdException w:name="Table List 6" w:semiHidden="1" w:unhideWhenUsed="1"/>
+    <w:lsdException w:name="Table List 7" w:semiHidden="1" w:unhideWhenUsed="1"/>
+    <w:lsdException w:name="Table List 8" w:semiHidden="1" w:unhideWhenUsed="1"/>
+    <w:lsdException w:name="Table 3D effects 1" w:semiHidden="1" w:unhideWhenUsed="1"/>
+    <w:lsdException w:name="Table 3D effects 2" w:semiHidden="1" w:unhideWhenUsed="1"/>
+    <w:lsdException w:name="Table 3D effects 3" w:semiHidden="1" w:unhideWhenUsed="1"/>
+    <w:lsdException w:name="Table Contemporary" w:semiHidden="1" w:unhideWhenUsed="1"/>
+    <w:lsdException w:name="Table Elegant" w:semiHidden="1" w:unhideWhenUsed="1"/>
+    <w:lsdException w:name="Table Professional" w:semiHidden="1" w:unhideWhenUsed="1"/>
+    <w:lsdException w:name="Table Subtle 1" w:semiHidden="1" w:unhideWhenUsed="1"/>
+    <w:lsdException w:name="Table Subtle 2" w:semiHidden="1" w:unhideWhenUsed="1"/>
+    <w:lsdException w:name="Table Web 1" w:semiHidden="1" w:unhideWhenUsed="1"/>
+    <w:lsdException w:name="Table Web 2" w:semiHidden="1" w:unhideWhenUsed="1"/>
+    <w:lsdException w:name="Table Web 3" w:semiHidden="1" w:unhideWhenUsed="1"/>
+    <w:lsdException w:name="Balloon Text" w:semiHidden="1" w:unhideWhenUsed="1"/>
+    <w:lsdException w:name="Table Grid" w:uiPriority="39"/>
+    <w:lsdException w:name="Table Theme" w:semiHidden="1" w:unhideWhenUsed="1"/>
+    <w:lsdException w:name="Placeholder Text" w:semiHidden="1"/>
+    <w:lsdException w:name="No Spacing" w:uiPriority="1" w:qFormat="1"/>
+    <w:lsdException w:name="Light Shading" w:uiPriority="60"/>
+    <w:lsdException w:name="Light List" w:uiPriority="61"/>
+    <w:lsdException w:name="Light Grid" w:uiPriority="62"/>
+    <w:lsdException w:name="Medium Shading 1" w:uiPriority="63"/>
+    <w:lsdException w:name="Medium Shading 2" w:uiPriority="64"/>
+    <w:lsdException w:name="Medium List 1" w:uiPriority="65"/>
+    <w:lsdException w:name="Medium List 2" w:uiPriority="66"/>
+    <w:lsdException w:name="Medium Grid 1" w:uiPriority="67"/>
+    <w:lsdException w:name="Medium Grid 2" w:uiPriority="68"/>
+    <w:lsdException w:name="Medium Grid 3" w:uiPriority="69"/>
+    <w:lsdException w:name="Dark List" w:uiPriority="70"/>
+    <w:lsdException w:name="Colorful Shading" w:uiPriority="71"/>
+    <w:lsdException w:name="Colorful List" w:uiPriority="72"/>
+    <w:lsdException w:name="Colorful Grid" w:uiPriority="73"/>
+    <w:lsdException w:name="Light Shading Accent 1" w:uiPriority="60"/>
+    <w:lsdException w:name="Light List Accent 1" w:uiPriority="61"/>
+    <w:lsdException w:name="Light Grid Accent 1" w:uiPriority="62"/>
+    <w:lsdException w:name="Medium Shading 1 Accent 1" w:uiPriority="63"/>
+    <w:lsdException w:name="Medium Shading 2 Accent 1" w:uiPriority="64"/>
+    <w:lsdException w:name="Medium List 1 Accent 1" w:uiPriority="65"/>
+    <w:lsdException w:name="Revision" w:semiHidden="1"/>
+    <w:lsdException w:name="List Paragraph" w:uiPriority="34" w:qFormat="1"/>
+    <w:lsdException w:name="Quote" w:uiPriority="29" w:qFormat="1"/>
+    <w:lsdException w:name="Intense Quote" w:uiPriority="30" w:qFormat="1"/>
+    <w:lsdException w:name="Medium List 2 Accent 1" w:uiPriority="66"/>
+    <w:lsdException w:name="Medium Grid 1 Accent 1" w:uiPriority="67"/>
+    <w:lsdException w:name="Medium Grid 2 Accent 1" w:uiPriority="68"/>
+    <w:lsdException w:name="Medium Grid 3 Accent 1" w:uiPriority="69"/>
+    <w:lsdException w:name="Dark List Accent 1" w:uiPriority="70"/>
+    <w:lsdException w:name="Colorful Shading Accent 1" w:uiPriority="71"/>
+    <w:lsdException w:name="Colorful List Accent 1" w:uiPriority="72"/>
+    <w:lsdException w:name="Colorful Grid Accent 1" w:uiPriority="73"/>
+    <w:lsdException w:name="Light Shading Accent 2" w:uiPriority="60"/>
+    <w:lsdException w:name="Light List Accent 2" w:uiPriority="61"/>
+    <w:lsdException w:name="Light Grid Accent 2" w:uiPriority="62"/>
+    <w:lsdException w:name="Medium Shading 1 Accent 2" w:uiPriority="63"/>
+    <w:lsdException w:name="Medium Shading 2 Accent 2" w:uiPriority="64"/>
+    <w:lsdException w:name="Medium List 1 Accent 2" w:uiPriority="65"/>
+    <w:lsdException w:name="Medium List 2 Accent 2" w:uiPriority="66"/>
+    <w:lsdException w:name="Medium Grid 1 Accent 2" w:uiPriority="67"/>
+    <w:lsdException w:name="Medium Grid 2 Accent 2" w:uiPriority="68"/>
+    <w:lsdException w:name="Medium Grid 3 Accent 2" w:uiPriority="69"/>
+    <w:lsdException w:name="Dark List Accent 2" w:uiPriority="70"/>
+    <w:lsdException w:name="Colorful Shading Accent 2" w:uiPriority="71"/>
+    <w:lsdException w:name="Colorful List Accent 2" w:uiPriority="72"/>
+    <w:lsdException w:name="Colorful Grid Accent 2" w:uiPriority="73"/>
+    <w:lsdException w:name="Light Shading Accent 3" w:uiPriority="60"/>
+    <w:lsdException w:name="Light List Accent 3" w:uiPriority="61"/>
+    <w:lsdException w:name="Light Grid Accent 3" w:uiPriority="62"/>
+    <w:lsdException w:name="Medium Shading 1 Accent 3" w:uiPriority="63"/>
+    <w:lsdException w:name="Medium Shading 2 Accent 3" w:uiPriority="64"/>
+    <w:lsdException w:name="Medium List 1 Accent 3" w:uiPriority="65"/>
+    <w:lsdException w:name="Medium List 2 Accent 3" w:uiPriority="66"/>
+    <w:lsdException w:name="Medium Grid 1 Accent 3" w:uiPriority="67"/>
+    <w:lsdException w:name="Medium Grid 2 Accent 3" w:uiPriority="68"/>
+    <w:lsdException w:name="Medium Grid 3 Accent 3" w:uiPriority="69"/>
+    <w:lsdException w:name="Dark List Accent 3" w:uiPriority="70"/>
+    <w:lsdException w:name="Colorful Shading Accent 3" w:uiPriority="71"/>
+    <w:lsdException w:name="Colorful List Accent 3" w:uiPriority="72"/>
+    <w:lsdException w:name="Colorful Grid Accent 3" w:uiPriority="73"/>
+    <w:lsdException w:name="Light Shading Accent 4" w:uiPriority="60"/>
+    <w:lsdException w:name="Light List Accent 4" w:uiPriority="61"/>
+    <w:lsdException w:name="Light Grid Accent 4" w:uiPriority="62"/>
+    <w:lsdException w:name="Medium Shading 1 Accent 4" w:uiPriority="63"/>
+    <w:lsdException w:name="Medium Shading 2 Accent 4" w:uiPriority="64"/>
+    <w:lsdException w:name="Medium List 1 Accent 4" w:uiPriority="65"/>
+    <w:lsdException w:name="Medium List 2 Accent 4" w:uiPriority="66"/>
+    <w:lsdException w:name="Medium Grid 1 Accent 4" w:uiPriority="67"/>
+    <w:lsdException w:name="Medium Grid 2 Accent 4" w:uiPriority="68"/>
+    <w:lsdException w:name="Medium Grid 3 Accent 4" w:uiPriority="69"/>
+    <w:lsdException w:name="Dark List Accent 4" w:uiPriority="70"/>
+    <w:lsdException w:name="Colorful Shading Accent 4" w:uiPriority="71"/>
+    <w:lsdException w:name="Colorful List Accent 4" w:uiPriority="72"/>
+    <w:lsdException w:name="Colorful Grid Accent 4" w:uiPriority="73"/>
+    <w:lsdException w:name="Light Shading Accent 5" w:uiPriority="60"/>
+    <w:lsdException w:name="Light List Accent 5" w:uiPriority="61"/>
+    <w:lsdException w:name="Light Grid Accent 5" w:uiPriority="62"/>
+    <w:lsdException w:name="Medium Shading 1 Accent 5" w:uiPriority="63"/>
+    <w:lsdException w:name="Medium Shading 2 Accent 5" w:uiPriority="64"/>
+    <w:lsdException w:name="Medium List 1 Accent 5" w:uiPriority="65"/>
+    <w:lsdException w:name="Medium List 2 Accent 5" w:uiPriority="66"/>
+    <w:lsdException w:name="Medium Grid 1 Accent 5" w:uiPriority="67"/>
+    <w:lsdException w:name="Medium Grid 2 Accent 5" w:uiPriority="68"/>
+    <w:lsdException w:name="Medium Grid 3 Accent 5" w:uiPriority="69"/>
+    <w:lsdException w:name="Dark List Accent 5" w:uiPriority="70"/>
+    <w:lsdException w:name="Colorful Shading Accent 5" w:uiPriority="71"/>
+    <w:lsdException w:name="Colorful List Accent 5" w:uiPriority="72"/>
+    <w:lsdException w:name="Colorful Grid Accent 5" w:uiPriority="73"/>
+    <w:lsdException w:name="Light Shading Accent 6" w:uiPriority="60"/>
+    <w:lsdException w:name="Light List Accent 6" w:uiPriority="61"/>
+    <w:lsdException w:name="Light Grid Accent 6" w:uiPriority="62"/>
+    <w:lsdException w:name="Medium Shading 1 Accent 6" w:uiPriority="63"/>
+    <w:lsdException w:name="Medium Shading 2 Accent 6" w:uiPriority="64"/>
+    <w:lsdException w:name="Medium List 1 Accent 6" w:uiPriority="65"/>
+    <w:lsdException w:name="Medium List 2 Accent 6" w:uiPriority="66"/>
+    <w:lsdException w:name="Medium Grid 1 Accent 6" w:uiPriority="67"/>
+    <w:lsdException w:name="Medium Grid 2 Accent 6" w:uiPriority="68"/>
+    <w:lsdException w:name="Medium Grid 3 Accent 6" w:uiPriority="69"/>
+    <w:lsdException w:name="Dark List Accent 6" w:uiPriority="70"/>
+    <w:lsdException w:name="Colorful Shading Accent 6" w:uiPriority="71"/>
+    <w:lsdException w:name="Colorful List Accent 6" w:uiPriority="72"/>
+    <w:lsdException w:name="Colorful Grid Accent 6" w:uiPriority="73"/>
+    <w:lsdException w:name="Subtle Emphasis" w:uiPriority="19" w:qFormat="1"/>
+    <w:lsdException w:name="Intense Emphasis" w:uiPriority="21" w:qFormat="1"/>
+    <w:lsdException w:name="Subtle Reference" w:uiPriority="31" w:qFormat="1"/>
+    <w:lsdException w:name="Intense Reference" w:uiPriority="32" w:qFormat="1"/>
+    <w:lsdException w:name="Book Title" w:uiPriority="33" w:qFormat="1"/>
+    <w:lsdException w:name="Bibliography" w:semiHidden="1" w:uiPriority="37" w:unhideWhenUsed="1"/>
+    <w:lsdException w:name="TOC Heading" w:semiHidden="1" w:uiPriority="39" w:unhideWhenUsed="1" w:qFormat="1"/>
+    <w:lsdException w:name="Plain Table 1" w:uiPriority="41"/>
+    <w:lsdException w:name="Plain Table 2" w:uiPriority="42"/>
+    <w:lsdException w:name="Plain Table 3" w:uiPriority="43"/>
+    <w:lsdException w:name="Plain Table 4" w:uiPriority="44"/>
+    <w:lsdException w:name="Plain Table 5" w:uiPriority="45"/>
+    <w:lsdException w:name="Grid Table Light" w:uiPriority="40"/>
+    <w:lsdException w:name="Grid Table 1 Light" w:uiPriority="46"/>
+    <w:lsdException w:name="Grid Table 2" w:uiPriority="47"/>
+    <w:lsdException w:name="Grid Table 3" w:uiPriority="48"/>
+    <w:lsdException w:name="Grid Table 4" w:uiPriority="49"/>
+    <w:lsdException w:name="Grid Table 5 Dark" w:uiPriority="50"/>
+    <w:lsdException w:name="Grid Table 6 Colorful" w:uiPriority="51"/>
+    <w:lsdException w:name="Grid Table 7 Colorful" w:uiPriority="52"/>
+    <w:lsdException w:name="Grid Table 1 Light Accent 1" w:uiPriority="46"/>
+    <w:lsdException w:name="Grid Table 2 Accent 1" w:uiPriority="47"/>
+    <w:lsdException w:name="Grid Table 3 Accent 1" w:uiPriority="48"/>
+    <w:lsdException w:name="Grid Table 4 Accent 1" w:uiPriority="49"/>
+    <w:lsdException w:name="Grid Table 5 Dark Accent 1" w:uiPriority="50"/>
+    <w:lsdException w:name="Grid Table 6 Colorful Accent 1" w:uiPriority="51"/>
+    <w:lsdException w:name="Grid Table 7 Colorful Accent 1" w:uiPriority="52"/>
+    <w:lsdException w:name="Grid Table 1 Light Accent 2" w:uiPriority="46"/>
+    <w:lsdException w:name="Grid Table 2 Accent 2" w:uiPriority="47"/>
+    <w:lsdException w:name="Grid Table 3 Accent 2" w:uiPriority="48"/>
+    <w:lsdException w:name="Grid Table 4 Accent 2" w:uiPriority="49"/>
+    <w:lsdException w:name="Grid Table 5 Dark Accent 2" w:uiPriority="50"/>
+    <w:lsdException w:name="Grid Table 6 Colorful Accent 2" w:uiPriority="51"/>
+    <w:lsdException w:name="Grid Table 7 Colorful Accent 2" w:uiPriority="52"/>
+    <w:lsdException w:name="Grid Table 1 Light Accent 3" w:uiPriority="46"/>
+    <w:lsdException w:name="Grid Table 2 Accent 3" w:uiPriority="47"/>
+    <w:lsdException w:name="Grid Table 3 Accent 3" w:uiPriority="48"/>
+    <w:lsdException w:name="Grid Table 4 Accent 3" w:uiPriority="49"/>
+    <w:lsdException w:name="Grid Table 5 Dark Accent 3" w:uiPriority="50"/>
+    <w:lsdException w:name="Grid Table 6 Colorful Accent 3" w:uiPriority="51"/>
+    <w:lsdException w:name="Grid Table 7 Colorful Accent 3" w:uiPriority="52"/>
+    <w:lsdException w:name="Grid Table 1 Light Accent 4" w:uiPriority="46"/>
+    <w:lsdException w:name="Grid Table 2 Accent 4" w:uiPriority="47"/>
+    <w:lsdException w:name="Grid Table 3 Accent 4" w:uiPriority="48"/>
+    <w:lsdException w:name="Grid Table 4 Accent 4" w:uiPriority="49"/>
+    <w:lsdException w:name="Grid Table 5 Dark Accent 4" w:uiPriority="50"/>
+    <w:lsdException w:name="Grid Table 6 Colorful Accent 4" w:uiPriority="51"/>
+    <w:lsdException w:name="Grid Table 7 Colorful Accent 4" w:uiPriority="52"/>
+    <w:lsdException w:name="Grid Table 1 Light Accent 5" w:uiPriority="46"/>
+    <w:lsdException w:name="Grid Table 2 Accent 5" w:uiPriority="47"/>
+    <w:lsdException w:name="Grid Table 3 Accent 5" w:uiPriority="48"/>
+    <w:lsdException w:name="Grid Table 4 Accent 5" w:uiPriority="49"/>
+    <w:lsdException w:name="Grid Table 5 Dark Accent 5" w:uiPriority="50"/>
+    <w:lsdException w:name="Grid Table 6 Colorful Accent 5" w:uiPriority="51"/>
+    <w:lsdException w:name="Grid Table 7 Colorful Accent 5" w:uiPriority="52"/>
+    <w:lsdException w:name="Grid Table 1 Light Accent 6" w:uiPriority="46"/>
+    <w:lsdException w:name="Grid Table 2 Accent 6" w:uiPriority="47"/>
+    <w:lsdException w:name="Grid Table 3 Accent 6" w:uiPriority="48"/>
+    <w:lsdException w:name="Grid Table 4 Accent 6" w:uiPriority="49"/>
+    <w:lsdException w:name="Grid Table 5 Dark Accent 6" w:uiPriority="50"/>
+    <w:lsdException w:name="Grid Table 6 Colorful Accent 6" w:uiPriority="51"/>
+    <w:lsdException w:name="Grid Table 7 Colorful Accent 6" w:uiPriority="52"/>
+    <w:lsdException w:name="List Table 1 Light" w:uiPriority="46"/>
+    <w:lsdException w:name="List Table 2" w:uiPriority="47"/>
+    <w:lsdException w:name="List Table 3" w:uiPriority="48"/>
+    <w:lsdException w:name="List Table 4" w:uiPriority="49"/>
+    <w:lsdException w:name="List Table 5 Dark" w:uiPriority="50"/>
+    <w:lsdException w:name="List Table 6 Colorful" w:uiPriority="51"/>
+    <w:lsdException w:name="List Table 7 Colorful" w:uiPriority="52"/>
+    <w:lsdException w:name="List Table 1 Light Accent 1" w:uiPriority="46"/>
+    <w:lsdException w:name="List Table 2 Accent 1" w:uiPriority="47"/>
+    <w:lsdException w:name="List Table 3 Accent 1" w:uiPriority="48"/>
+    <w:lsdException w:name="List Table 4 Accent 1" w:uiPriority="49"/>
+    <w:lsdException w:name="List Table 5 Dark Accent 1" w:uiPriority="50"/>
+    <w:lsdException w:name="List Table 6 Colorful Accent 1" w:uiPriority="51"/>
+    <w:lsdException w:name="List Table 7 Colorful Accent 1" w:uiPriority="52"/>
+    <w:lsdException w:name="List Table 1 Light Accent 2" w:uiPriority="46"/>
+    <w:lsdException w:name="List Table 2 Accent 2" w:uiPriority="47"/>
+    <w:lsdException w:name="List Table 3 Accent 2" w:uiPriority="48"/>
+    <w:lsdException w:name="List Table 4 Accent 2" w:uiPriority="49"/>
+    <w:lsdException w:name="List Table 5 Dark Accent 2" w:uiPriority="50"/>
+    <w:lsdException w:name="List Table 6 Colorful Accent 2" w:uiPriority="51"/>
+    <w:lsdException w:name="List Table 7 Colorful Accent 2" w:uiPriority="52"/>
+    <w:lsdException w:name="List Table 1 Light Accent 3" w:uiPriority="46"/>
+    <w:lsdException w:name="List Table 2 Accent 3" w:uiPriority="47"/>
+    <w:lsdException w:name="List Table 3 Accent 3" w:uiPriority="48"/>
+    <w:lsdException w:name="List Table 4 Accent 3" w:uiPriority="49"/>
+    <w:lsdException w:name="List Table 5 Dark Accent 3" w:uiPriority="50"/>
+    <w:lsdException w:name="List Table 6 Colorful Accent 3" w:uiPriority="51"/>
+    <w:lsdException w:name="List Table 7 Colorful Accent 3" w:uiPriority="52"/>
+    <w:lsdException w:name="List Table 1 Light Accent 4" w:uiPriority="46"/>
+    <w:lsdException w:name="List Table 2 Accent 4" w:uiPriority="47"/>
+    <w:lsdException w:name="List Table 3 Accent 4" w:uiPriority="48"/>
+    <w:lsdException w:name="List Table 4 Accent 4" w:uiPriority="49"/>
+    <w:lsdException w:name="List Table 5 Dark Accent 4" w:uiPriority="50"/>
+    <w:lsdException w:name="List Table 6 Colorful Accent 4" w:uiPriority="51"/>
+    <w:lsdException w:name="List Table 7 Colorful Accent 4" w:uiPriority="52"/>
+    <w:lsdException w:name="List Table 1 Light Accent 5" w:uiPriority="46"/>
+    <w:lsdException w:name="List Table 2 Accent 5" w:uiPriority="47"/>
+    <w:lsdException w:name="List Table 3 Accent 5" w:uiPriority="48"/>
+    <w:lsdException w:name="List Table 4 Accent 5" w:uiPriority="49"/>
+    <w:lsdException w:name="List Table 5 Dark Accent 5" w:uiPriority="50"/>
+    <w:lsdException w:name="List Table 6 Colorful Accent 5" w:uiPriority="51"/>
+    <w:lsdException w:name="List Table 7 Colorful Accent 5" w:uiPriority="52"/>
+    <w:lsdException w:name="List Table 1 Light Accent 6" w:uiPriority="46"/>
+    <w:lsdException w:name="List Table 2 Accent 6" w:uiPriority="47"/>
+    <w:lsdException w:name="List Table 3 Accent 6" w:uiPriority="48"/>
+    <w:lsdException w:name="List Table 4 Accent 6" w:uiPriority="49"/>
+    <w:lsdException w:name="List Table 5 Dark Accent 6" w:uiPriority="50"/>
+    <w:lsdException w:name="List Table 6 Colorful Accent 6" w:uiPriority="51"/>
+    <w:lsdException w:name="List Table 7 Colorful Accent 6" w:uiPriority="52"/>
+    <w:lsdException w:name="Mention" w:semiHidden="1" w:unhideWhenUsed="1"/>
+    <w:lsdException w:name="Smart Hyperlink" w:semiHidden="1" w:unhideWhenUsed="1"/>
+    <w:lsdException w:name="Hashtag" w:semiHidden="1" w:unhideWhenUsed="1"/>
+    <w:lsdException w:name="Unresolved Mention" w:semiHidden="1" w:unhideWhenUsed="1"/>
+    <w:lsdException w:name="Smart Link" w:semiHidden="1" w:unhideWhenUsed="1"/>
+  </w:latentStyles>
+  <w:style w:type="paragraph" w:default="1" w:styleId="Normal">
+    <w:name w:val="Normal"/>
     <w:qFormat/>
-    <w:rPr>
-      <w:sz w:val="56"/>
-      <w:szCs w:val="56"/>
-    </w:rPr>
   </w:style>
   <w:style w:type="paragraph" w:styleId="Heading1">
-    <w:name w:val="Heading 1"/>
-    <w:basedOn w:val="Normal"/>
-    <w:next w:val="Normal"/>
+    <w:name w:val="heading 1"/>
+    <w:uiPriority w:val="9"/>
     <w:qFormat/>
+    <w:pPr>
+      <w:spacing w:before="120" w:after="60"/>
+      <w:outlineLvl w:val="0"/>
+    </w:pPr>
     <w:rPr>
-      <w:color w:val="2E74B5"/>
-      <w:sz w:val="32"/>
-      <w:szCs w:val="32"/>
+      <w:b/>
+      <w:bCs/>
+      <w:color w:val="DA291C"/>
+      <w:sz w:val="40"/>
+      <w:szCs w:val="40"/>
     </w:rPr>
   </w:style>
   <w:style w:type="paragraph" w:styleId="Heading2">
-    <w:name w:val="Heading 2"/>
-    <w:basedOn w:val="Normal"/>
-    <w:next w:val="Normal"/>
+    <w:name w:val="heading 2"/>
+    <w:uiPriority w:val="9"/>
+    <w:unhideWhenUsed/>
     <w:qFormat/>
+    <w:pPr>
+      <w:keepNext/>
+      <w:pBdr>
+        <w:left w:val="single" w:sz="24" w:space="6" w:color="DA291C"/>
+      </w:pBdr>
+      <w:spacing w:before="260" w:after="100"/>
+      <w:outlineLvl w:val="1"/>
+    </w:pPr>
     <w:rPr>
-      <w:color w:val="2E74B5"/>
+      <w:b/>
+      <w:bCs/>
+      <w:color w:val="27251F"/>
       <w:sz w:val="26"/>
       <w:szCs w:val="26"/>
     </w:rPr>
   </w:style>
   <w:style w:type="paragraph" w:styleId="Heading3">
-    <w:name w:val="Heading 3"/>
-    <w:basedOn w:val="Normal"/>
-    <w:next w:val="Normal"/>
+    <w:name w:val="heading 3"/>
+    <w:uiPriority w:val="9"/>
+    <w:semiHidden/>
+    <w:unhideWhenUsed/>
     <w:qFormat/>
+    <w:pPr>
+      <w:outlineLvl w:val="2"/>
+    </w:pPr>
     <w:rPr>
       <w:color w:val="1F4D78"/>
       <w:sz w:val="24"/>
@@ -1814,10 +2360,14 @@
     </w:rPr>
   </w:style>
   <w:style w:type="paragraph" w:styleId="Heading4">
-    <w:name w:val="Heading 4"/>
-    <w:basedOn w:val="Normal"/>
-    <w:next w:val="Normal"/>
+    <w:name w:val="heading 4"/>
+    <w:uiPriority w:val="9"/>
+    <w:semiHidden/>
+    <w:unhideWhenUsed/>
     <w:qFormat/>
+    <w:pPr>
+      <w:outlineLvl w:val="3"/>
+    </w:pPr>
     <w:rPr>
       <w:i/>
       <w:iCs/>
@@ -1825,27 +2375,69 @@
     </w:rPr>
   </w:style>
   <w:style w:type="paragraph" w:styleId="Heading5">
-    <w:name w:val="Heading 5"/>
-    <w:basedOn w:val="Normal"/>
-    <w:next w:val="Normal"/>
+    <w:name w:val="heading 5"/>
+    <w:uiPriority w:val="9"/>
+    <w:semiHidden/>
+    <w:unhideWhenUsed/>
     <w:qFormat/>
+    <w:pPr>
+      <w:outlineLvl w:val="4"/>
+    </w:pPr>
     <w:rPr>
       <w:color w:val="2E74B5"/>
     </w:rPr>
   </w:style>
   <w:style w:type="paragraph" w:styleId="Heading6">
-    <w:name w:val="Heading 6"/>
-    <w:basedOn w:val="Normal"/>
-    <w:next w:val="Normal"/>
+    <w:name w:val="heading 6"/>
+    <w:uiPriority w:val="9"/>
+    <w:semiHidden/>
+    <w:unhideWhenUsed/>
     <w:qFormat/>
+    <w:pPr>
+      <w:outlineLvl w:val="5"/>
+    </w:pPr>
     <w:rPr>
       <w:color w:val="1F4D78"/>
     </w:rPr>
   </w:style>
-  <w:style w:type="paragraph" w:styleId="Strong">
-    <w:name w:val="Strong"/>
-    <w:basedOn w:val="Normal"/>
-    <w:next w:val="Normal"/>
+  <w:style w:type="character" w:default="1" w:styleId="DefaultParagraphFont">
+    <w:name w:val="Default Paragraph Font"/>
+    <w:uiPriority w:val="1"/>
+    <w:semiHidden/>
+    <w:unhideWhenUsed/>
+  </w:style>
+  <w:style w:type="table" w:default="1" w:styleId="TableNormal">
+    <w:name w:val="Normal Table"/>
+    <w:uiPriority w:val="99"/>
+    <w:semiHidden/>
+    <w:unhideWhenUsed/>
+    <w:tblPr>
+      <w:tblInd w:w="0" w:type="dxa"/>
+      <w:tblCellMar>
+        <w:top w:w="0" w:type="dxa"/>
+        <w:left w:w="108" w:type="dxa"/>
+        <w:bottom w:w="0" w:type="dxa"/>
+        <w:right w:w="108" w:type="dxa"/>
+      </w:tblCellMar>
+    </w:tblPr>
+  </w:style>
+  <w:style w:type="numbering" w:default="1" w:styleId="NoList">
+    <w:name w:val="No List"/>
+    <w:uiPriority w:val="99"/>
+    <w:semiHidden/>
+    <w:unhideWhenUsed/>
+  </w:style>
+  <w:style w:type="paragraph" w:styleId="Title">
+    <w:name w:val="Title"/>
+    <w:uiPriority w:val="10"/>
+    <w:qFormat/>
+    <w:rPr>
+      <w:sz w:val="56"/>
+      <w:szCs w:val="56"/>
+    </w:rPr>
+  </w:style>
+  <w:style w:type="paragraph" w:customStyle="1" w:styleId="Strong1">
+    <w:name w:val="Strong1"/>
     <w:qFormat/>
     <w:rPr>
       <w:b/>
@@ -1854,12 +2446,10 @@
   </w:style>
   <w:style w:type="paragraph" w:styleId="ListParagraph">
     <w:name w:val="List Paragraph"/>
-    <w:basedOn w:val="Normal"/>
     <w:qFormat/>
   </w:style>
   <w:style w:type="character" w:styleId="Hyperlink">
     <w:name w:val="Hyperlink"/>
-    <w:basedOn w:val="DefaultParagraphFont"/>
     <w:uiPriority w:val="99"/>
     <w:unhideWhenUsed/>
     <w:rPr>
@@ -1869,7 +2459,6 @@
   </w:style>
   <w:style w:type="character" w:styleId="FootnoteReference">
     <w:name w:val="footnote reference"/>
-    <w:basedOn w:val="DefaultParagraphFont"/>
     <w:uiPriority w:val="99"/>
     <w:semiHidden/>
     <w:unhideWhenUsed/>
@@ -1879,22 +2468,17 @@
   </w:style>
   <w:style w:type="paragraph" w:styleId="FootnoteText">
     <w:name w:val="footnote text"/>
-    <w:basedOn w:val="Normal"/>
     <w:link w:val="FootnoteTextChar"/>
     <w:uiPriority w:val="99"/>
     <w:semiHidden/>
     <w:unhideWhenUsed/>
-    <w:pPr>
-      <w:spacing w:after="0" w:line="240" w:lineRule="auto"/>
-    </w:pPr>
     <w:rPr>
       <w:sz w:val="20"/>
       <w:szCs w:val="20"/>
     </w:rPr>
   </w:style>
-  <w:style w:type="character" w:styleId="FootnoteTextChar">
+  <w:style w:type="character" w:customStyle="1" w:styleId="FootnoteTextChar">
     <w:name w:val="Footnote Text Char"/>
-    <w:basedOn w:val="DefaultParagraphFont"/>
     <w:link w:val="FootnoteText"/>
     <w:uiPriority w:val="99"/>
     <w:semiHidden/>
@@ -1906,7 +2490,6 @@
   </w:style>
   <w:style w:type="character" w:styleId="EndnoteReference">
     <w:name w:val="endnote reference"/>
-    <w:basedOn w:val="DefaultParagraphFont"/>
     <w:uiPriority w:val="99"/>
     <w:semiHidden/>
     <w:unhideWhenUsed/>
@@ -1916,22 +2499,17 @@
   </w:style>
   <w:style w:type="paragraph" w:styleId="EndnoteText">
     <w:name w:val="endnote text"/>
-    <w:basedOn w:val="Normal"/>
     <w:link w:val="EndnoteTextChar"/>
     <w:uiPriority w:val="99"/>
     <w:semiHidden/>
     <w:unhideWhenUsed/>
-    <w:pPr>
-      <w:spacing w:after="0" w:line="240" w:lineRule="auto"/>
-    </w:pPr>
     <w:rPr>
       <w:sz w:val="20"/>
       <w:szCs w:val="20"/>
     </w:rPr>
   </w:style>
-  <w:style w:type="character" w:styleId="EndnoteTextChar">
+  <w:style w:type="character" w:customStyle="1" w:styleId="EndnoteTextChar">
     <w:name w:val="Endnote Text Char"/>
-    <w:basedOn w:val="DefaultParagraphFont"/>
     <w:link w:val="EndnoteText"/>
     <w:uiPriority w:val="99"/>
     <w:semiHidden/>
@@ -1941,45 +2519,320 @@
       <w:szCs w:val="20"/>
     </w:rPr>
   </w:style>
-  <w:style w:type="paragraph" w:styleId="Heading1">
-    <w:name w:val="Heading 1"/>
-    <w:basedOn w:val="Normal"/>
-    <w:next w:val="Normal"/>
-    <w:qFormat/>
-    <w:pPr>
-      <w:spacing w:after="60" w:before="120"/>
-      <w:outlineLvl w:val="0"/>
-    </w:pPr>
-    <w:rPr>
-      <w:rFonts w:ascii="Arial" w:cs="Arial" w:eastAsia="Arial" w:hAnsi="Arial"/>
-      <w:b/>
-      <w:bCs/>
-      <w:color w:val="DA291C"/>
-      <w:sz w:val="40"/>
-      <w:szCs w:val="40"/>
-    </w:rPr>
-  </w:style>
-  <w:style w:type="paragraph" w:styleId="Heading2">
-    <w:name w:val="Heading 2"/>
-    <w:basedOn w:val="Normal"/>
-    <w:next w:val="Normal"/>
-    <w:qFormat/>
-    <w:pPr>
-      <w:keepNext/>
-      <w:pBdr>
-        <w:left w:val="single" w:color="DA291C" w:sz="24" w:space="6"/>
-      </w:pBdr>
-      <w:spacing w:after="100" w:before="260"/>
-      <w:outlineLvl w:val="1"/>
-    </w:pPr>
-    <w:rPr>
-      <w:rFonts w:ascii="Arial" w:cs="Arial" w:eastAsia="Arial" w:hAnsi="Arial"/>
-      <w:b/>
-      <w:bCs/>
-      <w:color w:val="27251F"/>
-      <w:sz w:val="26"/>
-      <w:szCs w:val="26"/>
-    </w:rPr>
-  </w:style>
 </w:styles>
+</file>
+
+<file path=word/theme/theme1.xml><?xml version="1.0" encoding="utf-8"?>
+<a:theme xmlns:a="http://schemas.openxmlformats.org/drawingml/2006/main" name="Office Theme">
+  <a:themeElements>
+    <a:clrScheme name="Office">
+      <a:dk1>
+        <a:sysClr val="windowText" lastClr="000000"/>
+      </a:dk1>
+      <a:lt1>
+        <a:sysClr val="window" lastClr="FFFFFF"/>
+      </a:lt1>
+      <a:dk2>
+        <a:srgbClr val="0E2841"/>
+      </a:dk2>
+      <a:lt2>
+        <a:srgbClr val="E8E8E8"/>
+      </a:lt2>
+      <a:accent1>
+        <a:srgbClr val="156082"/>
+      </a:accent1>
+      <a:accent2>
+        <a:srgbClr val="E97132"/>
+      </a:accent2>
+      <a:accent3>
+        <a:srgbClr val="196B24"/>
+      </a:accent3>
+      <a:accent4>
+        <a:srgbClr val="0F9ED5"/>
+      </a:accent4>
+      <a:accent5>
+        <a:srgbClr val="A02B93"/>
+      </a:accent5>
+      <a:accent6>
+        <a:srgbClr val="4EA72E"/>
+      </a:accent6>
+      <a:hlink>
+        <a:srgbClr val="467886"/>
+      </a:hlink>
+      <a:folHlink>
+        <a:srgbClr val="96607D"/>
+      </a:folHlink>
+    </a:clrScheme>
+    <a:fontScheme name="Office">
+      <a:majorFont>
+        <a:latin typeface="Aptos Display" panose="02110004020202020204"/>
+        <a:ea typeface=""/>
+        <a:cs typeface=""/>
+        <a:font script="Jpan" typeface="游ゴシック Light"/>
+        <a:font script="Hang" typeface="맑은 고딕"/>
+        <a:font script="Hans" typeface="等线 Light"/>
+        <a:font script="Hant" typeface="新細明體"/>
+        <a:font script="Arab" typeface="Times New Roman"/>
+        <a:font script="Hebr" typeface="Times New Roman"/>
+        <a:font script="Thai" typeface="Angsana New"/>
+        <a:font script="Ethi" typeface="Nyala"/>
+        <a:font script="Beng" typeface="Vrinda"/>
+        <a:font script="Gujr" typeface="Shruti"/>
+        <a:font script="Khmr" typeface="MoolBoran"/>
+        <a:font script="Knda" typeface="Tunga"/>
+        <a:font script="Guru" typeface="Raavi"/>
+        <a:font script="Cans" typeface="Euphemia"/>
+        <a:font script="Cher" typeface="Plantagenet Cherokee"/>
+        <a:font script="Yiii" typeface="Microsoft Yi Baiti"/>
+        <a:font script="Tibt" typeface="Microsoft Himalaya"/>
+        <a:font script="Thaa" typeface="MV Boli"/>
+        <a:font script="Deva" typeface="Mangal"/>
+        <a:font script="Telu" typeface="Gautami"/>
+        <a:font script="Taml" typeface="Latha"/>
+        <a:font script="Syrc" typeface="Estrangelo Edessa"/>
+        <a:font script="Orya" typeface="Kalinga"/>
+        <a:font script="Mlym" typeface="Kartika"/>
+        <a:font script="Laoo" typeface="DokChampa"/>
+        <a:font script="Sinh" typeface="Iskoola Pota"/>
+        <a:font script="Mong" typeface="Mongolian Baiti"/>
+        <a:font script="Viet" typeface="Times New Roman"/>
+        <a:font script="Uigh" typeface="Microsoft Uighur"/>
+        <a:font script="Geor" typeface="Sylfaen"/>
+        <a:font script="Armn" typeface="Arial"/>
+        <a:font script="Bugi" typeface="Leelawadee UI"/>
+        <a:font script="Bopo" typeface="Microsoft JhengHei"/>
+        <a:font script="Java" typeface="Javanese Text"/>
+        <a:font script="Lisu" typeface="Segoe UI"/>
+        <a:font script="Mymr" typeface="Myanmar Text"/>
+        <a:font script="Nkoo" typeface="Ebrima"/>
+        <a:font script="Olck" typeface="Nirmala UI"/>
+        <a:font script="Osma" typeface="Ebrima"/>
+        <a:font script="Phag" typeface="Phagspa"/>
+        <a:font script="Syrn" typeface="Estrangelo Edessa"/>
+        <a:font script="Syrj" typeface="Estrangelo Edessa"/>
+        <a:font script="Syre" typeface="Estrangelo Edessa"/>
+        <a:font script="Sora" typeface="Nirmala UI"/>
+        <a:font script="Tale" typeface="Microsoft Tai Le"/>
+        <a:font script="Talu" typeface="Microsoft New Tai Lue"/>
+        <a:font script="Tfng" typeface="Ebrima"/>
+      </a:majorFont>
+      <a:minorFont>
+        <a:latin typeface="Aptos" panose="02110004020202020204"/>
+        <a:ea typeface=""/>
+        <a:cs typeface=""/>
+        <a:font script="Jpan" typeface="游明朝"/>
+        <a:font script="Hang" typeface="맑은 고딕"/>
+        <a:font script="Hans" typeface="等线"/>
+        <a:font script="Hant" typeface="新細明體"/>
+        <a:font script="Arab" typeface="Arial"/>
+        <a:font script="Hebr" typeface="Arial"/>
+        <a:font script="Thai" typeface="Cordia New"/>
+        <a:font script="Ethi" typeface="Nyala"/>
+        <a:font script="Beng" typeface="Vrinda"/>
+        <a:font script="Gujr" typeface="Shruti"/>
+        <a:font script="Khmr" typeface="DaunPenh"/>
+        <a:font script="Knda" typeface="Tunga"/>
+        <a:font script="Guru" typeface="Raavi"/>
+        <a:font script="Cans" typeface="Euphemia"/>
+        <a:font script="Cher" typeface="Plantagenet Cherokee"/>
+        <a:font script="Yiii" typeface="Microsoft Yi Baiti"/>
+        <a:font script="Tibt" typeface="Microsoft Himalaya"/>
+        <a:font script="Thaa" typeface="MV Boli"/>
+        <a:font script="Deva" typeface="Mangal"/>
+        <a:font script="Telu" typeface="Gautami"/>
+        <a:font script="Taml" typeface="Latha"/>
+        <a:font script="Syrc" typeface="Estrangelo Edessa"/>
+        <a:font script="Orya" typeface="Kalinga"/>
+        <a:font script="Mlym" typeface="Kartika"/>
+        <a:font script="Laoo" typeface="DokChampa"/>
+        <a:font script="Sinh" typeface="Iskoola Pota"/>
+        <a:font script="Mong" typeface="Mongolian Baiti"/>
+        <a:font script="Viet" typeface="Arial"/>
+        <a:font script="Uigh" typeface="Microsoft Uighur"/>
+        <a:font script="Geor" typeface="Sylfaen"/>
+        <a:font script="Armn" typeface="Arial"/>
+        <a:font script="Bugi" typeface="Leelawadee UI"/>
+        <a:font script="Bopo" typeface="Microsoft JhengHei"/>
+        <a:font script="Java" typeface="Javanese Text"/>
+        <a:font script="Lisu" typeface="Segoe UI"/>
+        <a:font script="Mymr" typeface="Myanmar Text"/>
+        <a:font script="Nkoo" typeface="Ebrima"/>
+        <a:font script="Olck" typeface="Nirmala UI"/>
+        <a:font script="Osma" typeface="Ebrima"/>
+        <a:font script="Phag" typeface="Phagspa"/>
+        <a:font script="Syrn" typeface="Estrangelo Edessa"/>
+        <a:font script="Syrj" typeface="Estrangelo Edessa"/>
+        <a:font script="Syre" typeface="Estrangelo Edessa"/>
+        <a:font script="Sora" typeface="Nirmala UI"/>
+        <a:font script="Tale" typeface="Microsoft Tai Le"/>
+        <a:font script="Talu" typeface="Microsoft New Tai Lue"/>
+        <a:font script="Tfng" typeface="Ebrima"/>
+      </a:minorFont>
+    </a:fontScheme>
+    <a:fmtScheme name="Office">
+      <a:fillStyleLst>
+        <a:solidFill>
+          <a:schemeClr val="phClr"/>
+        </a:solidFill>
+        <a:gradFill rotWithShape="1">
+          <a:gsLst>
+            <a:gs pos="0">
+              <a:schemeClr val="phClr">
+                <a:lumMod val="110000"/>
+                <a:satMod val="105000"/>
+                <a:tint val="67000"/>
+              </a:schemeClr>
+            </a:gs>
+            <a:gs pos="50000">
+              <a:schemeClr val="phClr">
+                <a:lumMod val="105000"/>
+                <a:satMod val="103000"/>
+                <a:tint val="73000"/>
+              </a:schemeClr>
+            </a:gs>
+            <a:gs pos="100000">
+              <a:schemeClr val="phClr">
+                <a:lumMod val="105000"/>
+                <a:satMod val="109000"/>
+                <a:tint val="81000"/>
+              </a:schemeClr>
+            </a:gs>
+          </a:gsLst>
+          <a:lin ang="5400000" scaled="0"/>
+        </a:gradFill>
+        <a:gradFill rotWithShape="1">
+          <a:gsLst>
+            <a:gs pos="0">
+              <a:schemeClr val="phClr">
+                <a:satMod val="103000"/>
+                <a:lumMod val="102000"/>
+                <a:tint val="94000"/>
+              </a:schemeClr>
+            </a:gs>
+            <a:gs pos="50000">
+              <a:schemeClr val="phClr">
+                <a:satMod val="110000"/>
+                <a:lumMod val="100000"/>
+                <a:shade val="100000"/>
+              </a:schemeClr>
+            </a:gs>
+            <a:gs pos="100000">
+              <a:schemeClr val="phClr">
+                <a:lumMod val="99000"/>
+                <a:satMod val="120000"/>
+                <a:shade val="78000"/>
+              </a:schemeClr>
+            </a:gs>
+          </a:gsLst>
+          <a:lin ang="5400000" scaled="0"/>
+        </a:gradFill>
+      </a:fillStyleLst>
+      <a:lnStyleLst>
+        <a:ln w="12700" cap="flat" cmpd="sng" algn="ctr">
+          <a:solidFill>
+            <a:schemeClr val="phClr"/>
+          </a:solidFill>
+          <a:prstDash val="solid"/>
+          <a:miter lim="800000"/>
+        </a:ln>
+        <a:ln w="19050" cap="flat" cmpd="sng" algn="ctr">
+          <a:solidFill>
+            <a:schemeClr val="phClr"/>
+          </a:solidFill>
+          <a:prstDash val="solid"/>
+          <a:miter lim="800000"/>
+        </a:ln>
+        <a:ln w="25400" cap="flat" cmpd="sng" algn="ctr">
+          <a:solidFill>
+            <a:schemeClr val="phClr"/>
+          </a:solidFill>
+          <a:prstDash val="solid"/>
+          <a:miter lim="800000"/>
+        </a:ln>
+      </a:lnStyleLst>
+      <a:effectStyleLst>
+        <a:effectStyle>
+          <a:effectLst/>
+        </a:effectStyle>
+        <a:effectStyle>
+          <a:effectLst/>
+        </a:effectStyle>
+        <a:effectStyle>
+          <a:effectLst>
+            <a:outerShdw blurRad="57150" dist="19050" dir="5400000" algn="ctr" rotWithShape="0">
+              <a:srgbClr val="000000">
+                <a:alpha val="63000"/>
+              </a:srgbClr>
+            </a:outerShdw>
+          </a:effectLst>
+        </a:effectStyle>
+      </a:effectStyleLst>
+      <a:bgFillStyleLst>
+        <a:solidFill>
+          <a:schemeClr val="phClr"/>
+        </a:solidFill>
+        <a:solidFill>
+          <a:schemeClr val="phClr">
+            <a:tint val="95000"/>
+            <a:satMod val="170000"/>
+          </a:schemeClr>
+        </a:solidFill>
+        <a:gradFill rotWithShape="1">
+          <a:gsLst>
+            <a:gs pos="0">
+              <a:schemeClr val="phClr">
+                <a:tint val="93000"/>
+                <a:satMod val="150000"/>
+                <a:shade val="98000"/>
+                <a:lumMod val="102000"/>
+              </a:schemeClr>
+            </a:gs>
+            <a:gs pos="50000">
+              <a:schemeClr val="phClr">
+                <a:tint val="98000"/>
+                <a:satMod val="130000"/>
+                <a:shade val="90000"/>
+                <a:lumMod val="103000"/>
+              </a:schemeClr>
+            </a:gs>
+            <a:gs pos="100000">
+              <a:schemeClr val="phClr">
+                <a:shade val="63000"/>
+                <a:satMod val="120000"/>
+              </a:schemeClr>
+            </a:gs>
+          </a:gsLst>
+          <a:lin ang="5400000" scaled="0"/>
+        </a:gradFill>
+      </a:bgFillStyleLst>
+    </a:fmtScheme>
+  </a:themeElements>
+  <a:objectDefaults>
+    <a:lnDef>
+      <a:spPr/>
+      <a:bodyPr/>
+      <a:lstStyle/>
+      <a:style>
+        <a:lnRef idx="2">
+          <a:schemeClr val="accent1"/>
+        </a:lnRef>
+        <a:fillRef idx="0">
+          <a:schemeClr val="accent1"/>
+        </a:fillRef>
+        <a:effectRef idx="1">
+          <a:schemeClr val="accent1"/>
+        </a:effectRef>
+        <a:fontRef idx="minor">
+          <a:schemeClr val="tx1"/>
+        </a:fontRef>
+      </a:style>
+    </a:lnDef>
+  </a:objectDefaults>
+  <a:extraClrSchemeLst/>
+  <a:extLst>
+    <a:ext uri="{05A4C25C-085E-4340-85A3-A5531E510DB2}">
+      <thm15:themeFamily xmlns:thm15="http://schemas.microsoft.com/office/thememl/2012/main" name="Office Theme" id="{2E142A2C-CD16-42D6-873A-C26D2A0506FA}" vid="{1BDDFF52-6CD6-40A5-AB3C-68EB2F1E4D0A}"/>
+    </a:ext>
+  </a:extLst>
+</a:theme>
 </file>
</xml_diff>